<commit_message>
Record Step 3 seed-zero controls and replicate C1
</commit_message>
<xml_diff>
--- a/research/codex/reports/BRSET_mBRSET_Research_Record.docx
+++ b/research/codex/reports/BRSET_mBRSET_Research_Record.docx
@@ -47,7 +47,7 @@
           <w:color w:val="000000"/>
           <w:sz w:val="18"/>
         </w:rPr>
-        <w:t>Updated 12 September 2026 | Current state: Step 2 complete; Step 3 controls prepared</w:t>
+        <w:t>Updated 13 September 2026 | Current state: Step 2 complete; Step 3 controls prepared</w:t>
       </w:r>
     </w:p>
     <w:p>
@@ -4005,7 +4005,643 @@
           <w:color w:val="000000"/>
           <w:sz w:val="20"/>
         </w:rPr>
-        <w:t xml:space="preserve"> deterministic exact-quota sampler, resume equivalence tests and exposure ledger prepared. Allocated preflight: passed; current run state: seed-0 controls submitted/running; no control result claimed yet. No Step-3 test assessment has been performed.</w:t>
+        <w:t xml:space="preserve"> deterministic exact-quota sampler, resume equivalence tests and exposure ledger prepared. Allocated preflight: passed; current run state: seed-0 controls verified; review the replication screen. No Step-3 test assessment has been performed.</w:t>
+      </w:r>
+    </w:p>
+    <w:tbl>
+      <w:tblPr>
+        <w:tblStyle w:val="TableGrid"/>
+        <w:tblW w:type="auto" w:w="0"/>
+        <w:jc w:val="center"/>
+        <w:tblLook w:firstColumn="1" w:firstRow="1" w:lastColumn="0" w:lastRow="0" w:noHBand="0" w:noVBand="1" w:val="04A0"/>
+      </w:tblPr>
+      <w:tblGrid>
+        <w:gridCol w:w="2016"/>
+        <w:gridCol w:w="2016"/>
+        <w:gridCol w:w="2016"/>
+        <w:gridCol w:w="2016"/>
+        <w:gridCol w:w="2016"/>
+      </w:tblGrid>
+      <w:tr>
+        <w:tc>
+          <w:tcPr>
+            <w:tcW w:type="dxa" w:w="2016"/>
+            <w:vAlign w:val="center"/>
+            <w:shd w:fill="D9E2F3"/>
+          </w:tcPr>
+          <w:p>
+            <w:pPr>
+              <w:spacing w:before="0" w:after="0" w:line="240" w:lineRule="auto"/>
+              <w:jc w:val="left"/>
+            </w:pPr>
+            <w:r/>
+            <w:r>
+              <w:rPr>
+                <w:rFonts w:ascii="Times New Roman" w:hAnsi="Times New Roman" w:eastAsia="Times New Roman"/>
+                <w:b/>
+                <w:i w:val="0"/>
+                <w:color w:val="000000"/>
+                <w:sz w:val="17"/>
+              </w:rPr>
+              <w:t>Arm</w:t>
+            </w:r>
+          </w:p>
+        </w:tc>
+        <w:tc>
+          <w:tcPr>
+            <w:tcW w:type="dxa" w:w="2016"/>
+            <w:vAlign w:val="center"/>
+            <w:shd w:fill="D9E2F3"/>
+          </w:tcPr>
+          <w:p>
+            <w:pPr>
+              <w:spacing w:before="0" w:after="0" w:line="240" w:lineRule="auto"/>
+              <w:jc w:val="center"/>
+            </w:pPr>
+            <w:r/>
+            <w:r>
+              <w:rPr>
+                <w:rFonts w:ascii="Times New Roman" w:hAnsi="Times New Roman" w:eastAsia="Times New Roman"/>
+                <w:b/>
+                <w:i w:val="0"/>
+                <w:color w:val="000000"/>
+                <w:sz w:val="17"/>
+              </w:rPr>
+              <w:t>Validation DR F1</w:t>
+            </w:r>
+          </w:p>
+        </w:tc>
+        <w:tc>
+          <w:tcPr>
+            <w:tcW w:type="dxa" w:w="2016"/>
+            <w:vAlign w:val="center"/>
+            <w:shd w:fill="D9E2F3"/>
+          </w:tcPr>
+          <w:p>
+            <w:pPr>
+              <w:spacing w:before="0" w:after="0" w:line="240" w:lineRule="auto"/>
+              <w:jc w:val="center"/>
+            </w:pPr>
+            <w:r/>
+            <w:r>
+              <w:rPr>
+                <w:rFonts w:ascii="Times New Roman" w:hAnsi="Times New Roman" w:eastAsia="Times New Roman"/>
+                <w:b/>
+                <w:i w:val="0"/>
+                <w:color w:val="000000"/>
+                <w:sz w:val="17"/>
+              </w:rPr>
+              <w:t>DR AUROC</w:t>
+            </w:r>
+          </w:p>
+        </w:tc>
+        <w:tc>
+          <w:tcPr>
+            <w:tcW w:type="dxa" w:w="2016"/>
+            <w:vAlign w:val="center"/>
+            <w:shd w:fill="D9E2F3"/>
+          </w:tcPr>
+          <w:p>
+            <w:pPr>
+              <w:spacing w:before="0" w:after="0" w:line="240" w:lineRule="auto"/>
+              <w:jc w:val="center"/>
+            </w:pPr>
+            <w:r/>
+            <w:r>
+              <w:rPr>
+                <w:rFonts w:ascii="Times New Roman" w:hAnsi="Times New Roman" w:eastAsia="Times New Roman"/>
+                <w:b/>
+                <w:i w:val="0"/>
+                <w:color w:val="000000"/>
+                <w:sz w:val="17"/>
+              </w:rPr>
+              <w:t>ME F1</w:t>
+            </w:r>
+          </w:p>
+        </w:tc>
+        <w:tc>
+          <w:tcPr>
+            <w:tcW w:type="dxa" w:w="2016"/>
+            <w:vAlign w:val="center"/>
+            <w:shd w:fill="D9E2F3"/>
+          </w:tcPr>
+          <w:p>
+            <w:pPr>
+              <w:spacing w:before="0" w:after="0" w:line="240" w:lineRule="auto"/>
+              <w:jc w:val="center"/>
+            </w:pPr>
+            <w:r/>
+            <w:r>
+              <w:rPr>
+                <w:rFonts w:ascii="Times New Roman" w:hAnsi="Times New Roman" w:eastAsia="Times New Roman"/>
+                <w:b/>
+                <w:i w:val="0"/>
+                <w:color w:val="000000"/>
+                <w:sz w:val="17"/>
+              </w:rPr>
+              <w:t>ME AUROC</w:t>
+            </w:r>
+          </w:p>
+        </w:tc>
+      </w:tr>
+      <w:tr>
+        <w:tc>
+          <w:tcPr>
+            <w:tcW w:type="dxa" w:w="2016"/>
+            <w:vAlign w:val="center"/>
+          </w:tcPr>
+          <w:p>
+            <w:pPr>
+              <w:spacing w:before="0" w:after="0" w:line="240" w:lineRule="auto"/>
+              <w:jc w:val="left"/>
+            </w:pPr>
+            <w:r/>
+            <w:r>
+              <w:rPr>
+                <w:rFonts w:ascii="Times New Roman" w:hAnsi="Times New Roman" w:eastAsia="Times New Roman"/>
+                <w:b w:val="0"/>
+                <w:i w:val="0"/>
+                <w:color w:val="000000"/>
+                <w:sz w:val="17"/>
+              </w:rPr>
+              <w:t>B1 existing</w:t>
+            </w:r>
+          </w:p>
+        </w:tc>
+        <w:tc>
+          <w:tcPr>
+            <w:tcW w:type="dxa" w:w="2016"/>
+            <w:vAlign w:val="center"/>
+          </w:tcPr>
+          <w:p>
+            <w:pPr>
+              <w:spacing w:before="0" w:after="0" w:line="240" w:lineRule="auto"/>
+              <w:jc w:val="center"/>
+            </w:pPr>
+            <w:r/>
+            <w:r>
+              <w:rPr>
+                <w:rFonts w:ascii="Times New Roman" w:hAnsi="Times New Roman" w:eastAsia="Times New Roman"/>
+                <w:b w:val="0"/>
+                <w:i w:val="0"/>
+                <w:color w:val="000000"/>
+                <w:sz w:val="17"/>
+              </w:rPr>
+              <w:t>0.8703</w:t>
+            </w:r>
+          </w:p>
+        </w:tc>
+        <w:tc>
+          <w:tcPr>
+            <w:tcW w:type="dxa" w:w="2016"/>
+            <w:vAlign w:val="center"/>
+          </w:tcPr>
+          <w:p>
+            <w:pPr>
+              <w:spacing w:before="0" w:after="0" w:line="240" w:lineRule="auto"/>
+              <w:jc w:val="center"/>
+            </w:pPr>
+            <w:r/>
+            <w:r>
+              <w:rPr>
+                <w:rFonts w:ascii="Times New Roman" w:hAnsi="Times New Roman" w:eastAsia="Times New Roman"/>
+                <w:b w:val="0"/>
+                <w:i w:val="0"/>
+                <w:color w:val="000000"/>
+                <w:sz w:val="17"/>
+              </w:rPr>
+              <w:t>0.9563</w:t>
+            </w:r>
+          </w:p>
+        </w:tc>
+        <w:tc>
+          <w:tcPr>
+            <w:tcW w:type="dxa" w:w="2016"/>
+            <w:vAlign w:val="center"/>
+          </w:tcPr>
+          <w:p>
+            <w:pPr>
+              <w:spacing w:before="0" w:after="0" w:line="240" w:lineRule="auto"/>
+              <w:jc w:val="center"/>
+            </w:pPr>
+            <w:r/>
+            <w:r>
+              <w:rPr>
+                <w:rFonts w:ascii="Times New Roman" w:hAnsi="Times New Roman" w:eastAsia="Times New Roman"/>
+                <w:b w:val="0"/>
+                <w:i w:val="0"/>
+                <w:color w:val="000000"/>
+                <w:sz w:val="17"/>
+              </w:rPr>
+              <w:t>0.8489</w:t>
+            </w:r>
+          </w:p>
+        </w:tc>
+        <w:tc>
+          <w:tcPr>
+            <w:tcW w:type="dxa" w:w="2016"/>
+            <w:vAlign w:val="center"/>
+          </w:tcPr>
+          <w:p>
+            <w:pPr>
+              <w:spacing w:before="0" w:after="0" w:line="240" w:lineRule="auto"/>
+              <w:jc w:val="center"/>
+            </w:pPr>
+            <w:r/>
+            <w:r>
+              <w:rPr>
+                <w:rFonts w:ascii="Times New Roman" w:hAnsi="Times New Roman" w:eastAsia="Times New Roman"/>
+                <w:b w:val="0"/>
+                <w:i w:val="0"/>
+                <w:color w:val="000000"/>
+                <w:sz w:val="17"/>
+              </w:rPr>
+              <w:t>0.9904</w:t>
+            </w:r>
+          </w:p>
+        </w:tc>
+      </w:tr>
+      <w:tr>
+        <w:tc>
+          <w:tcPr>
+            <w:tcW w:type="dxa" w:w="2016"/>
+            <w:vAlign w:val="center"/>
+            <w:shd w:fill="F3F5F7"/>
+          </w:tcPr>
+          <w:p>
+            <w:pPr>
+              <w:spacing w:before="0" w:after="0" w:line="240" w:lineRule="auto"/>
+              <w:jc w:val="left"/>
+            </w:pPr>
+            <w:r/>
+            <w:r>
+              <w:rPr>
+                <w:rFonts w:ascii="Times New Roman" w:hAnsi="Times New Roman" w:eastAsia="Times New Roman"/>
+                <w:b w:val="0"/>
+                <w:i w:val="0"/>
+                <w:color w:val="000000"/>
+                <w:sz w:val="17"/>
+              </w:rPr>
+              <w:t>C1</w:t>
+            </w:r>
+          </w:p>
+        </w:tc>
+        <w:tc>
+          <w:tcPr>
+            <w:tcW w:type="dxa" w:w="2016"/>
+            <w:vAlign w:val="center"/>
+            <w:shd w:fill="F3F5F7"/>
+          </w:tcPr>
+          <w:p>
+            <w:pPr>
+              <w:spacing w:before="0" w:after="0" w:line="240" w:lineRule="auto"/>
+              <w:jc w:val="center"/>
+            </w:pPr>
+            <w:r/>
+            <w:r>
+              <w:rPr>
+                <w:rFonts w:ascii="Times New Roman" w:hAnsi="Times New Roman" w:eastAsia="Times New Roman"/>
+                <w:b w:val="0"/>
+                <w:i w:val="0"/>
+                <w:color w:val="000000"/>
+                <w:sz w:val="17"/>
+              </w:rPr>
+              <w:t>0.8768</w:t>
+            </w:r>
+          </w:p>
+        </w:tc>
+        <w:tc>
+          <w:tcPr>
+            <w:tcW w:type="dxa" w:w="2016"/>
+            <w:vAlign w:val="center"/>
+            <w:shd w:fill="F3F5F7"/>
+          </w:tcPr>
+          <w:p>
+            <w:pPr>
+              <w:spacing w:before="0" w:after="0" w:line="240" w:lineRule="auto"/>
+              <w:jc w:val="center"/>
+            </w:pPr>
+            <w:r/>
+            <w:r>
+              <w:rPr>
+                <w:rFonts w:ascii="Times New Roman" w:hAnsi="Times New Roman" w:eastAsia="Times New Roman"/>
+                <w:b w:val="0"/>
+                <w:i w:val="0"/>
+                <w:color w:val="000000"/>
+                <w:sz w:val="17"/>
+              </w:rPr>
+              <w:t>0.9490</w:t>
+            </w:r>
+          </w:p>
+        </w:tc>
+        <w:tc>
+          <w:tcPr>
+            <w:tcW w:type="dxa" w:w="2016"/>
+            <w:vAlign w:val="center"/>
+            <w:shd w:fill="F3F5F7"/>
+          </w:tcPr>
+          <w:p>
+            <w:pPr>
+              <w:spacing w:before="0" w:after="0" w:line="240" w:lineRule="auto"/>
+              <w:jc w:val="center"/>
+            </w:pPr>
+            <w:r/>
+            <w:r>
+              <w:rPr>
+                <w:rFonts w:ascii="Times New Roman" w:hAnsi="Times New Roman" w:eastAsia="Times New Roman"/>
+                <w:b w:val="0"/>
+                <w:i w:val="0"/>
+                <w:color w:val="000000"/>
+                <w:sz w:val="17"/>
+              </w:rPr>
+              <w:t>0.8636</w:t>
+            </w:r>
+          </w:p>
+        </w:tc>
+        <w:tc>
+          <w:tcPr>
+            <w:tcW w:type="dxa" w:w="2016"/>
+            <w:vAlign w:val="center"/>
+            <w:shd w:fill="F3F5F7"/>
+          </w:tcPr>
+          <w:p>
+            <w:pPr>
+              <w:spacing w:before="0" w:after="0" w:line="240" w:lineRule="auto"/>
+              <w:jc w:val="center"/>
+            </w:pPr>
+            <w:r/>
+            <w:r>
+              <w:rPr>
+                <w:rFonts w:ascii="Times New Roman" w:hAnsi="Times New Roman" w:eastAsia="Times New Roman"/>
+                <w:b w:val="0"/>
+                <w:i w:val="0"/>
+                <w:color w:val="000000"/>
+                <w:sz w:val="17"/>
+              </w:rPr>
+              <w:t>0.9895</w:t>
+            </w:r>
+          </w:p>
+        </w:tc>
+      </w:tr>
+      <w:tr>
+        <w:tc>
+          <w:tcPr>
+            <w:tcW w:type="dxa" w:w="2016"/>
+            <w:vAlign w:val="center"/>
+          </w:tcPr>
+          <w:p>
+            <w:pPr>
+              <w:spacing w:before="0" w:after="0" w:line="240" w:lineRule="auto"/>
+              <w:jc w:val="left"/>
+            </w:pPr>
+            <w:r/>
+            <w:r>
+              <w:rPr>
+                <w:rFonts w:ascii="Times New Roman" w:hAnsi="Times New Roman" w:eastAsia="Times New Roman"/>
+                <w:b w:val="0"/>
+                <w:i w:val="0"/>
+                <w:color w:val="000000"/>
+                <w:sz w:val="17"/>
+              </w:rPr>
+              <w:t>C2</w:t>
+            </w:r>
+          </w:p>
+        </w:tc>
+        <w:tc>
+          <w:tcPr>
+            <w:tcW w:type="dxa" w:w="2016"/>
+            <w:vAlign w:val="center"/>
+          </w:tcPr>
+          <w:p>
+            <w:pPr>
+              <w:spacing w:before="0" w:after="0" w:line="240" w:lineRule="auto"/>
+              <w:jc w:val="center"/>
+            </w:pPr>
+            <w:r/>
+            <w:r>
+              <w:rPr>
+                <w:rFonts w:ascii="Times New Roman" w:hAnsi="Times New Roman" w:eastAsia="Times New Roman"/>
+                <w:b w:val="0"/>
+                <w:i w:val="0"/>
+                <w:color w:val="000000"/>
+                <w:sz w:val="17"/>
+              </w:rPr>
+              <w:t>0.8772</w:t>
+            </w:r>
+          </w:p>
+        </w:tc>
+        <w:tc>
+          <w:tcPr>
+            <w:tcW w:type="dxa" w:w="2016"/>
+            <w:vAlign w:val="center"/>
+          </w:tcPr>
+          <w:p>
+            <w:pPr>
+              <w:spacing w:before="0" w:after="0" w:line="240" w:lineRule="auto"/>
+              <w:jc w:val="center"/>
+            </w:pPr>
+            <w:r/>
+            <w:r>
+              <w:rPr>
+                <w:rFonts w:ascii="Times New Roman" w:hAnsi="Times New Roman" w:eastAsia="Times New Roman"/>
+                <w:b w:val="0"/>
+                <w:i w:val="0"/>
+                <w:color w:val="000000"/>
+                <w:sz w:val="17"/>
+              </w:rPr>
+              <w:t>0.9551</w:t>
+            </w:r>
+          </w:p>
+        </w:tc>
+        <w:tc>
+          <w:tcPr>
+            <w:tcW w:type="dxa" w:w="2016"/>
+            <w:vAlign w:val="center"/>
+          </w:tcPr>
+          <w:p>
+            <w:pPr>
+              <w:spacing w:before="0" w:after="0" w:line="240" w:lineRule="auto"/>
+              <w:jc w:val="center"/>
+            </w:pPr>
+            <w:r/>
+            <w:r>
+              <w:rPr>
+                <w:rFonts w:ascii="Times New Roman" w:hAnsi="Times New Roman" w:eastAsia="Times New Roman"/>
+                <w:b w:val="0"/>
+                <w:i w:val="0"/>
+                <w:color w:val="000000"/>
+                <w:sz w:val="17"/>
+              </w:rPr>
+              <w:t>0.8504</w:t>
+            </w:r>
+          </w:p>
+        </w:tc>
+        <w:tc>
+          <w:tcPr>
+            <w:tcW w:type="dxa" w:w="2016"/>
+            <w:vAlign w:val="center"/>
+          </w:tcPr>
+          <w:p>
+            <w:pPr>
+              <w:spacing w:before="0" w:after="0" w:line="240" w:lineRule="auto"/>
+              <w:jc w:val="center"/>
+            </w:pPr>
+            <w:r/>
+            <w:r>
+              <w:rPr>
+                <w:rFonts w:ascii="Times New Roman" w:hAnsi="Times New Roman" w:eastAsia="Times New Roman"/>
+                <w:b w:val="0"/>
+                <w:i w:val="0"/>
+                <w:color w:val="000000"/>
+                <w:sz w:val="17"/>
+              </w:rPr>
+              <w:t>0.9914</w:t>
+            </w:r>
+          </w:p>
+        </w:tc>
+      </w:tr>
+      <w:tr>
+        <w:tc>
+          <w:tcPr>
+            <w:tcW w:type="dxa" w:w="2016"/>
+            <w:vAlign w:val="center"/>
+            <w:shd w:fill="F3F5F7"/>
+          </w:tcPr>
+          <w:p>
+            <w:pPr>
+              <w:spacing w:before="0" w:after="0" w:line="240" w:lineRule="auto"/>
+              <w:jc w:val="left"/>
+            </w:pPr>
+            <w:r/>
+            <w:r>
+              <w:rPr>
+                <w:rFonts w:ascii="Times New Roman" w:hAnsi="Times New Roman" w:eastAsia="Times New Roman"/>
+                <w:b w:val="0"/>
+                <w:i w:val="0"/>
+                <w:color w:val="000000"/>
+                <w:sz w:val="17"/>
+              </w:rPr>
+              <w:t>C3</w:t>
+            </w:r>
+          </w:p>
+        </w:tc>
+        <w:tc>
+          <w:tcPr>
+            <w:tcW w:type="dxa" w:w="2016"/>
+            <w:vAlign w:val="center"/>
+            <w:shd w:fill="F3F5F7"/>
+          </w:tcPr>
+          <w:p>
+            <w:pPr>
+              <w:spacing w:before="0" w:after="0" w:line="240" w:lineRule="auto"/>
+              <w:jc w:val="center"/>
+            </w:pPr>
+            <w:r/>
+            <w:r>
+              <w:rPr>
+                <w:rFonts w:ascii="Times New Roman" w:hAnsi="Times New Roman" w:eastAsia="Times New Roman"/>
+                <w:b w:val="0"/>
+                <w:i w:val="0"/>
+                <w:color w:val="000000"/>
+                <w:sz w:val="17"/>
+              </w:rPr>
+              <w:t>0.8739</w:t>
+            </w:r>
+          </w:p>
+        </w:tc>
+        <w:tc>
+          <w:tcPr>
+            <w:tcW w:type="dxa" w:w="2016"/>
+            <w:vAlign w:val="center"/>
+            <w:shd w:fill="F3F5F7"/>
+          </w:tcPr>
+          <w:p>
+            <w:pPr>
+              <w:spacing w:before="0" w:after="0" w:line="240" w:lineRule="auto"/>
+              <w:jc w:val="center"/>
+            </w:pPr>
+            <w:r/>
+            <w:r>
+              <w:rPr>
+                <w:rFonts w:ascii="Times New Roman" w:hAnsi="Times New Roman" w:eastAsia="Times New Roman"/>
+                <w:b w:val="0"/>
+                <w:i w:val="0"/>
+                <w:color w:val="000000"/>
+                <w:sz w:val="17"/>
+              </w:rPr>
+              <w:t>0.9559</w:t>
+            </w:r>
+          </w:p>
+        </w:tc>
+        <w:tc>
+          <w:tcPr>
+            <w:tcW w:type="dxa" w:w="2016"/>
+            <w:vAlign w:val="center"/>
+            <w:shd w:fill="F3F5F7"/>
+          </w:tcPr>
+          <w:p>
+            <w:pPr>
+              <w:spacing w:before="0" w:after="0" w:line="240" w:lineRule="auto"/>
+              <w:jc w:val="center"/>
+            </w:pPr>
+            <w:r/>
+            <w:r>
+              <w:rPr>
+                <w:rFonts w:ascii="Times New Roman" w:hAnsi="Times New Roman" w:eastAsia="Times New Roman"/>
+                <w:b w:val="0"/>
+                <w:i w:val="0"/>
+                <w:color w:val="000000"/>
+                <w:sz w:val="17"/>
+              </w:rPr>
+              <w:t>0.8507</w:t>
+            </w:r>
+          </w:p>
+        </w:tc>
+        <w:tc>
+          <w:tcPr>
+            <w:tcW w:type="dxa" w:w="2016"/>
+            <w:vAlign w:val="center"/>
+            <w:shd w:fill="F3F5F7"/>
+          </w:tcPr>
+          <w:p>
+            <w:pPr>
+              <w:spacing w:before="0" w:after="0" w:line="240" w:lineRule="auto"/>
+              <w:jc w:val="center"/>
+            </w:pPr>
+            <w:r/>
+            <w:r>
+              <w:rPr>
+                <w:rFonts w:ascii="Times New Roman" w:hAnsi="Times New Roman" w:eastAsia="Times New Roman"/>
+                <w:b w:val="0"/>
+                <w:i w:val="0"/>
+                <w:color w:val="000000"/>
+                <w:sz w:val="17"/>
+              </w:rPr>
+              <w:t>0.9890</w:t>
+            </w:r>
+          </w:p>
+        </w:tc>
+      </w:tr>
+    </w:tbl>
+    <w:p>
+      <w:pPr>
+        <w:spacing w:after="20"/>
+      </w:pPr>
+    </w:p>
+    <w:p>
+      <w:pPr>
+        <w:spacing w:before="0" w:after="80" w:line="240" w:lineRule="auto"/>
+        <w:jc w:val="both"/>
+      </w:pPr>
+      <w:r>
+        <w:rPr>
+          <w:rFonts w:ascii="Times New Roman" w:hAnsi="Times New Roman" w:eastAsia="Times New Roman"/>
+          <w:b w:val="0"/>
+          <w:i w:val="0"/>
+          <w:color w:val="000000"/>
+          <w:sz w:val="20"/>
+        </w:rPr>
+        <w:t>These are validation-screening values. They must be verified and cannot be reported as test results.</w:t>
       </w:r>
     </w:p>
     <w:p>

</xml_diff>

<commit_message>
Close Step 3 sampling controls
</commit_message>
<xml_diff>
--- a/research/codex/reports/BRSET_mBRSET_Research_Record.docx
+++ b/research/codex/reports/BRSET_mBRSET_Research_Record.docx
@@ -47,7 +47,7 @@
           <w:color w:val="000000"/>
           <w:sz w:val="18"/>
         </w:rPr>
-        <w:t>Updated 13 September 2026 | Current state: Step 2 complete; Step 3 controls prepared</w:t>
+        <w:t>Updated 13 September 2026 | Current state: Step 3 complete; Step 4 is next</w:t>
       </w:r>
     </w:p>
     <w:p>
@@ -73,7 +73,7 @@
           <w:color w:val="000000"/>
           <w:sz w:val="20"/>
         </w:rPr>
-        <w:t>This record tracks a supervised cross-device study for image-level diabetic retinopathy (DR) and macular edema (ME) classification. The current evidence establishes a strong joint BRSET–mBRSET baseline across three training seeds. It does not yet establish a novel method. The next experiments isolate domain exposure and joint-label balance before testing fitted appearance degradation. Numerical claims are linked to audited aggregate artifacts, and known limitations are retained rather than removed from later updates.</w:t>
+        <w:t>This record tracks a supervised cross-device study for image-level diabetic retinopathy (DR) and macular edema (ME) classification. The evidence establishes a strong joint BRSET–mBRSET baseline and closes the balance/exposure investigation. Natural joint sampling remains the reference after validation-only controls and replication. A novel method has not yet been established. Numerical claims are linked to audited aggregate artifacts, and known limitations are retained rather than removed from later updates.</w:t>
       </w:r>
     </w:p>
     <w:p>
@@ -130,7 +130,7 @@
           <w:color w:val="000000"/>
           <w:sz w:val="20"/>
         </w:rPr>
-        <w:t xml:space="preserve"> The study has a verified experimental foundation and a repeated joint-training advantage. A paper-level novelty claim remains conditional on the balance controls and the later preservation-constrained appearance experiment.</w:t>
+        <w:t xml:space="preserve"> The study has a verified experimental foundation, a repeated joint-training advantage, and a closed balance/exposure analysis. A paper-level novelty claim remains conditional on the preservation-constrained appearance experiments and closest-method evidence.</w:t>
       </w:r>
     </w:p>
     <w:p>
@@ -4005,7 +4005,7 @@
           <w:color w:val="000000"/>
           <w:sz w:val="20"/>
         </w:rPr>
-        <w:t xml:space="preserve"> deterministic exact-quota sampler, resume equivalence tests and exposure ledger prepared. Allocated preflight: passed; current run state: seed-0 controls verified; review the replication screen. No Step-3 test assessment has been performed.</w:t>
+        <w:t xml:space="preserve"> deterministic exact-quota sampler, resume equivalence tests and exposure ledger prepared. Allocated preflight: passed; current run state: Step 3 complete; natural joint B1 retained for Step 4. No Step-3 test assessment has been performed.</w:t>
       </w:r>
     </w:p>
     <w:tbl>
@@ -4644,6 +4644,736 @@
         <w:t>These are validation-screening values. They must be verified and cannot be reported as test results.</w:t>
       </w:r>
     </w:p>
+    <w:tbl>
+      <w:tblPr>
+        <w:tblStyle w:val="TableGrid"/>
+        <w:tblW w:type="auto" w:w="0"/>
+        <w:jc w:val="center"/>
+        <w:tblLook w:firstColumn="1" w:firstRow="1" w:lastColumn="0" w:lastRow="0" w:noHBand="0" w:noVBand="1" w:val="04A0"/>
+      </w:tblPr>
+      <w:tblGrid>
+        <w:gridCol w:w="1440"/>
+        <w:gridCol w:w="1440"/>
+        <w:gridCol w:w="1440"/>
+        <w:gridCol w:w="1440"/>
+        <w:gridCol w:w="1440"/>
+        <w:gridCol w:w="1440"/>
+        <w:gridCol w:w="1440"/>
+      </w:tblGrid>
+      <w:tr>
+        <w:tc>
+          <w:tcPr>
+            <w:tcW w:type="dxa" w:w="1440"/>
+            <w:vAlign w:val="center"/>
+            <w:shd w:fill="D9E2F3"/>
+          </w:tcPr>
+          <w:p>
+            <w:pPr>
+              <w:spacing w:before="0" w:after="0" w:line="240" w:lineRule="auto"/>
+              <w:jc w:val="left"/>
+            </w:pPr>
+            <w:r/>
+            <w:r>
+              <w:rPr>
+                <w:rFonts w:ascii="Times New Roman" w:hAnsi="Times New Roman" w:eastAsia="Times New Roman"/>
+                <w:b/>
+                <w:i w:val="0"/>
+                <w:color w:val="000000"/>
+                <w:sz w:val="17"/>
+              </w:rPr>
+              <w:t>Seed</w:t>
+            </w:r>
+          </w:p>
+        </w:tc>
+        <w:tc>
+          <w:tcPr>
+            <w:tcW w:type="dxa" w:w="1440"/>
+            <w:vAlign w:val="center"/>
+            <w:shd w:fill="D9E2F3"/>
+          </w:tcPr>
+          <w:p>
+            <w:pPr>
+              <w:spacing w:before="0" w:after="0" w:line="240" w:lineRule="auto"/>
+              <w:jc w:val="center"/>
+            </w:pPr>
+            <w:r/>
+            <w:r>
+              <w:rPr>
+                <w:rFonts w:ascii="Times New Roman" w:hAnsi="Times New Roman" w:eastAsia="Times New Roman"/>
+                <w:b/>
+                <w:i w:val="0"/>
+                <w:color w:val="000000"/>
+                <w:sz w:val="17"/>
+              </w:rPr>
+              <w:t>B1 DR F1</w:t>
+            </w:r>
+          </w:p>
+        </w:tc>
+        <w:tc>
+          <w:tcPr>
+            <w:tcW w:type="dxa" w:w="1440"/>
+            <w:vAlign w:val="center"/>
+            <w:shd w:fill="D9E2F3"/>
+          </w:tcPr>
+          <w:p>
+            <w:pPr>
+              <w:spacing w:before="0" w:after="0" w:line="240" w:lineRule="auto"/>
+              <w:jc w:val="center"/>
+            </w:pPr>
+            <w:r/>
+            <w:r>
+              <w:rPr>
+                <w:rFonts w:ascii="Times New Roman" w:hAnsi="Times New Roman" w:eastAsia="Times New Roman"/>
+                <w:b/>
+                <w:i w:val="0"/>
+                <w:color w:val="000000"/>
+                <w:sz w:val="17"/>
+              </w:rPr>
+              <w:t>C1 DR F1</w:t>
+            </w:r>
+          </w:p>
+        </w:tc>
+        <w:tc>
+          <w:tcPr>
+            <w:tcW w:type="dxa" w:w="1440"/>
+            <w:vAlign w:val="center"/>
+            <w:shd w:fill="D9E2F3"/>
+          </w:tcPr>
+          <w:p>
+            <w:pPr>
+              <w:spacing w:before="0" w:after="0" w:line="240" w:lineRule="auto"/>
+              <w:jc w:val="center"/>
+            </w:pPr>
+            <w:r/>
+            <w:r>
+              <w:rPr>
+                <w:rFonts w:ascii="Times New Roman" w:hAnsi="Times New Roman" w:eastAsia="Times New Roman"/>
+                <w:b/>
+                <w:i w:val="0"/>
+                <w:color w:val="000000"/>
+                <w:sz w:val="17"/>
+              </w:rPr>
+              <w:t>Difference</w:t>
+            </w:r>
+          </w:p>
+        </w:tc>
+        <w:tc>
+          <w:tcPr>
+            <w:tcW w:type="dxa" w:w="1440"/>
+            <w:vAlign w:val="center"/>
+            <w:shd w:fill="D9E2F3"/>
+          </w:tcPr>
+          <w:p>
+            <w:pPr>
+              <w:spacing w:before="0" w:after="0" w:line="240" w:lineRule="auto"/>
+              <w:jc w:val="center"/>
+            </w:pPr>
+            <w:r/>
+            <w:r>
+              <w:rPr>
+                <w:rFonts w:ascii="Times New Roman" w:hAnsi="Times New Roman" w:eastAsia="Times New Roman"/>
+                <w:b/>
+                <w:i w:val="0"/>
+                <w:color w:val="000000"/>
+                <w:sz w:val="17"/>
+              </w:rPr>
+              <w:t>B1 ME F1</w:t>
+            </w:r>
+          </w:p>
+        </w:tc>
+        <w:tc>
+          <w:tcPr>
+            <w:tcW w:type="dxa" w:w="1440"/>
+            <w:vAlign w:val="center"/>
+            <w:shd w:fill="D9E2F3"/>
+          </w:tcPr>
+          <w:p>
+            <w:pPr>
+              <w:spacing w:before="0" w:after="0" w:line="240" w:lineRule="auto"/>
+              <w:jc w:val="center"/>
+            </w:pPr>
+            <w:r/>
+            <w:r>
+              <w:rPr>
+                <w:rFonts w:ascii="Times New Roman" w:hAnsi="Times New Roman" w:eastAsia="Times New Roman"/>
+                <w:b/>
+                <w:i w:val="0"/>
+                <w:color w:val="000000"/>
+                <w:sz w:val="17"/>
+              </w:rPr>
+              <w:t>C1 ME F1</w:t>
+            </w:r>
+          </w:p>
+        </w:tc>
+        <w:tc>
+          <w:tcPr>
+            <w:tcW w:type="dxa" w:w="1440"/>
+            <w:vAlign w:val="center"/>
+            <w:shd w:fill="D9E2F3"/>
+          </w:tcPr>
+          <w:p>
+            <w:pPr>
+              <w:spacing w:before="0" w:after="0" w:line="240" w:lineRule="auto"/>
+              <w:jc w:val="center"/>
+            </w:pPr>
+            <w:r/>
+            <w:r>
+              <w:rPr>
+                <w:rFonts w:ascii="Times New Roman" w:hAnsi="Times New Roman" w:eastAsia="Times New Roman"/>
+                <w:b/>
+                <w:i w:val="0"/>
+                <w:color w:val="000000"/>
+                <w:sz w:val="17"/>
+              </w:rPr>
+              <w:t>Difference</w:t>
+            </w:r>
+          </w:p>
+        </w:tc>
+      </w:tr>
+      <w:tr>
+        <w:tc>
+          <w:tcPr>
+            <w:tcW w:type="dxa" w:w="1440"/>
+            <w:vAlign w:val="center"/>
+          </w:tcPr>
+          <w:p>
+            <w:pPr>
+              <w:spacing w:before="0" w:after="0" w:line="240" w:lineRule="auto"/>
+              <w:jc w:val="left"/>
+            </w:pPr>
+            <w:r/>
+            <w:r>
+              <w:rPr>
+                <w:rFonts w:ascii="Times New Roman" w:hAnsi="Times New Roman" w:eastAsia="Times New Roman"/>
+                <w:b w:val="0"/>
+                <w:i w:val="0"/>
+                <w:color w:val="000000"/>
+                <w:sz w:val="17"/>
+              </w:rPr>
+              <w:t>0</w:t>
+            </w:r>
+          </w:p>
+        </w:tc>
+        <w:tc>
+          <w:tcPr>
+            <w:tcW w:type="dxa" w:w="1440"/>
+            <w:vAlign w:val="center"/>
+          </w:tcPr>
+          <w:p>
+            <w:pPr>
+              <w:spacing w:before="0" w:after="0" w:line="240" w:lineRule="auto"/>
+              <w:jc w:val="center"/>
+            </w:pPr>
+            <w:r/>
+            <w:r>
+              <w:rPr>
+                <w:rFonts w:ascii="Times New Roman" w:hAnsi="Times New Roman" w:eastAsia="Times New Roman"/>
+                <w:b w:val="0"/>
+                <w:i w:val="0"/>
+                <w:color w:val="000000"/>
+                <w:sz w:val="17"/>
+              </w:rPr>
+              <w:t>0.8703</w:t>
+            </w:r>
+          </w:p>
+        </w:tc>
+        <w:tc>
+          <w:tcPr>
+            <w:tcW w:type="dxa" w:w="1440"/>
+            <w:vAlign w:val="center"/>
+          </w:tcPr>
+          <w:p>
+            <w:pPr>
+              <w:spacing w:before="0" w:after="0" w:line="240" w:lineRule="auto"/>
+              <w:jc w:val="center"/>
+            </w:pPr>
+            <w:r/>
+            <w:r>
+              <w:rPr>
+                <w:rFonts w:ascii="Times New Roman" w:hAnsi="Times New Roman" w:eastAsia="Times New Roman"/>
+                <w:b w:val="0"/>
+                <w:i w:val="0"/>
+                <w:color w:val="000000"/>
+                <w:sz w:val="17"/>
+              </w:rPr>
+              <w:t>0.8768</w:t>
+            </w:r>
+          </w:p>
+        </w:tc>
+        <w:tc>
+          <w:tcPr>
+            <w:tcW w:type="dxa" w:w="1440"/>
+            <w:vAlign w:val="center"/>
+          </w:tcPr>
+          <w:p>
+            <w:pPr>
+              <w:spacing w:before="0" w:after="0" w:line="240" w:lineRule="auto"/>
+              <w:jc w:val="center"/>
+            </w:pPr>
+            <w:r/>
+            <w:r>
+              <w:rPr>
+                <w:rFonts w:ascii="Times New Roman" w:hAnsi="Times New Roman" w:eastAsia="Times New Roman"/>
+                <w:b w:val="0"/>
+                <w:i w:val="0"/>
+                <w:color w:val="000000"/>
+                <w:sz w:val="17"/>
+              </w:rPr>
+              <w:t>+0.0065</w:t>
+            </w:r>
+          </w:p>
+        </w:tc>
+        <w:tc>
+          <w:tcPr>
+            <w:tcW w:type="dxa" w:w="1440"/>
+            <w:vAlign w:val="center"/>
+          </w:tcPr>
+          <w:p>
+            <w:pPr>
+              <w:spacing w:before="0" w:after="0" w:line="240" w:lineRule="auto"/>
+              <w:jc w:val="center"/>
+            </w:pPr>
+            <w:r/>
+            <w:r>
+              <w:rPr>
+                <w:rFonts w:ascii="Times New Roman" w:hAnsi="Times New Roman" w:eastAsia="Times New Roman"/>
+                <w:b w:val="0"/>
+                <w:i w:val="0"/>
+                <w:color w:val="000000"/>
+                <w:sz w:val="17"/>
+              </w:rPr>
+              <w:t>0.8489</w:t>
+            </w:r>
+          </w:p>
+        </w:tc>
+        <w:tc>
+          <w:tcPr>
+            <w:tcW w:type="dxa" w:w="1440"/>
+            <w:vAlign w:val="center"/>
+          </w:tcPr>
+          <w:p>
+            <w:pPr>
+              <w:spacing w:before="0" w:after="0" w:line="240" w:lineRule="auto"/>
+              <w:jc w:val="center"/>
+            </w:pPr>
+            <w:r/>
+            <w:r>
+              <w:rPr>
+                <w:rFonts w:ascii="Times New Roman" w:hAnsi="Times New Roman" w:eastAsia="Times New Roman"/>
+                <w:b w:val="0"/>
+                <w:i w:val="0"/>
+                <w:color w:val="000000"/>
+                <w:sz w:val="17"/>
+              </w:rPr>
+              <w:t>0.8636</w:t>
+            </w:r>
+          </w:p>
+        </w:tc>
+        <w:tc>
+          <w:tcPr>
+            <w:tcW w:type="dxa" w:w="1440"/>
+            <w:vAlign w:val="center"/>
+          </w:tcPr>
+          <w:p>
+            <w:pPr>
+              <w:spacing w:before="0" w:after="0" w:line="240" w:lineRule="auto"/>
+              <w:jc w:val="center"/>
+            </w:pPr>
+            <w:r/>
+            <w:r>
+              <w:rPr>
+                <w:rFonts w:ascii="Times New Roman" w:hAnsi="Times New Roman" w:eastAsia="Times New Roman"/>
+                <w:b w:val="0"/>
+                <w:i w:val="0"/>
+                <w:color w:val="000000"/>
+                <w:sz w:val="17"/>
+              </w:rPr>
+              <w:t>+0.0147</w:t>
+            </w:r>
+          </w:p>
+        </w:tc>
+      </w:tr>
+      <w:tr>
+        <w:tc>
+          <w:tcPr>
+            <w:tcW w:type="dxa" w:w="1440"/>
+            <w:vAlign w:val="center"/>
+            <w:shd w:fill="F3F5F7"/>
+          </w:tcPr>
+          <w:p>
+            <w:pPr>
+              <w:spacing w:before="0" w:after="0" w:line="240" w:lineRule="auto"/>
+              <w:jc w:val="left"/>
+            </w:pPr>
+            <w:r/>
+            <w:r>
+              <w:rPr>
+                <w:rFonts w:ascii="Times New Roman" w:hAnsi="Times New Roman" w:eastAsia="Times New Roman"/>
+                <w:b w:val="0"/>
+                <w:i w:val="0"/>
+                <w:color w:val="000000"/>
+                <w:sz w:val="17"/>
+              </w:rPr>
+              <w:t>1</w:t>
+            </w:r>
+          </w:p>
+        </w:tc>
+        <w:tc>
+          <w:tcPr>
+            <w:tcW w:type="dxa" w:w="1440"/>
+            <w:vAlign w:val="center"/>
+            <w:shd w:fill="F3F5F7"/>
+          </w:tcPr>
+          <w:p>
+            <w:pPr>
+              <w:spacing w:before="0" w:after="0" w:line="240" w:lineRule="auto"/>
+              <w:jc w:val="center"/>
+            </w:pPr>
+            <w:r/>
+            <w:r>
+              <w:rPr>
+                <w:rFonts w:ascii="Times New Roman" w:hAnsi="Times New Roman" w:eastAsia="Times New Roman"/>
+                <w:b w:val="0"/>
+                <w:i w:val="0"/>
+                <w:color w:val="000000"/>
+                <w:sz w:val="17"/>
+              </w:rPr>
+              <w:t>0.8727</w:t>
+            </w:r>
+          </w:p>
+        </w:tc>
+        <w:tc>
+          <w:tcPr>
+            <w:tcW w:type="dxa" w:w="1440"/>
+            <w:vAlign w:val="center"/>
+            <w:shd w:fill="F3F5F7"/>
+          </w:tcPr>
+          <w:p>
+            <w:pPr>
+              <w:spacing w:before="0" w:after="0" w:line="240" w:lineRule="auto"/>
+              <w:jc w:val="center"/>
+            </w:pPr>
+            <w:r/>
+            <w:r>
+              <w:rPr>
+                <w:rFonts w:ascii="Times New Roman" w:hAnsi="Times New Roman" w:eastAsia="Times New Roman"/>
+                <w:b w:val="0"/>
+                <w:i w:val="0"/>
+                <w:color w:val="000000"/>
+                <w:sz w:val="17"/>
+              </w:rPr>
+              <w:t>0.8652</w:t>
+            </w:r>
+          </w:p>
+        </w:tc>
+        <w:tc>
+          <w:tcPr>
+            <w:tcW w:type="dxa" w:w="1440"/>
+            <w:vAlign w:val="center"/>
+            <w:shd w:fill="F3F5F7"/>
+          </w:tcPr>
+          <w:p>
+            <w:pPr>
+              <w:spacing w:before="0" w:after="0" w:line="240" w:lineRule="auto"/>
+              <w:jc w:val="center"/>
+            </w:pPr>
+            <w:r/>
+            <w:r>
+              <w:rPr>
+                <w:rFonts w:ascii="Times New Roman" w:hAnsi="Times New Roman" w:eastAsia="Times New Roman"/>
+                <w:b w:val="0"/>
+                <w:i w:val="0"/>
+                <w:color w:val="000000"/>
+                <w:sz w:val="17"/>
+              </w:rPr>
+              <w:t>-0.0076</w:t>
+            </w:r>
+          </w:p>
+        </w:tc>
+        <w:tc>
+          <w:tcPr>
+            <w:tcW w:type="dxa" w:w="1440"/>
+            <w:vAlign w:val="center"/>
+            <w:shd w:fill="F3F5F7"/>
+          </w:tcPr>
+          <w:p>
+            <w:pPr>
+              <w:spacing w:before="0" w:after="0" w:line="240" w:lineRule="auto"/>
+              <w:jc w:val="center"/>
+            </w:pPr>
+            <w:r/>
+            <w:r>
+              <w:rPr>
+                <w:rFonts w:ascii="Times New Roman" w:hAnsi="Times New Roman" w:eastAsia="Times New Roman"/>
+                <w:b w:val="0"/>
+                <w:i w:val="0"/>
+                <w:color w:val="000000"/>
+                <w:sz w:val="17"/>
+              </w:rPr>
+              <w:t>0.8462</w:t>
+            </w:r>
+          </w:p>
+        </w:tc>
+        <w:tc>
+          <w:tcPr>
+            <w:tcW w:type="dxa" w:w="1440"/>
+            <w:vAlign w:val="center"/>
+            <w:shd w:fill="F3F5F7"/>
+          </w:tcPr>
+          <w:p>
+            <w:pPr>
+              <w:spacing w:before="0" w:after="0" w:line="240" w:lineRule="auto"/>
+              <w:jc w:val="center"/>
+            </w:pPr>
+            <w:r/>
+            <w:r>
+              <w:rPr>
+                <w:rFonts w:ascii="Times New Roman" w:hAnsi="Times New Roman" w:eastAsia="Times New Roman"/>
+                <w:b w:val="0"/>
+                <w:i w:val="0"/>
+                <w:color w:val="000000"/>
+                <w:sz w:val="17"/>
+              </w:rPr>
+              <w:t>0.8467</w:t>
+            </w:r>
+          </w:p>
+        </w:tc>
+        <w:tc>
+          <w:tcPr>
+            <w:tcW w:type="dxa" w:w="1440"/>
+            <w:vAlign w:val="center"/>
+            <w:shd w:fill="F3F5F7"/>
+          </w:tcPr>
+          <w:p>
+            <w:pPr>
+              <w:spacing w:before="0" w:after="0" w:line="240" w:lineRule="auto"/>
+              <w:jc w:val="center"/>
+            </w:pPr>
+            <w:r/>
+            <w:r>
+              <w:rPr>
+                <w:rFonts w:ascii="Times New Roman" w:hAnsi="Times New Roman" w:eastAsia="Times New Roman"/>
+                <w:b w:val="0"/>
+                <w:i w:val="0"/>
+                <w:color w:val="000000"/>
+                <w:sz w:val="17"/>
+              </w:rPr>
+              <w:t>+0.0006</w:t>
+            </w:r>
+          </w:p>
+        </w:tc>
+      </w:tr>
+      <w:tr>
+        <w:tc>
+          <w:tcPr>
+            <w:tcW w:type="dxa" w:w="1440"/>
+            <w:vAlign w:val="center"/>
+          </w:tcPr>
+          <w:p>
+            <w:pPr>
+              <w:spacing w:before="0" w:after="0" w:line="240" w:lineRule="auto"/>
+              <w:jc w:val="left"/>
+            </w:pPr>
+            <w:r/>
+            <w:r>
+              <w:rPr>
+                <w:rFonts w:ascii="Times New Roman" w:hAnsi="Times New Roman" w:eastAsia="Times New Roman"/>
+                <w:b w:val="0"/>
+                <w:i w:val="0"/>
+                <w:color w:val="000000"/>
+                <w:sz w:val="17"/>
+              </w:rPr>
+              <w:t>2</w:t>
+            </w:r>
+          </w:p>
+        </w:tc>
+        <w:tc>
+          <w:tcPr>
+            <w:tcW w:type="dxa" w:w="1440"/>
+            <w:vAlign w:val="center"/>
+          </w:tcPr>
+          <w:p>
+            <w:pPr>
+              <w:spacing w:before="0" w:after="0" w:line="240" w:lineRule="auto"/>
+              <w:jc w:val="center"/>
+            </w:pPr>
+            <w:r/>
+            <w:r>
+              <w:rPr>
+                <w:rFonts w:ascii="Times New Roman" w:hAnsi="Times New Roman" w:eastAsia="Times New Roman"/>
+                <w:b w:val="0"/>
+                <w:i w:val="0"/>
+                <w:color w:val="000000"/>
+                <w:sz w:val="17"/>
+              </w:rPr>
+              <w:t>0.8678</w:t>
+            </w:r>
+          </w:p>
+        </w:tc>
+        <w:tc>
+          <w:tcPr>
+            <w:tcW w:type="dxa" w:w="1440"/>
+            <w:vAlign w:val="center"/>
+          </w:tcPr>
+          <w:p>
+            <w:pPr>
+              <w:spacing w:before="0" w:after="0" w:line="240" w:lineRule="auto"/>
+              <w:jc w:val="center"/>
+            </w:pPr>
+            <w:r/>
+            <w:r>
+              <w:rPr>
+                <w:rFonts w:ascii="Times New Roman" w:hAnsi="Times New Roman" w:eastAsia="Times New Roman"/>
+                <w:b w:val="0"/>
+                <w:i w:val="0"/>
+                <w:color w:val="000000"/>
+                <w:sz w:val="17"/>
+              </w:rPr>
+              <w:t>0.8795</w:t>
+            </w:r>
+          </w:p>
+        </w:tc>
+        <w:tc>
+          <w:tcPr>
+            <w:tcW w:type="dxa" w:w="1440"/>
+            <w:vAlign w:val="center"/>
+          </w:tcPr>
+          <w:p>
+            <w:pPr>
+              <w:spacing w:before="0" w:after="0" w:line="240" w:lineRule="auto"/>
+              <w:jc w:val="center"/>
+            </w:pPr>
+            <w:r/>
+            <w:r>
+              <w:rPr>
+                <w:rFonts w:ascii="Times New Roman" w:hAnsi="Times New Roman" w:eastAsia="Times New Roman"/>
+                <w:b w:val="0"/>
+                <w:i w:val="0"/>
+                <w:color w:val="000000"/>
+                <w:sz w:val="17"/>
+              </w:rPr>
+              <w:t>+0.0117</w:t>
+            </w:r>
+          </w:p>
+        </w:tc>
+        <w:tc>
+          <w:tcPr>
+            <w:tcW w:type="dxa" w:w="1440"/>
+            <w:vAlign w:val="center"/>
+          </w:tcPr>
+          <w:p>
+            <w:pPr>
+              <w:spacing w:before="0" w:after="0" w:line="240" w:lineRule="auto"/>
+              <w:jc w:val="center"/>
+            </w:pPr>
+            <w:r/>
+            <w:r>
+              <w:rPr>
+                <w:rFonts w:ascii="Times New Roman" w:hAnsi="Times New Roman" w:eastAsia="Times New Roman"/>
+                <w:b w:val="0"/>
+                <w:i w:val="0"/>
+                <w:color w:val="000000"/>
+                <w:sz w:val="17"/>
+              </w:rPr>
+              <w:t>0.8421</w:t>
+            </w:r>
+          </w:p>
+        </w:tc>
+        <w:tc>
+          <w:tcPr>
+            <w:tcW w:type="dxa" w:w="1440"/>
+            <w:vAlign w:val="center"/>
+          </w:tcPr>
+          <w:p>
+            <w:pPr>
+              <w:spacing w:before="0" w:after="0" w:line="240" w:lineRule="auto"/>
+              <w:jc w:val="center"/>
+            </w:pPr>
+            <w:r/>
+            <w:r>
+              <w:rPr>
+                <w:rFonts w:ascii="Times New Roman" w:hAnsi="Times New Roman" w:eastAsia="Times New Roman"/>
+                <w:b w:val="0"/>
+                <w:i w:val="0"/>
+                <w:color w:val="000000"/>
+                <w:sz w:val="17"/>
+              </w:rPr>
+              <w:t>0.8504</w:t>
+            </w:r>
+          </w:p>
+        </w:tc>
+        <w:tc>
+          <w:tcPr>
+            <w:tcW w:type="dxa" w:w="1440"/>
+            <w:vAlign w:val="center"/>
+          </w:tcPr>
+          <w:p>
+            <w:pPr>
+              <w:spacing w:before="0" w:after="0" w:line="240" w:lineRule="auto"/>
+              <w:jc w:val="center"/>
+            </w:pPr>
+            <w:r/>
+            <w:r>
+              <w:rPr>
+                <w:rFonts w:ascii="Times New Roman" w:hAnsi="Times New Roman" w:eastAsia="Times New Roman"/>
+                <w:b w:val="0"/>
+                <w:i w:val="0"/>
+                <w:color w:val="000000"/>
+                <w:sz w:val="17"/>
+              </w:rPr>
+              <w:t>+0.0083</w:t>
+            </w:r>
+          </w:p>
+        </w:tc>
+      </w:tr>
+    </w:tbl>
+    <w:p>
+      <w:pPr>
+        <w:spacing w:after="20"/>
+      </w:pPr>
+    </w:p>
+    <w:p>
+      <w:pPr>
+        <w:spacing w:before="0" w:after="80" w:line="240" w:lineRule="auto"/>
+        <w:jc w:val="both"/>
+      </w:pPr>
+      <w:r>
+        <w:rPr>
+          <w:rFonts w:ascii="Times New Roman" w:hAnsi="Times New Roman" w:eastAsia="Times New Roman"/>
+          <w:b w:val="0"/>
+          <w:i w:val="0"/>
+          <w:color w:val="000000"/>
+          <w:sz w:val="20"/>
+        </w:rPr>
+        <w:t>C1 cross-seed values are validation-only evidence used to choose the Step-4 baseline. They are not an external test result.</w:t>
+      </w:r>
+    </w:p>
+    <w:p>
+      <w:pPr>
+        <w:spacing w:before="0" w:after="80" w:line="240" w:lineRule="auto"/>
+        <w:jc w:val="both"/>
+      </w:pPr>
+      <w:r>
+        <w:rPr>
+          <w:rFonts w:ascii="Times New Roman" w:hAnsi="Times New Roman" w:eastAsia="Times New Roman"/>
+          <w:b/>
+          <w:i w:val="0"/>
+          <w:color w:val="000000"/>
+          <w:sz w:val="20"/>
+        </w:rPr>
+        <w:t>Step-3 decision:</w:t>
+      </w:r>
+      <w:r>
+        <w:rPr>
+          <w:rFonts w:ascii="Times New Roman" w:hAnsi="Times New Roman" w:eastAsia="Times New Roman"/>
+          <w:b w:val="0"/>
+          <w:i w:val="0"/>
+          <w:color w:val="000000"/>
+          <w:sz w:val="20"/>
+        </w:rPr>
+        <w:t xml:space="preserve"> retain natural B1. Mean C1−B1 validation differences were +0.0035 DR F1 and +0.0079 ME F1. DR changed direction across seeds, while C1 mean AUROC was lower for both labels. All six B1/C1 runs peaked before the final quarter and declined thereafter, so the conditional longer-exposure run is not justified.</w:t>
+      </w:r>
+    </w:p>
     <w:p>
       <w:pPr>
         <w:spacing w:before="160" w:after="60" w:line="240" w:lineRule="auto"/>
@@ -4735,7 +5465,7 @@
           <w:color w:val="000000"/>
           <w:sz w:val="20"/>
         </w:rPr>
-        <w:t>•  Complete allocated Step-3 unit/preflight checks and GPU smoke validation.</w:t>
+        <w:t>•  Freeze Step-4 operators, probabilities, parameter ranges, FIT-only estimation data, compute budget and falsification rule.</w:t>
       </w:r>
     </w:p>
     <w:p>
@@ -4751,7 +5481,7 @@
           <w:color w:val="000000"/>
           <w:sz w:val="20"/>
         </w:rPr>
-        <w:t>•  Run C1–C3 seed 0 concurrently on three nonexclusive nodes and use validation only for screening.</w:t>
+        <w:t>•  Compare ordinary B1 augmentation, a faithful published fundus augmentation component and FIT-only fitted degradation on validation.</w:t>
       </w:r>
     </w:p>
     <w:p>
@@ -4767,7 +5497,7 @@
           <w:color w:val="000000"/>
           <w:sz w:val="20"/>
         </w:rPr>
-        <w:t>•  Replicate only interpretation-critical controls at seeds 1 and 2.</w:t>
+        <w:t>•  Measure diagnostic preservation; add the preservation constraint only if the fitted transform first shows a promising classifier effect.</w:t>
       </w:r>
     </w:p>
     <w:p>
@@ -4783,23 +5513,7 @@
           <w:color w:val="000000"/>
           <w:sz w:val="20"/>
         </w:rPr>
-        <w:t>•  Select the simplest strong fair baseline, then compare ordinary augmentation, a faithful published component and FIT-only fitted degradation.</w:t>
-      </w:r>
-    </w:p>
-    <w:p>
-      <w:pPr>
-        <w:spacing w:before="0" w:after="40" w:line="240" w:lineRule="auto"/>
-        <w:ind w:left="288" w:hanging="216"/>
-      </w:pPr>
-      <w:r>
-        <w:rPr>
-          <w:rFonts w:ascii="Times New Roman" w:hAnsi="Times New Roman" w:eastAsia="Times New Roman"/>
-          <w:b w:val="0"/>
-          <w:i w:val="0"/>
-          <w:color w:val="000000"/>
-          <w:sz w:val="20"/>
-        </w:rPr>
-        <w:t>•  Validate diagnostic preservation and complete the closest-method novelty comparison before writing a contribution claim.</w:t>
+        <w:t>•  Replicate only a promising Step-4 arm and complete the closest-method novelty comparison before writing a contribution claim.</w:t>
       </w:r>
     </w:p>
     <w:p>
@@ -5259,7 +5973,81 @@
                 <w:color w:val="000000"/>
                 <w:sz w:val="17"/>
               </w:rPr>
-              <w:t>SAMPLER_PROTOCOL.md; preflight.json when complete</w:t>
+              <w:t>SAMPLER_PROTOCOL.md; preflight.json</w:t>
+            </w:r>
+          </w:p>
+        </w:tc>
+      </w:tr>
+      <w:tr>
+        <w:tc>
+          <w:tcPr>
+            <w:tcW w:type="dxa" w:w="3360"/>
+            <w:vAlign w:val="center"/>
+            <w:shd w:fill="F3F5F7"/>
+          </w:tcPr>
+          <w:p>
+            <w:pPr>
+              <w:spacing w:before="0" w:after="0" w:line="240" w:lineRule="auto"/>
+              <w:jc w:val="left"/>
+            </w:pPr>
+            <w:r/>
+            <w:r>
+              <w:rPr>
+                <w:rFonts w:ascii="Times New Roman" w:hAnsi="Times New Roman" w:eastAsia="Times New Roman"/>
+                <w:b w:val="0"/>
+                <w:i w:val="0"/>
+                <w:color w:val="000000"/>
+                <w:sz w:val="17"/>
+              </w:rPr>
+              <w:t>13 Sep 2026</w:t>
+            </w:r>
+          </w:p>
+        </w:tc>
+        <w:tc>
+          <w:tcPr>
+            <w:tcW w:type="dxa" w:w="3360"/>
+            <w:vAlign w:val="center"/>
+            <w:shd w:fill="F3F5F7"/>
+          </w:tcPr>
+          <w:p>
+            <w:pPr>
+              <w:spacing w:before="0" w:after="0" w:line="240" w:lineRule="auto"/>
+              <w:jc w:val="center"/>
+            </w:pPr>
+            <w:r/>
+            <w:r>
+              <w:rPr>
+                <w:rFonts w:ascii="Times New Roman" w:hAnsi="Times New Roman" w:eastAsia="Times New Roman"/>
+                <w:b w:val="0"/>
+                <w:i w:val="0"/>
+                <w:color w:val="000000"/>
+                <w:sz w:val="17"/>
+              </w:rPr>
+              <w:t>Step-3 controls, C1 replication and curve decision complete</w:t>
+            </w:r>
+          </w:p>
+        </w:tc>
+        <w:tc>
+          <w:tcPr>
+            <w:tcW w:type="dxa" w:w="3360"/>
+            <w:vAlign w:val="center"/>
+            <w:shd w:fill="F3F5F7"/>
+          </w:tcPr>
+          <w:p>
+            <w:pPr>
+              <w:spacing w:before="0" w:after="0" w:line="240" w:lineRule="auto"/>
+              <w:jc w:val="center"/>
+            </w:pPr>
+            <w:r/>
+            <w:r>
+              <w:rPr>
+                <w:rFonts w:ascii="Times New Roman" w:hAnsi="Times New Roman" w:eastAsia="Times New Roman"/>
+                <w:b w:val="0"/>
+                <w:i w:val="0"/>
+                <w:color w:val="000000"/>
+                <w:sz w:val="17"/>
+              </w:rPr>
+              <w:t>c1_validation_three_seeds.json; final_curve_review.json</w:t>
             </w:r>
           </w:p>
         </w:tc>

</xml_diff>

<commit_message>
Start audited Step 4 appearance study
</commit_message>
<xml_diff>
--- a/research/codex/reports/BRSET_mBRSET_Research_Record.docx
+++ b/research/codex/reports/BRSET_mBRSET_Research_Record.docx
@@ -47,7 +47,7 @@
           <w:color w:val="000000"/>
           <w:sz w:val="18"/>
         </w:rPr>
-        <w:t>Updated 13 September 2026 | Current state: Step 3 complete; Step 4 is next</w:t>
+        <w:t>Updated 14 September 2026 | Current state: Step 4 design and training-only audit active</w:t>
       </w:r>
     </w:p>
     <w:p>
@@ -73,7 +73,7 @@
           <w:color w:val="000000"/>
           <w:sz w:val="20"/>
         </w:rPr>
-        <w:t>This record tracks a supervised cross-device study for image-level diabetic retinopathy (DR) and macular edema (ME) classification. The evidence establishes a strong joint BRSET–mBRSET baseline and closes the balance/exposure investigation. Natural joint sampling remains the reference after validation-only controls and replication. A novel method has not yet been established. Numerical claims are linked to audited aggregate artifacts, and known limitations are retained rather than removed from later updates.</w:t>
+        <w:t>This record tracks a supervised cross-device study for image-level diabetic retinopathy (DR) and macular edema (ME) classification. The evidence establishes a strong joint BRSET–mBRSET baseline and closes the balance/exposure investigation. Step 4 has begun with a training-only audit of whether DR/ME composition confounds the measured appearance gap. A novel method has not yet been established. Numerical claims are linked to audited aggregate artifacts, and known limitations are retained rather than removed from later updates.</w:t>
       </w:r>
     </w:p>
     <w:p>
@@ -5386,7 +5386,685 @@
           <w:color w:val="000000"/>
           <w:sz w:val="22"/>
         </w:rPr>
-        <w:t>VII.  NOVELTY GATE AND PAPER DIRECTION</w:t>
+        <w:t>VII.  STEP-4 TRAINING-ONLY APPEARANCE AUDIT</w:t>
+      </w:r>
+    </w:p>
+    <w:p>
+      <w:pPr>
+        <w:spacing w:before="0" w:after="80" w:line="240" w:lineRule="auto"/>
+        <w:jc w:val="both"/>
+      </w:pPr>
+      <w:r>
+        <w:rPr>
+          <w:rFonts w:ascii="Times New Roman" w:hAnsi="Times New Roman" w:eastAsia="Times New Roman"/>
+          <w:b w:val="0"/>
+          <w:i w:val="0"/>
+          <w:color w:val="000000"/>
+          <w:sz w:val="20"/>
+        </w:rPr>
+        <w:t>Purpose: check whether unequal DR/ME prevalence materially changes the five measured BRSET–mBRSET appearance gaps before refitting the degradation transform.</w:t>
+      </w:r>
+    </w:p>
+    <w:tbl>
+      <w:tblPr>
+        <w:tblStyle w:val="TableGrid"/>
+        <w:tblW w:type="auto" w:w="0"/>
+        <w:jc w:val="center"/>
+        <w:tblLook w:firstColumn="1" w:firstRow="1" w:lastColumn="0" w:lastRow="0" w:noHBand="0" w:noVBand="1" w:val="04A0"/>
+      </w:tblPr>
+      <w:tblGrid>
+        <w:gridCol w:w="2520"/>
+        <w:gridCol w:w="2520"/>
+        <w:gridCol w:w="2520"/>
+        <w:gridCol w:w="2520"/>
+      </w:tblGrid>
+      <w:tr>
+        <w:tc>
+          <w:tcPr>
+            <w:tcW w:type="dxa" w:w="2520"/>
+            <w:vAlign w:val="center"/>
+            <w:shd w:fill="D9E2F3"/>
+          </w:tcPr>
+          <w:p>
+            <w:pPr>
+              <w:spacing w:before="0" w:after="0" w:line="240" w:lineRule="auto"/>
+              <w:jc w:val="left"/>
+            </w:pPr>
+            <w:r/>
+            <w:r>
+              <w:rPr>
+                <w:rFonts w:ascii="Times New Roman" w:hAnsi="Times New Roman" w:eastAsia="Times New Roman"/>
+                <w:b/>
+                <w:i w:val="0"/>
+                <w:color w:val="000000"/>
+                <w:sz w:val="17"/>
+              </w:rPr>
+              <w:t>Statistic</w:t>
+            </w:r>
+          </w:p>
+        </w:tc>
+        <w:tc>
+          <w:tcPr>
+            <w:tcW w:type="dxa" w:w="2520"/>
+            <w:vAlign w:val="center"/>
+            <w:shd w:fill="D9E2F3"/>
+          </w:tcPr>
+          <w:p>
+            <w:pPr>
+              <w:spacing w:before="0" w:after="0" w:line="240" w:lineRule="auto"/>
+              <w:jc w:val="center"/>
+            </w:pPr>
+            <w:r/>
+            <w:r>
+              <w:rPr>
+                <w:rFonts w:ascii="Times New Roman" w:hAnsi="Times New Roman" w:eastAsia="Times New Roman"/>
+                <w:b/>
+                <w:i w:val="0"/>
+                <w:color w:val="000000"/>
+                <w:sz w:val="17"/>
+              </w:rPr>
+              <w:t>Raw gap / target SD</w:t>
+            </w:r>
+          </w:p>
+        </w:tc>
+        <w:tc>
+          <w:tcPr>
+            <w:tcW w:type="dxa" w:w="2520"/>
+            <w:vAlign w:val="center"/>
+            <w:shd w:fill="D9E2F3"/>
+          </w:tcPr>
+          <w:p>
+            <w:pPr>
+              <w:spacing w:before="0" w:after="0" w:line="240" w:lineRule="auto"/>
+              <w:jc w:val="center"/>
+            </w:pPr>
+            <w:r/>
+            <w:r>
+              <w:rPr>
+                <w:rFonts w:ascii="Times New Roman" w:hAnsi="Times New Roman" w:eastAsia="Times New Roman"/>
+                <w:b/>
+                <w:i w:val="0"/>
+                <w:color w:val="000000"/>
+                <w:sz w:val="17"/>
+              </w:rPr>
+              <w:t>Common-composition gap / target SD</w:t>
+            </w:r>
+          </w:p>
+        </w:tc>
+        <w:tc>
+          <w:tcPr>
+            <w:tcW w:type="dxa" w:w="2520"/>
+            <w:vAlign w:val="center"/>
+            <w:shd w:fill="D9E2F3"/>
+          </w:tcPr>
+          <w:p>
+            <w:pPr>
+              <w:spacing w:before="0" w:after="0" w:line="240" w:lineRule="auto"/>
+              <w:jc w:val="center"/>
+            </w:pPr>
+            <w:r/>
+            <w:r>
+              <w:rPr>
+                <w:rFonts w:ascii="Times New Roman" w:hAnsi="Times New Roman" w:eastAsia="Times New Roman"/>
+                <w:b/>
+                <w:i w:val="0"/>
+                <w:color w:val="000000"/>
+                <w:sz w:val="17"/>
+              </w:rPr>
+              <w:t>Change</w:t>
+            </w:r>
+          </w:p>
+        </w:tc>
+      </w:tr>
+      <w:tr>
+        <w:tc>
+          <w:tcPr>
+            <w:tcW w:type="dxa" w:w="2520"/>
+            <w:vAlign w:val="center"/>
+          </w:tcPr>
+          <w:p>
+            <w:pPr>
+              <w:spacing w:before="0" w:after="0" w:line="240" w:lineRule="auto"/>
+              <w:jc w:val="left"/>
+            </w:pPr>
+            <w:r/>
+            <w:r>
+              <w:rPr>
+                <w:rFonts w:ascii="Times New Roman" w:hAnsi="Times New Roman" w:eastAsia="Times New Roman"/>
+                <w:b w:val="0"/>
+                <w:i w:val="0"/>
+                <w:color w:val="000000"/>
+                <w:sz w:val="17"/>
+              </w:rPr>
+              <w:t>Sharpness</w:t>
+            </w:r>
+          </w:p>
+        </w:tc>
+        <w:tc>
+          <w:tcPr>
+            <w:tcW w:type="dxa" w:w="2520"/>
+            <w:vAlign w:val="center"/>
+          </w:tcPr>
+          <w:p>
+            <w:pPr>
+              <w:spacing w:before="0" w:after="0" w:line="240" w:lineRule="auto"/>
+              <w:jc w:val="center"/>
+            </w:pPr>
+            <w:r/>
+            <w:r>
+              <w:rPr>
+                <w:rFonts w:ascii="Times New Roman" w:hAnsi="Times New Roman" w:eastAsia="Times New Roman"/>
+                <w:b w:val="0"/>
+                <w:i w:val="0"/>
+                <w:color w:val="000000"/>
+                <w:sz w:val="17"/>
+              </w:rPr>
+              <w:t>+2.0943</w:t>
+            </w:r>
+          </w:p>
+        </w:tc>
+        <w:tc>
+          <w:tcPr>
+            <w:tcW w:type="dxa" w:w="2520"/>
+            <w:vAlign w:val="center"/>
+          </w:tcPr>
+          <w:p>
+            <w:pPr>
+              <w:spacing w:before="0" w:after="0" w:line="240" w:lineRule="auto"/>
+              <w:jc w:val="center"/>
+            </w:pPr>
+            <w:r/>
+            <w:r>
+              <w:rPr>
+                <w:rFonts w:ascii="Times New Roman" w:hAnsi="Times New Roman" w:eastAsia="Times New Roman"/>
+                <w:b w:val="0"/>
+                <w:i w:val="0"/>
+                <w:color w:val="000000"/>
+                <w:sz w:val="17"/>
+              </w:rPr>
+              <w:t>+2.1209</w:t>
+            </w:r>
+          </w:p>
+        </w:tc>
+        <w:tc>
+          <w:tcPr>
+            <w:tcW w:type="dxa" w:w="2520"/>
+            <w:vAlign w:val="center"/>
+          </w:tcPr>
+          <w:p>
+            <w:pPr>
+              <w:spacing w:before="0" w:after="0" w:line="240" w:lineRule="auto"/>
+              <w:jc w:val="center"/>
+            </w:pPr>
+            <w:r/>
+            <w:r>
+              <w:rPr>
+                <w:rFonts w:ascii="Times New Roman" w:hAnsi="Times New Roman" w:eastAsia="Times New Roman"/>
+                <w:b w:val="0"/>
+                <w:i w:val="0"/>
+                <w:color w:val="000000"/>
+                <w:sz w:val="17"/>
+              </w:rPr>
+              <w:t>+0.0266</w:t>
+            </w:r>
+          </w:p>
+        </w:tc>
+      </w:tr>
+      <w:tr>
+        <w:tc>
+          <w:tcPr>
+            <w:tcW w:type="dxa" w:w="2520"/>
+            <w:vAlign w:val="center"/>
+            <w:shd w:fill="F3F5F7"/>
+          </w:tcPr>
+          <w:p>
+            <w:pPr>
+              <w:spacing w:before="0" w:after="0" w:line="240" w:lineRule="auto"/>
+              <w:jc w:val="left"/>
+            </w:pPr>
+            <w:r/>
+            <w:r>
+              <w:rPr>
+                <w:rFonts w:ascii="Times New Roman" w:hAnsi="Times New Roman" w:eastAsia="Times New Roman"/>
+                <w:b w:val="0"/>
+                <w:i w:val="0"/>
+                <w:color w:val="000000"/>
+                <w:sz w:val="17"/>
+              </w:rPr>
+              <w:t>Brightness</w:t>
+            </w:r>
+          </w:p>
+        </w:tc>
+        <w:tc>
+          <w:tcPr>
+            <w:tcW w:type="dxa" w:w="2520"/>
+            <w:vAlign w:val="center"/>
+            <w:shd w:fill="F3F5F7"/>
+          </w:tcPr>
+          <w:p>
+            <w:pPr>
+              <w:spacing w:before="0" w:after="0" w:line="240" w:lineRule="auto"/>
+              <w:jc w:val="center"/>
+            </w:pPr>
+            <w:r/>
+            <w:r>
+              <w:rPr>
+                <w:rFonts w:ascii="Times New Roman" w:hAnsi="Times New Roman" w:eastAsia="Times New Roman"/>
+                <w:b w:val="0"/>
+                <w:i w:val="0"/>
+                <w:color w:val="000000"/>
+                <w:sz w:val="17"/>
+              </w:rPr>
+              <w:t>-0.3962</w:t>
+            </w:r>
+          </w:p>
+        </w:tc>
+        <w:tc>
+          <w:tcPr>
+            <w:tcW w:type="dxa" w:w="2520"/>
+            <w:vAlign w:val="center"/>
+            <w:shd w:fill="F3F5F7"/>
+          </w:tcPr>
+          <w:p>
+            <w:pPr>
+              <w:spacing w:before="0" w:after="0" w:line="240" w:lineRule="auto"/>
+              <w:jc w:val="center"/>
+            </w:pPr>
+            <w:r/>
+            <w:r>
+              <w:rPr>
+                <w:rFonts w:ascii="Times New Roman" w:hAnsi="Times New Roman" w:eastAsia="Times New Roman"/>
+                <w:b w:val="0"/>
+                <w:i w:val="0"/>
+                <w:color w:val="000000"/>
+                <w:sz w:val="17"/>
+              </w:rPr>
+              <w:t>-0.3693</w:t>
+            </w:r>
+          </w:p>
+        </w:tc>
+        <w:tc>
+          <w:tcPr>
+            <w:tcW w:type="dxa" w:w="2520"/>
+            <w:vAlign w:val="center"/>
+            <w:shd w:fill="F3F5F7"/>
+          </w:tcPr>
+          <w:p>
+            <w:pPr>
+              <w:spacing w:before="0" w:after="0" w:line="240" w:lineRule="auto"/>
+              <w:jc w:val="center"/>
+            </w:pPr>
+            <w:r/>
+            <w:r>
+              <w:rPr>
+                <w:rFonts w:ascii="Times New Roman" w:hAnsi="Times New Roman" w:eastAsia="Times New Roman"/>
+                <w:b w:val="0"/>
+                <w:i w:val="0"/>
+                <w:color w:val="000000"/>
+                <w:sz w:val="17"/>
+              </w:rPr>
+              <w:t>+0.0269</w:t>
+            </w:r>
+          </w:p>
+        </w:tc>
+      </w:tr>
+      <w:tr>
+        <w:tc>
+          <w:tcPr>
+            <w:tcW w:type="dxa" w:w="2520"/>
+            <w:vAlign w:val="center"/>
+          </w:tcPr>
+          <w:p>
+            <w:pPr>
+              <w:spacing w:before="0" w:after="0" w:line="240" w:lineRule="auto"/>
+              <w:jc w:val="left"/>
+            </w:pPr>
+            <w:r/>
+            <w:r>
+              <w:rPr>
+                <w:rFonts w:ascii="Times New Roman" w:hAnsi="Times New Roman" w:eastAsia="Times New Roman"/>
+                <w:b w:val="0"/>
+                <w:i w:val="0"/>
+                <w:color w:val="000000"/>
+                <w:sz w:val="17"/>
+              </w:rPr>
+              <w:t>Contrast</w:t>
+            </w:r>
+          </w:p>
+        </w:tc>
+        <w:tc>
+          <w:tcPr>
+            <w:tcW w:type="dxa" w:w="2520"/>
+            <w:vAlign w:val="center"/>
+          </w:tcPr>
+          <w:p>
+            <w:pPr>
+              <w:spacing w:before="0" w:after="0" w:line="240" w:lineRule="auto"/>
+              <w:jc w:val="center"/>
+            </w:pPr>
+            <w:r/>
+            <w:r>
+              <w:rPr>
+                <w:rFonts w:ascii="Times New Roman" w:hAnsi="Times New Roman" w:eastAsia="Times New Roman"/>
+                <w:b w:val="0"/>
+                <w:i w:val="0"/>
+                <w:color w:val="000000"/>
+                <w:sz w:val="17"/>
+              </w:rPr>
+              <w:t>+1.3073</w:t>
+            </w:r>
+          </w:p>
+        </w:tc>
+        <w:tc>
+          <w:tcPr>
+            <w:tcW w:type="dxa" w:w="2520"/>
+            <w:vAlign w:val="center"/>
+          </w:tcPr>
+          <w:p>
+            <w:pPr>
+              <w:spacing w:before="0" w:after="0" w:line="240" w:lineRule="auto"/>
+              <w:jc w:val="center"/>
+            </w:pPr>
+            <w:r/>
+            <w:r>
+              <w:rPr>
+                <w:rFonts w:ascii="Times New Roman" w:hAnsi="Times New Roman" w:eastAsia="Times New Roman"/>
+                <w:b w:val="0"/>
+                <w:i w:val="0"/>
+                <w:color w:val="000000"/>
+                <w:sz w:val="17"/>
+              </w:rPr>
+              <w:t>+1.3436</w:t>
+            </w:r>
+          </w:p>
+        </w:tc>
+        <w:tc>
+          <w:tcPr>
+            <w:tcW w:type="dxa" w:w="2520"/>
+            <w:vAlign w:val="center"/>
+          </w:tcPr>
+          <w:p>
+            <w:pPr>
+              <w:spacing w:before="0" w:after="0" w:line="240" w:lineRule="auto"/>
+              <w:jc w:val="center"/>
+            </w:pPr>
+            <w:r/>
+            <w:r>
+              <w:rPr>
+                <w:rFonts w:ascii="Times New Roman" w:hAnsi="Times New Roman" w:eastAsia="Times New Roman"/>
+                <w:b w:val="0"/>
+                <w:i w:val="0"/>
+                <w:color w:val="000000"/>
+                <w:sz w:val="17"/>
+              </w:rPr>
+              <w:t>+0.0363</w:t>
+            </w:r>
+          </w:p>
+        </w:tc>
+      </w:tr>
+      <w:tr>
+        <w:tc>
+          <w:tcPr>
+            <w:tcW w:type="dxa" w:w="2520"/>
+            <w:vAlign w:val="center"/>
+            <w:shd w:fill="F3F5F7"/>
+          </w:tcPr>
+          <w:p>
+            <w:pPr>
+              <w:spacing w:before="0" w:after="0" w:line="240" w:lineRule="auto"/>
+              <w:jc w:val="left"/>
+            </w:pPr>
+            <w:r/>
+            <w:r>
+              <w:rPr>
+                <w:rFonts w:ascii="Times New Roman" w:hAnsi="Times New Roman" w:eastAsia="Times New Roman"/>
+                <w:b w:val="0"/>
+                <w:i w:val="0"/>
+                <w:color w:val="000000"/>
+                <w:sz w:val="17"/>
+              </w:rPr>
+              <w:t>Falloff</w:t>
+            </w:r>
+          </w:p>
+        </w:tc>
+        <w:tc>
+          <w:tcPr>
+            <w:tcW w:type="dxa" w:w="2520"/>
+            <w:vAlign w:val="center"/>
+            <w:shd w:fill="F3F5F7"/>
+          </w:tcPr>
+          <w:p>
+            <w:pPr>
+              <w:spacing w:before="0" w:after="0" w:line="240" w:lineRule="auto"/>
+              <w:jc w:val="center"/>
+            </w:pPr>
+            <w:r/>
+            <w:r>
+              <w:rPr>
+                <w:rFonts w:ascii="Times New Roman" w:hAnsi="Times New Roman" w:eastAsia="Times New Roman"/>
+                <w:b w:val="0"/>
+                <w:i w:val="0"/>
+                <w:color w:val="000000"/>
+                <w:sz w:val="17"/>
+              </w:rPr>
+              <w:t>+0.1678</w:t>
+            </w:r>
+          </w:p>
+        </w:tc>
+        <w:tc>
+          <w:tcPr>
+            <w:tcW w:type="dxa" w:w="2520"/>
+            <w:vAlign w:val="center"/>
+            <w:shd w:fill="F3F5F7"/>
+          </w:tcPr>
+          <w:p>
+            <w:pPr>
+              <w:spacing w:before="0" w:after="0" w:line="240" w:lineRule="auto"/>
+              <w:jc w:val="center"/>
+            </w:pPr>
+            <w:r/>
+            <w:r>
+              <w:rPr>
+                <w:rFonts w:ascii="Times New Roman" w:hAnsi="Times New Roman" w:eastAsia="Times New Roman"/>
+                <w:b w:val="0"/>
+                <w:i w:val="0"/>
+                <w:color w:val="000000"/>
+                <w:sz w:val="17"/>
+              </w:rPr>
+              <w:t>+0.1701</w:t>
+            </w:r>
+          </w:p>
+        </w:tc>
+        <w:tc>
+          <w:tcPr>
+            <w:tcW w:type="dxa" w:w="2520"/>
+            <w:vAlign w:val="center"/>
+            <w:shd w:fill="F3F5F7"/>
+          </w:tcPr>
+          <w:p>
+            <w:pPr>
+              <w:spacing w:before="0" w:after="0" w:line="240" w:lineRule="auto"/>
+              <w:jc w:val="center"/>
+            </w:pPr>
+            <w:r/>
+            <w:r>
+              <w:rPr>
+                <w:rFonts w:ascii="Times New Roman" w:hAnsi="Times New Roman" w:eastAsia="Times New Roman"/>
+                <w:b w:val="0"/>
+                <w:i w:val="0"/>
+                <w:color w:val="000000"/>
+                <w:sz w:val="17"/>
+              </w:rPr>
+              <w:t>+0.0022</w:t>
+            </w:r>
+          </w:p>
+        </w:tc>
+      </w:tr>
+      <w:tr>
+        <w:tc>
+          <w:tcPr>
+            <w:tcW w:type="dxa" w:w="2520"/>
+            <w:vAlign w:val="center"/>
+          </w:tcPr>
+          <w:p>
+            <w:pPr>
+              <w:spacing w:before="0" w:after="0" w:line="240" w:lineRule="auto"/>
+              <w:jc w:val="left"/>
+            </w:pPr>
+            <w:r/>
+            <w:r>
+              <w:rPr>
+                <w:rFonts w:ascii="Times New Roman" w:hAnsi="Times New Roman" w:eastAsia="Times New Roman"/>
+                <w:b w:val="0"/>
+                <w:i w:val="0"/>
+                <w:color w:val="000000"/>
+                <w:sz w:val="17"/>
+              </w:rPr>
+              <w:t>Saturation</w:t>
+            </w:r>
+          </w:p>
+        </w:tc>
+        <w:tc>
+          <w:tcPr>
+            <w:tcW w:type="dxa" w:w="2520"/>
+            <w:vAlign w:val="center"/>
+          </w:tcPr>
+          <w:p>
+            <w:pPr>
+              <w:spacing w:before="0" w:after="0" w:line="240" w:lineRule="auto"/>
+              <w:jc w:val="center"/>
+            </w:pPr>
+            <w:r/>
+            <w:r>
+              <w:rPr>
+                <w:rFonts w:ascii="Times New Roman" w:hAnsi="Times New Roman" w:eastAsia="Times New Roman"/>
+                <w:b w:val="0"/>
+                <w:i w:val="0"/>
+                <w:color w:val="000000"/>
+                <w:sz w:val="17"/>
+              </w:rPr>
+              <w:t>-0.4149</w:t>
+            </w:r>
+          </w:p>
+        </w:tc>
+        <w:tc>
+          <w:tcPr>
+            <w:tcW w:type="dxa" w:w="2520"/>
+            <w:vAlign w:val="center"/>
+          </w:tcPr>
+          <w:p>
+            <w:pPr>
+              <w:spacing w:before="0" w:after="0" w:line="240" w:lineRule="auto"/>
+              <w:jc w:val="center"/>
+            </w:pPr>
+            <w:r/>
+            <w:r>
+              <w:rPr>
+                <w:rFonts w:ascii="Times New Roman" w:hAnsi="Times New Roman" w:eastAsia="Times New Roman"/>
+                <w:b w:val="0"/>
+                <w:i w:val="0"/>
+                <w:color w:val="000000"/>
+                <w:sz w:val="17"/>
+              </w:rPr>
+              <w:t>-0.4587</w:t>
+            </w:r>
+          </w:p>
+        </w:tc>
+        <w:tc>
+          <w:tcPr>
+            <w:tcW w:type="dxa" w:w="2520"/>
+            <w:vAlign w:val="center"/>
+          </w:tcPr>
+          <w:p>
+            <w:pPr>
+              <w:spacing w:before="0" w:after="0" w:line="240" w:lineRule="auto"/>
+              <w:jc w:val="center"/>
+            </w:pPr>
+            <w:r/>
+            <w:r>
+              <w:rPr>
+                <w:rFonts w:ascii="Times New Roman" w:hAnsi="Times New Roman" w:eastAsia="Times New Roman"/>
+                <w:b w:val="0"/>
+                <w:i w:val="0"/>
+                <w:color w:val="000000"/>
+                <w:sz w:val="17"/>
+              </w:rPr>
+              <w:t>-0.0438</w:t>
+            </w:r>
+          </w:p>
+        </w:tc>
+      </w:tr>
+    </w:tbl>
+    <w:p>
+      <w:pPr>
+        <w:spacing w:after="20"/>
+      </w:pPr>
+    </w:p>
+    <w:p>
+      <w:pPr>
+        <w:spacing w:before="0" w:after="80" w:line="240" w:lineRule="auto"/>
+        <w:jc w:val="both"/>
+      </w:pPr>
+      <w:r>
+        <w:rPr>
+          <w:rFonts w:ascii="Times New Roman" w:hAnsi="Times New Roman" w:eastAsia="Times New Roman"/>
+          <w:b/>
+          <w:i w:val="0"/>
+          <w:color w:val="000000"/>
+          <w:sz w:val="20"/>
+        </w:rPr>
+        <w:t>Verified finding:</w:t>
+      </w:r>
+      <w:r>
+        <w:rPr>
+          <w:rFonts w:ascii="Times New Roman" w:hAnsi="Times New Roman" w:eastAsia="Times New Roman"/>
+          <w:b w:val="0"/>
+          <w:i w:val="0"/>
+          <w:color w:val="000000"/>
+          <w:sz w:val="20"/>
+        </w:rPr>
+        <w:t xml:space="preserve"> all 14,774 original-training images were measured. Standardizing both domains to the same pooled joint-label composition reversed no direction and changed each gap by less than 0.05 mBRSET standard deviations. Proceed with a global training-only refit; a label-standardized classifier arm is not justified.</w:t>
+      </w:r>
+    </w:p>
+    <w:p>
+      <w:pPr>
+        <w:spacing w:before="0" w:after="80" w:line="240" w:lineRule="auto"/>
+        <w:jc w:val="both"/>
+      </w:pPr>
+      <w:r>
+        <w:rPr>
+          <w:rFonts w:ascii="Times New Roman" w:hAnsi="Times New Roman" w:eastAsia="Times New Roman"/>
+          <w:b/>
+          <w:i w:val="0"/>
+          <w:color w:val="000000"/>
+          <w:sz w:val="20"/>
+        </w:rPr>
+        <w:t>Interpretation limit:</w:t>
+      </w:r>
+      <w:r>
+        <w:rPr>
+          <w:rFonts w:ascii="Times New Roman" w:hAnsi="Times New Roman" w:eastAsia="Times New Roman"/>
+          <w:b w:val="0"/>
+          <w:i w:val="0"/>
+          <w:color w:val="000000"/>
+          <w:sz w:val="20"/>
+        </w:rPr>
+        <w:t xml:space="preserve"> this is descriptive sensitivity analysis. Recorded DR/ME labels do not separate camera effects from population, site, image quality, other disease or unmeasured differences, and global appearance summaries do not establish lesion preservation.</w:t>
+      </w:r>
+    </w:p>
+    <w:p>
+      <w:pPr>
+        <w:spacing w:before="160" w:after="60" w:line="240" w:lineRule="auto"/>
+      </w:pPr>
+      <w:r>
+        <w:rPr>
+          <w:rFonts w:ascii="Times New Roman" w:hAnsi="Times New Roman" w:eastAsia="Times New Roman"/>
+          <w:b/>
+          <w:i w:val="0"/>
+          <w:color w:val="000000"/>
+          <w:sz w:val="22"/>
+        </w:rPr>
+        <w:t>VIII.  NOVELTY GATE AND PAPER DIRECTION</w:t>
       </w:r>
     </w:p>
     <w:p>
@@ -5449,7 +6127,7 @@
           <w:color w:val="000000"/>
           <w:sz w:val="22"/>
         </w:rPr>
-        <w:t>VIII.  NEXT ACTIONS</w:t>
+        <w:t>IX.  NEXT ACTIONS</w:t>
       </w:r>
     </w:p>
     <w:p>
@@ -5528,7 +6206,7 @@
           <w:color w:val="000000"/>
           <w:sz w:val="22"/>
         </w:rPr>
-        <w:t>IX.  AUDIT TRAIL</w:t>
+        <w:t>X.  AUDIT TRAIL</w:t>
       </w:r>
     </w:p>
     <w:tbl>
@@ -6052,6 +6730,77 @@
           </w:p>
         </w:tc>
       </w:tr>
+      <w:tr>
+        <w:tc>
+          <w:tcPr>
+            <w:tcW w:type="dxa" w:w="3360"/>
+            <w:vAlign w:val="center"/>
+          </w:tcPr>
+          <w:p>
+            <w:pPr>
+              <w:spacing w:before="0" w:after="0" w:line="240" w:lineRule="auto"/>
+              <w:jc w:val="left"/>
+            </w:pPr>
+            <w:r/>
+            <w:r>
+              <w:rPr>
+                <w:rFonts w:ascii="Times New Roman" w:hAnsi="Times New Roman" w:eastAsia="Times New Roman"/>
+                <w:b w:val="0"/>
+                <w:i w:val="0"/>
+                <w:color w:val="000000"/>
+                <w:sz w:val="17"/>
+              </w:rPr>
+              <w:t>14 Sep 2026</w:t>
+            </w:r>
+          </w:p>
+        </w:tc>
+        <w:tc>
+          <w:tcPr>
+            <w:tcW w:type="dxa" w:w="3360"/>
+            <w:vAlign w:val="center"/>
+          </w:tcPr>
+          <w:p>
+            <w:pPr>
+              <w:spacing w:before="0" w:after="0" w:line="240" w:lineRule="auto"/>
+              <w:jc w:val="center"/>
+            </w:pPr>
+            <w:r/>
+            <w:r>
+              <w:rPr>
+                <w:rFonts w:ascii="Times New Roman" w:hAnsi="Times New Roman" w:eastAsia="Times New Roman"/>
+                <w:b w:val="0"/>
+                <w:i w:val="0"/>
+                <w:color w:val="000000"/>
+                <w:sz w:val="17"/>
+              </w:rPr>
+              <w:t>Step-4 training-only label-composition audit complete</w:t>
+            </w:r>
+          </w:p>
+        </w:tc>
+        <w:tc>
+          <w:tcPr>
+            <w:tcW w:type="dxa" w:w="3360"/>
+            <w:vAlign w:val="center"/>
+          </w:tcPr>
+          <w:p>
+            <w:pPr>
+              <w:spacing w:before="0" w:after="0" w:line="240" w:lineRule="auto"/>
+              <w:jc w:val="center"/>
+            </w:pPr>
+            <w:r/>
+            <w:r>
+              <w:rPr>
+                <w:rFonts w:ascii="Times New Roman" w:hAnsi="Times New Roman" w:eastAsia="Times New Roman"/>
+                <w:b w:val="0"/>
+                <w:i w:val="0"/>
+                <w:color w:val="000000"/>
+                <w:sz w:val="17"/>
+              </w:rPr>
+              <w:t>appearance_label_audit.json; APPEARANCE_LABEL_AUDIT_REVIEW.md</w:t>
+            </w:r>
+          </w:p>
+        </w:tc>
+      </w:tr>
     </w:tbl>
     <w:p>
       <w:pPr>

</xml_diff>

<commit_message>
Launch audited Step 4 augmentation screen
</commit_message>
<xml_diff>
--- a/research/codex/reports/BRSET_mBRSET_Research_Record.docx
+++ b/research/codex/reports/BRSET_mBRSET_Research_Record.docx
@@ -47,7 +47,7 @@
           <w:color w:val="000000"/>
           <w:sz w:val="18"/>
         </w:rPr>
-        <w:t>Updated 14 September 2026 | Current state: Step 4 design and training-only audit active</w:t>
+        <w:t>Updated 14 September 2026 | Current state: Step 4 transform refit and preflight complete</w:t>
       </w:r>
     </w:p>
     <w:p>
@@ -73,7 +73,7 @@
           <w:color w:val="000000"/>
           <w:sz w:val="20"/>
         </w:rPr>
-        <w:t>This record tracks a supervised cross-device study for image-level diabetic retinopathy (DR) and macular edema (ME) classification. The evidence establishes a strong joint BRSET–mBRSET baseline and closes the balance/exposure investigation. Step 4 has begun with a training-only audit of whether DR/ME composition confounds the measured appearance gap. A novel method has not yet been established. Numerical claims are linked to audited aggregate artifacts, and known limitations are retained rather than removed from later updates.</w:t>
+        <w:t>This record tracks a supervised cross-device study for image-level diabetic retinopathy (DR) and macular edema (ME) classification. The evidence establishes a strong joint BRSET–mBRSET baseline and closes the balance/exposure investigation. Step 4 tests target-calibrated source-image transformations after a training-only label-composition audit. A novel method has not yet been established. Numerical claims are linked to audited aggregate artifacts, and known limitations are retained rather than removed from later updates.</w:t>
       </w:r>
     </w:p>
     <w:p>
@@ -6054,6 +6054,898 @@
     </w:p>
     <w:p>
       <w:pPr>
+        <w:spacing w:before="100" w:after="60" w:line="240" w:lineRule="auto"/>
+      </w:pPr>
+      <w:r>
+        <w:rPr>
+          <w:rFonts w:ascii="Times New Roman" w:hAnsi="Times New Roman" w:eastAsia="Times New Roman"/>
+          <w:b/>
+          <w:i/>
+          <w:color w:val="000000"/>
+          <w:sz w:val="20"/>
+        </w:rPr>
+        <w:t>VII-A.  STEP-4 TRANSFORM REFIT</w:t>
+      </w:r>
+    </w:p>
+    <w:tbl>
+      <w:tblPr>
+        <w:tblStyle w:val="TableGrid"/>
+        <w:tblW w:type="auto" w:w="0"/>
+        <w:jc w:val="center"/>
+        <w:tblLook w:firstColumn="1" w:firstRow="1" w:lastColumn="0" w:lastRow="0" w:noHBand="0" w:noVBand="1" w:val="04A0"/>
+      </w:tblPr>
+      <w:tblGrid>
+        <w:gridCol w:w="3360"/>
+        <w:gridCol w:w="3360"/>
+        <w:gridCol w:w="3360"/>
+      </w:tblGrid>
+      <w:tr>
+        <w:tc>
+          <w:tcPr>
+            <w:tcW w:type="dxa" w:w="3360"/>
+            <w:vAlign w:val="center"/>
+            <w:shd w:fill="D9E2F3"/>
+          </w:tcPr>
+          <w:p>
+            <w:pPr>
+              <w:spacing w:before="0" w:after="0" w:line="240" w:lineRule="auto"/>
+              <w:jc w:val="left"/>
+            </w:pPr>
+            <w:r/>
+            <w:r>
+              <w:rPr>
+                <w:rFonts w:ascii="Times New Roman" w:hAnsi="Times New Roman" w:eastAsia="Times New Roman"/>
+                <w:b/>
+                <w:i w:val="0"/>
+                <w:color w:val="000000"/>
+                <w:sz w:val="17"/>
+              </w:rPr>
+              <w:t>Validation transform</w:t>
+            </w:r>
+          </w:p>
+        </w:tc>
+        <w:tc>
+          <w:tcPr>
+            <w:tcW w:type="dxa" w:w="3360"/>
+            <w:vAlign w:val="center"/>
+            <w:shd w:fill="D9E2F3"/>
+          </w:tcPr>
+          <w:p>
+            <w:pPr>
+              <w:spacing w:before="0" w:after="0" w:line="240" w:lineRule="auto"/>
+              <w:jc w:val="center"/>
+            </w:pPr>
+            <w:r/>
+            <w:r>
+              <w:rPr>
+                <w:rFonts w:ascii="Times New Roman" w:hAnsi="Times New Roman" w:eastAsia="Times New Roman"/>
+                <w:b/>
+                <w:i w:val="0"/>
+                <w:color w:val="000000"/>
+                <w:sz w:val="17"/>
+              </w:rPr>
+              <w:t>Appearance distance mean</w:t>
+            </w:r>
+          </w:p>
+        </w:tc>
+        <w:tc>
+          <w:tcPr>
+            <w:tcW w:type="dxa" w:w="3360"/>
+            <w:vAlign w:val="center"/>
+            <w:shd w:fill="D9E2F3"/>
+          </w:tcPr>
+          <w:p>
+            <w:pPr>
+              <w:spacing w:before="0" w:after="0" w:line="240" w:lineRule="auto"/>
+              <w:jc w:val="center"/>
+            </w:pPr>
+            <w:r/>
+            <w:r>
+              <w:rPr>
+                <w:rFonts w:ascii="Times New Roman" w:hAnsi="Times New Roman" w:eastAsia="Times New Roman"/>
+                <w:b/>
+                <w:i w:val="0"/>
+                <w:color w:val="000000"/>
+                <w:sz w:val="17"/>
+              </w:rPr>
+              <w:t>Range across 3 draws</w:t>
+            </w:r>
+          </w:p>
+        </w:tc>
+      </w:tr>
+      <w:tr>
+        <w:tc>
+          <w:tcPr>
+            <w:tcW w:type="dxa" w:w="3360"/>
+            <w:vAlign w:val="center"/>
+          </w:tcPr>
+          <w:p>
+            <w:pPr>
+              <w:spacing w:before="0" w:after="0" w:line="240" w:lineRule="auto"/>
+              <w:jc w:val="left"/>
+            </w:pPr>
+            <w:r/>
+            <w:r>
+              <w:rPr>
+                <w:rFonts w:ascii="Times New Roman" w:hAnsi="Times New Roman" w:eastAsia="Times New Roman"/>
+                <w:b w:val="0"/>
+                <w:i w:val="0"/>
+                <w:color w:val="000000"/>
+                <w:sz w:val="17"/>
+              </w:rPr>
+              <w:t>Unchanged source</w:t>
+            </w:r>
+          </w:p>
+        </w:tc>
+        <w:tc>
+          <w:tcPr>
+            <w:tcW w:type="dxa" w:w="3360"/>
+            <w:vAlign w:val="center"/>
+          </w:tcPr>
+          <w:p>
+            <w:pPr>
+              <w:spacing w:before="0" w:after="0" w:line="240" w:lineRule="auto"/>
+              <w:jc w:val="center"/>
+            </w:pPr>
+            <w:r/>
+            <w:r>
+              <w:rPr>
+                <w:rFonts w:ascii="Times New Roman" w:hAnsi="Times New Roman" w:eastAsia="Times New Roman"/>
+                <w:b w:val="0"/>
+                <w:i w:val="0"/>
+                <w:color w:val="000000"/>
+                <w:sz w:val="17"/>
+              </w:rPr>
+              <w:t>6.066</w:t>
+            </w:r>
+          </w:p>
+        </w:tc>
+        <w:tc>
+          <w:tcPr>
+            <w:tcW w:type="dxa" w:w="3360"/>
+            <w:vAlign w:val="center"/>
+          </w:tcPr>
+          <w:p>
+            <w:pPr>
+              <w:spacing w:before="0" w:after="0" w:line="240" w:lineRule="auto"/>
+              <w:jc w:val="center"/>
+            </w:pPr>
+            <w:r/>
+            <w:r>
+              <w:rPr>
+                <w:rFonts w:ascii="Times New Roman" w:hAnsi="Times New Roman" w:eastAsia="Times New Roman"/>
+                <w:b w:val="0"/>
+                <w:i w:val="0"/>
+                <w:color w:val="000000"/>
+                <w:sz w:val="17"/>
+              </w:rPr>
+              <w:t>6.066–6.066</w:t>
+            </w:r>
+          </w:p>
+        </w:tc>
+      </w:tr>
+      <w:tr>
+        <w:tc>
+          <w:tcPr>
+            <w:tcW w:type="dxa" w:w="3360"/>
+            <w:vAlign w:val="center"/>
+            <w:shd w:fill="F3F5F7"/>
+          </w:tcPr>
+          <w:p>
+            <w:pPr>
+              <w:spacing w:before="0" w:after="0" w:line="240" w:lineRule="auto"/>
+              <w:jc w:val="left"/>
+            </w:pPr>
+            <w:r/>
+            <w:r>
+              <w:rPr>
+                <w:rFonts w:ascii="Times New Roman" w:hAnsi="Times New Roman" w:eastAsia="Times New Roman"/>
+                <w:b w:val="0"/>
+                <w:i w:val="0"/>
+                <w:color w:val="000000"/>
+                <w:sz w:val="17"/>
+              </w:rPr>
+              <w:t>Historical frozen</w:t>
+            </w:r>
+          </w:p>
+        </w:tc>
+        <w:tc>
+          <w:tcPr>
+            <w:tcW w:type="dxa" w:w="3360"/>
+            <w:vAlign w:val="center"/>
+            <w:shd w:fill="F3F5F7"/>
+          </w:tcPr>
+          <w:p>
+            <w:pPr>
+              <w:spacing w:before="0" w:after="0" w:line="240" w:lineRule="auto"/>
+              <w:jc w:val="center"/>
+            </w:pPr>
+            <w:r/>
+            <w:r>
+              <w:rPr>
+                <w:rFonts w:ascii="Times New Roman" w:hAnsi="Times New Roman" w:eastAsia="Times New Roman"/>
+                <w:b w:val="0"/>
+                <w:i w:val="0"/>
+                <w:color w:val="000000"/>
+                <w:sz w:val="17"/>
+              </w:rPr>
+              <w:t>4.211</w:t>
+            </w:r>
+          </w:p>
+        </w:tc>
+        <w:tc>
+          <w:tcPr>
+            <w:tcW w:type="dxa" w:w="3360"/>
+            <w:vAlign w:val="center"/>
+            <w:shd w:fill="F3F5F7"/>
+          </w:tcPr>
+          <w:p>
+            <w:pPr>
+              <w:spacing w:before="0" w:after="0" w:line="240" w:lineRule="auto"/>
+              <w:jc w:val="center"/>
+            </w:pPr>
+            <w:r/>
+            <w:r>
+              <w:rPr>
+                <w:rFonts w:ascii="Times New Roman" w:hAnsi="Times New Roman" w:eastAsia="Times New Roman"/>
+                <w:b w:val="0"/>
+                <w:i w:val="0"/>
+                <w:color w:val="000000"/>
+                <w:sz w:val="17"/>
+              </w:rPr>
+              <w:t>4.200–4.229</w:t>
+            </w:r>
+          </w:p>
+        </w:tc>
+      </w:tr>
+      <w:tr>
+        <w:tc>
+          <w:tcPr>
+            <w:tcW w:type="dxa" w:w="3360"/>
+            <w:vAlign w:val="center"/>
+          </w:tcPr>
+          <w:p>
+            <w:pPr>
+              <w:spacing w:before="0" w:after="0" w:line="240" w:lineRule="auto"/>
+              <w:jc w:val="left"/>
+            </w:pPr>
+            <w:r/>
+            <w:r>
+              <w:rPr>
+                <w:rFonts w:ascii="Times New Roman" w:hAnsi="Times New Roman" w:eastAsia="Times New Roman"/>
+                <w:b w:val="0"/>
+                <w:i w:val="0"/>
+                <w:color w:val="000000"/>
+                <w:sz w:val="17"/>
+              </w:rPr>
+              <w:t>Refitted full</w:t>
+            </w:r>
+          </w:p>
+        </w:tc>
+        <w:tc>
+          <w:tcPr>
+            <w:tcW w:type="dxa" w:w="3360"/>
+            <w:vAlign w:val="center"/>
+          </w:tcPr>
+          <w:p>
+            <w:pPr>
+              <w:spacing w:before="0" w:after="0" w:line="240" w:lineRule="auto"/>
+              <w:jc w:val="center"/>
+            </w:pPr>
+            <w:r/>
+            <w:r>
+              <w:rPr>
+                <w:rFonts w:ascii="Times New Roman" w:hAnsi="Times New Roman" w:eastAsia="Times New Roman"/>
+                <w:b w:val="0"/>
+                <w:i w:val="0"/>
+                <w:color w:val="000000"/>
+                <w:sz w:val="17"/>
+              </w:rPr>
+              <w:t>0.902</w:t>
+            </w:r>
+          </w:p>
+        </w:tc>
+        <w:tc>
+          <w:tcPr>
+            <w:tcW w:type="dxa" w:w="3360"/>
+            <w:vAlign w:val="center"/>
+          </w:tcPr>
+          <w:p>
+            <w:pPr>
+              <w:spacing w:before="0" w:after="0" w:line="240" w:lineRule="auto"/>
+              <w:jc w:val="center"/>
+            </w:pPr>
+            <w:r/>
+            <w:r>
+              <w:rPr>
+                <w:rFonts w:ascii="Times New Roman" w:hAnsi="Times New Roman" w:eastAsia="Times New Roman"/>
+                <w:b w:val="0"/>
+                <w:i w:val="0"/>
+                <w:color w:val="000000"/>
+                <w:sz w:val="17"/>
+              </w:rPr>
+              <w:t>0.894–0.914</w:t>
+            </w:r>
+          </w:p>
+        </w:tc>
+      </w:tr>
+      <w:tr>
+        <w:tc>
+          <w:tcPr>
+            <w:tcW w:type="dxa" w:w="3360"/>
+            <w:vAlign w:val="center"/>
+            <w:shd w:fill="F3F5F7"/>
+          </w:tcPr>
+          <w:p>
+            <w:pPr>
+              <w:spacing w:before="0" w:after="0" w:line="240" w:lineRule="auto"/>
+              <w:jc w:val="left"/>
+            </w:pPr>
+            <w:r/>
+            <w:r>
+              <w:rPr>
+                <w:rFonts w:ascii="Times New Roman" w:hAnsi="Times New Roman" w:eastAsia="Times New Roman"/>
+                <w:b w:val="0"/>
+                <w:i w:val="0"/>
+                <w:color w:val="000000"/>
+                <w:sz w:val="17"/>
+              </w:rPr>
+              <w:t>Refitted no overlays</w:t>
+            </w:r>
+          </w:p>
+        </w:tc>
+        <w:tc>
+          <w:tcPr>
+            <w:tcW w:type="dxa" w:w="3360"/>
+            <w:vAlign w:val="center"/>
+            <w:shd w:fill="F3F5F7"/>
+          </w:tcPr>
+          <w:p>
+            <w:pPr>
+              <w:spacing w:before="0" w:after="0" w:line="240" w:lineRule="auto"/>
+              <w:jc w:val="center"/>
+            </w:pPr>
+            <w:r/>
+            <w:r>
+              <w:rPr>
+                <w:rFonts w:ascii="Times New Roman" w:hAnsi="Times New Roman" w:eastAsia="Times New Roman"/>
+                <w:b w:val="0"/>
+                <w:i w:val="0"/>
+                <w:color w:val="000000"/>
+                <w:sz w:val="17"/>
+              </w:rPr>
+              <w:t>0.942</w:t>
+            </w:r>
+          </w:p>
+        </w:tc>
+        <w:tc>
+          <w:tcPr>
+            <w:tcW w:type="dxa" w:w="3360"/>
+            <w:vAlign w:val="center"/>
+            <w:shd w:fill="F3F5F7"/>
+          </w:tcPr>
+          <w:p>
+            <w:pPr>
+              <w:spacing w:before="0" w:after="0" w:line="240" w:lineRule="auto"/>
+              <w:jc w:val="center"/>
+            </w:pPr>
+            <w:r/>
+            <w:r>
+              <w:rPr>
+                <w:rFonts w:ascii="Times New Roman" w:hAnsi="Times New Roman" w:eastAsia="Times New Roman"/>
+                <w:b w:val="0"/>
+                <w:i w:val="0"/>
+                <w:color w:val="000000"/>
+                <w:sz w:val="17"/>
+              </w:rPr>
+              <w:t>0.936–0.948</w:t>
+            </w:r>
+          </w:p>
+        </w:tc>
+      </w:tr>
+    </w:tbl>
+    <w:p>
+      <w:pPr>
+        <w:spacing w:after="20"/>
+      </w:pPr>
+    </w:p>
+    <w:p>
+      <w:pPr>
+        <w:spacing w:before="0" w:after="80" w:line="240" w:lineRule="auto"/>
+        <w:jc w:val="both"/>
+      </w:pPr>
+      <w:r>
+        <w:rPr>
+          <w:rFonts w:ascii="Times New Roman" w:hAnsi="Times New Roman" w:eastAsia="Times New Roman"/>
+          <w:b w:val="0"/>
+          <w:i w:val="0"/>
+          <w:color w:val="000000"/>
+          <w:sz w:val="20"/>
+        </w:rPr>
+        <w:t>The refit used target means/scales from all 3,402 target-training images and two patient-disjoint 96-image source subsets for fitting and validation. These distances measure five global statistics; they do not certify lesions or camera physics.</w:t>
+      </w:r>
+    </w:p>
+    <w:tbl>
+      <w:tblPr>
+        <w:tblStyle w:val="TableGrid"/>
+        <w:tblW w:type="auto" w:w="0"/>
+        <w:jc w:val="center"/>
+        <w:tblLook w:firstColumn="1" w:firstRow="1" w:lastColumn="0" w:lastRow="0" w:noHBand="0" w:noVBand="1" w:val="04A0"/>
+      </w:tblPr>
+      <w:tblGrid>
+        <w:gridCol w:w="3360"/>
+        <w:gridCol w:w="3360"/>
+        <w:gridCol w:w="3360"/>
+      </w:tblGrid>
+      <w:tr>
+        <w:tc>
+          <w:tcPr>
+            <w:tcW w:type="dxa" w:w="3360"/>
+            <w:vAlign w:val="center"/>
+            <w:shd w:fill="D9E2F3"/>
+          </w:tcPr>
+          <w:p>
+            <w:pPr>
+              <w:spacing w:before="0" w:after="0" w:line="240" w:lineRule="auto"/>
+              <w:jc w:val="left"/>
+            </w:pPr>
+            <w:r/>
+            <w:r>
+              <w:rPr>
+                <w:rFonts w:ascii="Times New Roman" w:hAnsi="Times New Roman" w:eastAsia="Times New Roman"/>
+                <w:b/>
+                <w:i w:val="0"/>
+                <w:color w:val="000000"/>
+                <w:sz w:val="17"/>
+              </w:rPr>
+              <w:t>Parameter</w:t>
+            </w:r>
+          </w:p>
+        </w:tc>
+        <w:tc>
+          <w:tcPr>
+            <w:tcW w:type="dxa" w:w="3360"/>
+            <w:vAlign w:val="center"/>
+            <w:shd w:fill="D9E2F3"/>
+          </w:tcPr>
+          <w:p>
+            <w:pPr>
+              <w:spacing w:before="0" w:after="0" w:line="240" w:lineRule="auto"/>
+              <w:jc w:val="center"/>
+            </w:pPr>
+            <w:r/>
+            <w:r>
+              <w:rPr>
+                <w:rFonts w:ascii="Times New Roman" w:hAnsi="Times New Roman" w:eastAsia="Times New Roman"/>
+                <w:b/>
+                <w:i w:val="0"/>
+                <w:color w:val="000000"/>
+                <w:sz w:val="17"/>
+              </w:rPr>
+              <w:t>Refitted full</w:t>
+            </w:r>
+          </w:p>
+        </w:tc>
+        <w:tc>
+          <w:tcPr>
+            <w:tcW w:type="dxa" w:w="3360"/>
+            <w:vAlign w:val="center"/>
+            <w:shd w:fill="D9E2F3"/>
+          </w:tcPr>
+          <w:p>
+            <w:pPr>
+              <w:spacing w:before="0" w:after="0" w:line="240" w:lineRule="auto"/>
+              <w:jc w:val="center"/>
+            </w:pPr>
+            <w:r/>
+            <w:r>
+              <w:rPr>
+                <w:rFonts w:ascii="Times New Roman" w:hAnsi="Times New Roman" w:eastAsia="Times New Roman"/>
+                <w:b/>
+                <w:i w:val="0"/>
+                <w:color w:val="000000"/>
+                <w:sz w:val="17"/>
+              </w:rPr>
+              <w:t>Refitted no overlays</w:t>
+            </w:r>
+          </w:p>
+        </w:tc>
+      </w:tr>
+      <w:tr>
+        <w:tc>
+          <w:tcPr>
+            <w:tcW w:type="dxa" w:w="3360"/>
+            <w:vAlign w:val="center"/>
+          </w:tcPr>
+          <w:p>
+            <w:pPr>
+              <w:spacing w:before="0" w:after="0" w:line="240" w:lineRule="auto"/>
+              <w:jc w:val="left"/>
+            </w:pPr>
+            <w:r/>
+            <w:r>
+              <w:rPr>
+                <w:rFonts w:ascii="Times New Roman" w:hAnsi="Times New Roman" w:eastAsia="Times New Roman"/>
+                <w:b w:val="0"/>
+                <w:i w:val="0"/>
+                <w:color w:val="000000"/>
+                <w:sz w:val="17"/>
+              </w:rPr>
+              <w:t>Blur sigma</w:t>
+            </w:r>
+          </w:p>
+        </w:tc>
+        <w:tc>
+          <w:tcPr>
+            <w:tcW w:type="dxa" w:w="3360"/>
+            <w:vAlign w:val="center"/>
+          </w:tcPr>
+          <w:p>
+            <w:pPr>
+              <w:spacing w:before="0" w:after="0" w:line="240" w:lineRule="auto"/>
+              <w:jc w:val="center"/>
+            </w:pPr>
+            <w:r/>
+            <w:r>
+              <w:rPr>
+                <w:rFonts w:ascii="Times New Roman" w:hAnsi="Times New Roman" w:eastAsia="Times New Roman"/>
+                <w:b w:val="0"/>
+                <w:i w:val="0"/>
+                <w:color w:val="000000"/>
+                <w:sz w:val="17"/>
+              </w:rPr>
+              <w:t>0.5628</w:t>
+            </w:r>
+          </w:p>
+        </w:tc>
+        <w:tc>
+          <w:tcPr>
+            <w:tcW w:type="dxa" w:w="3360"/>
+            <w:vAlign w:val="center"/>
+          </w:tcPr>
+          <w:p>
+            <w:pPr>
+              <w:spacing w:before="0" w:after="0" w:line="240" w:lineRule="auto"/>
+              <w:jc w:val="center"/>
+            </w:pPr>
+            <w:r/>
+            <w:r>
+              <w:rPr>
+                <w:rFonts w:ascii="Times New Roman" w:hAnsi="Times New Roman" w:eastAsia="Times New Roman"/>
+                <w:b w:val="0"/>
+                <w:i w:val="0"/>
+                <w:color w:val="000000"/>
+                <w:sz w:val="17"/>
+              </w:rPr>
+              <w:t>0.4367</w:t>
+            </w:r>
+          </w:p>
+        </w:tc>
+      </w:tr>
+      <w:tr>
+        <w:tc>
+          <w:tcPr>
+            <w:tcW w:type="dxa" w:w="3360"/>
+            <w:vAlign w:val="center"/>
+            <w:shd w:fill="F3F5F7"/>
+          </w:tcPr>
+          <w:p>
+            <w:pPr>
+              <w:spacing w:before="0" w:after="0" w:line="240" w:lineRule="auto"/>
+              <w:jc w:val="left"/>
+            </w:pPr>
+            <w:r/>
+            <w:r>
+              <w:rPr>
+                <w:rFonts w:ascii="Times New Roman" w:hAnsi="Times New Roman" w:eastAsia="Times New Roman"/>
+                <w:b w:val="0"/>
+                <w:i w:val="0"/>
+                <w:color w:val="000000"/>
+                <w:sz w:val="17"/>
+              </w:rPr>
+              <w:t>Illumination strength</w:t>
+            </w:r>
+          </w:p>
+        </w:tc>
+        <w:tc>
+          <w:tcPr>
+            <w:tcW w:type="dxa" w:w="3360"/>
+            <w:vAlign w:val="center"/>
+            <w:shd w:fill="F3F5F7"/>
+          </w:tcPr>
+          <w:p>
+            <w:pPr>
+              <w:spacing w:before="0" w:after="0" w:line="240" w:lineRule="auto"/>
+              <w:jc w:val="center"/>
+            </w:pPr>
+            <w:r/>
+            <w:r>
+              <w:rPr>
+                <w:rFonts w:ascii="Times New Roman" w:hAnsi="Times New Roman" w:eastAsia="Times New Roman"/>
+                <w:b w:val="0"/>
+                <w:i w:val="0"/>
+                <w:color w:val="000000"/>
+                <w:sz w:val="17"/>
+              </w:rPr>
+              <w:t>0.2936</w:t>
+            </w:r>
+          </w:p>
+        </w:tc>
+        <w:tc>
+          <w:tcPr>
+            <w:tcW w:type="dxa" w:w="3360"/>
+            <w:vAlign w:val="center"/>
+            <w:shd w:fill="F3F5F7"/>
+          </w:tcPr>
+          <w:p>
+            <w:pPr>
+              <w:spacing w:before="0" w:after="0" w:line="240" w:lineRule="auto"/>
+              <w:jc w:val="center"/>
+            </w:pPr>
+            <w:r/>
+            <w:r>
+              <w:rPr>
+                <w:rFonts w:ascii="Times New Roman" w:hAnsi="Times New Roman" w:eastAsia="Times New Roman"/>
+                <w:b w:val="0"/>
+                <w:i w:val="0"/>
+                <w:color w:val="000000"/>
+                <w:sz w:val="17"/>
+              </w:rPr>
+              <w:t>0.1195</w:t>
+            </w:r>
+          </w:p>
+        </w:tc>
+      </w:tr>
+      <w:tr>
+        <w:tc>
+          <w:tcPr>
+            <w:tcW w:type="dxa" w:w="3360"/>
+            <w:vAlign w:val="center"/>
+          </w:tcPr>
+          <w:p>
+            <w:pPr>
+              <w:spacing w:before="0" w:after="0" w:line="240" w:lineRule="auto"/>
+              <w:jc w:val="left"/>
+            </w:pPr>
+            <w:r/>
+            <w:r>
+              <w:rPr>
+                <w:rFonts w:ascii="Times New Roman" w:hAnsi="Times New Roman" w:eastAsia="Times New Roman"/>
+                <w:b w:val="0"/>
+                <w:i w:val="0"/>
+                <w:color w:val="000000"/>
+                <w:sz w:val="17"/>
+              </w:rPr>
+              <w:t>Spot / hole count; halo</w:t>
+            </w:r>
+          </w:p>
+        </w:tc>
+        <w:tc>
+          <w:tcPr>
+            <w:tcW w:type="dxa" w:w="3360"/>
+            <w:vAlign w:val="center"/>
+          </w:tcPr>
+          <w:p>
+            <w:pPr>
+              <w:spacing w:before="0" w:after="0" w:line="240" w:lineRule="auto"/>
+              <w:jc w:val="center"/>
+            </w:pPr>
+            <w:r/>
+            <w:r>
+              <w:rPr>
+                <w:rFonts w:ascii="Times New Roman" w:hAnsi="Times New Roman" w:eastAsia="Times New Roman"/>
+                <w:b w:val="0"/>
+                <w:i w:val="0"/>
+                <w:color w:val="000000"/>
+                <w:sz w:val="17"/>
+              </w:rPr>
+              <w:t>1 / 0; 0.1218</w:t>
+            </w:r>
+          </w:p>
+        </w:tc>
+        <w:tc>
+          <w:tcPr>
+            <w:tcW w:type="dxa" w:w="3360"/>
+            <w:vAlign w:val="center"/>
+          </w:tcPr>
+          <w:p>
+            <w:pPr>
+              <w:spacing w:before="0" w:after="0" w:line="240" w:lineRule="auto"/>
+              <w:jc w:val="center"/>
+            </w:pPr>
+            <w:r/>
+            <w:r>
+              <w:rPr>
+                <w:rFonts w:ascii="Times New Roman" w:hAnsi="Times New Roman" w:eastAsia="Times New Roman"/>
+                <w:b w:val="0"/>
+                <w:i w:val="0"/>
+                <w:color w:val="000000"/>
+                <w:sz w:val="17"/>
+              </w:rPr>
+              <w:t>0 / 0; 0</w:t>
+            </w:r>
+          </w:p>
+        </w:tc>
+      </w:tr>
+      <w:tr>
+        <w:tc>
+          <w:tcPr>
+            <w:tcW w:type="dxa" w:w="3360"/>
+            <w:vAlign w:val="center"/>
+            <w:shd w:fill="F3F5F7"/>
+          </w:tcPr>
+          <w:p>
+            <w:pPr>
+              <w:spacing w:before="0" w:after="0" w:line="240" w:lineRule="auto"/>
+              <w:jc w:val="left"/>
+            </w:pPr>
+            <w:r/>
+            <w:r>
+              <w:rPr>
+                <w:rFonts w:ascii="Times New Roman" w:hAnsi="Times New Roman" w:eastAsia="Times New Roman"/>
+                <w:b w:val="0"/>
+                <w:i w:val="0"/>
+                <w:color w:val="000000"/>
+                <w:sz w:val="17"/>
+              </w:rPr>
+              <w:t>Brightness / contrast / saturation</w:t>
+            </w:r>
+          </w:p>
+        </w:tc>
+        <w:tc>
+          <w:tcPr>
+            <w:tcW w:type="dxa" w:w="3360"/>
+            <w:vAlign w:val="center"/>
+            <w:shd w:fill="F3F5F7"/>
+          </w:tcPr>
+          <w:p>
+            <w:pPr>
+              <w:spacing w:before="0" w:after="0" w:line="240" w:lineRule="auto"/>
+              <w:jc w:val="center"/>
+            </w:pPr>
+            <w:r/>
+            <w:r>
+              <w:rPr>
+                <w:rFonts w:ascii="Times New Roman" w:hAnsi="Times New Roman" w:eastAsia="Times New Roman"/>
+                <w:b w:val="0"/>
+                <w:i w:val="0"/>
+                <w:color w:val="000000"/>
+                <w:sz w:val="17"/>
+              </w:rPr>
+              <w:t>0.8623 / 1.8712 / 0.6660</w:t>
+            </w:r>
+          </w:p>
+        </w:tc>
+        <w:tc>
+          <w:tcPr>
+            <w:tcW w:type="dxa" w:w="3360"/>
+            <w:vAlign w:val="center"/>
+            <w:shd w:fill="F3F5F7"/>
+          </w:tcPr>
+          <w:p>
+            <w:pPr>
+              <w:spacing w:before="0" w:after="0" w:line="240" w:lineRule="auto"/>
+              <w:jc w:val="center"/>
+            </w:pPr>
+            <w:r/>
+            <w:r>
+              <w:rPr>
+                <w:rFonts w:ascii="Times New Roman" w:hAnsi="Times New Roman" w:eastAsia="Times New Roman"/>
+                <w:b w:val="0"/>
+                <w:i w:val="0"/>
+                <w:color w:val="000000"/>
+                <w:sz w:val="17"/>
+              </w:rPr>
+              <w:t>0.7451 / 1.8679 / 0.5687</w:t>
+            </w:r>
+          </w:p>
+        </w:tc>
+      </w:tr>
+      <w:tr>
+        <w:tc>
+          <w:tcPr>
+            <w:tcW w:type="dxa" w:w="3360"/>
+            <w:vAlign w:val="center"/>
+          </w:tcPr>
+          <w:p>
+            <w:pPr>
+              <w:spacing w:before="0" w:after="0" w:line="240" w:lineRule="auto"/>
+              <w:jc w:val="left"/>
+            </w:pPr>
+            <w:r/>
+            <w:r>
+              <w:rPr>
+                <w:rFonts w:ascii="Times New Roman" w:hAnsi="Times New Roman" w:eastAsia="Times New Roman"/>
+                <w:b w:val="0"/>
+                <w:i w:val="0"/>
+                <w:color w:val="000000"/>
+                <w:sz w:val="17"/>
+              </w:rPr>
+              <w:t>Sensor-noise sigma</w:t>
+            </w:r>
+          </w:p>
+        </w:tc>
+        <w:tc>
+          <w:tcPr>
+            <w:tcW w:type="dxa" w:w="3360"/>
+            <w:vAlign w:val="center"/>
+          </w:tcPr>
+          <w:p>
+            <w:pPr>
+              <w:spacing w:before="0" w:after="0" w:line="240" w:lineRule="auto"/>
+              <w:jc w:val="center"/>
+            </w:pPr>
+            <w:r/>
+            <w:r>
+              <w:rPr>
+                <w:rFonts w:ascii="Times New Roman" w:hAnsi="Times New Roman" w:eastAsia="Times New Roman"/>
+                <w:b w:val="0"/>
+                <w:i w:val="0"/>
+                <w:color w:val="000000"/>
+                <w:sz w:val="17"/>
+              </w:rPr>
+              <w:t>0.00436</w:t>
+            </w:r>
+          </w:p>
+        </w:tc>
+        <w:tc>
+          <w:tcPr>
+            <w:tcW w:type="dxa" w:w="3360"/>
+            <w:vAlign w:val="center"/>
+          </w:tcPr>
+          <w:p>
+            <w:pPr>
+              <w:spacing w:before="0" w:after="0" w:line="240" w:lineRule="auto"/>
+              <w:jc w:val="center"/>
+            </w:pPr>
+            <w:r/>
+            <w:r>
+              <w:rPr>
+                <w:rFonts w:ascii="Times New Roman" w:hAnsi="Times New Roman" w:eastAsia="Times New Roman"/>
+                <w:b w:val="0"/>
+                <w:i w:val="0"/>
+                <w:color w:val="000000"/>
+                <w:sz w:val="17"/>
+              </w:rPr>
+              <w:t>0.00500</w:t>
+            </w:r>
+          </w:p>
+        </w:tc>
+      </w:tr>
+    </w:tbl>
+    <w:p>
+      <w:pPr>
+        <w:spacing w:after="20"/>
+      </w:pPr>
+    </w:p>
+    <w:p>
+      <w:pPr>
+        <w:spacing w:before="0" w:after="80" w:line="240" w:lineRule="auto"/>
+        <w:jc w:val="both"/>
+      </w:pPr>
+      <w:r>
+        <w:rPr>
+          <w:rFonts w:ascii="Times New Roman" w:hAnsi="Times New Roman" w:eastAsia="Times New Roman"/>
+          <w:b/>
+          <w:i w:val="0"/>
+          <w:color w:val="000000"/>
+          <w:sz w:val="20"/>
+        </w:rPr>
+        <w:t>Implementation gate:</w:t>
+      </w:r>
+      <w:r>
+        <w:rPr>
+          <w:rFonts w:ascii="Times New Roman" w:hAnsi="Times New Roman" w:eastAsia="Times New Roman"/>
+          <w:b w:val="0"/>
+          <w:i w:val="0"/>
+          <w:color w:val="000000"/>
+          <w:sz w:val="20"/>
+        </w:rPr>
+        <w:t xml:space="preserve"> passed. The target-domain training transform is bitwise identical to B1, fitted parameters are valid, and a private four-row qualitative gallery was generated. The gallery is excluded from this report under the privacy policy.</w:t>
+      </w:r>
+    </w:p>
+    <w:p>
+      <w:pPr>
         <w:spacing w:before="160" w:after="60" w:line="240" w:lineRule="auto"/>
       </w:pPr>
       <w:r>
@@ -6064,7 +6956,7 @@
           <w:color w:val="000000"/>
           <w:sz w:val="22"/>
         </w:rPr>
-        <w:t>VIII.  NOVELTY GATE AND PAPER DIRECTION</w:t>
+        <w:t>VIII.  NOVELTY GATE, WORLD MODEL AND PAPER DIRECTION</w:t>
       </w:r>
     </w:p>
     <w:p>
@@ -6117,6 +7009,58 @@
     </w:p>
     <w:p>
       <w:pPr>
+        <w:spacing w:before="0" w:after="80" w:line="240" w:lineRule="auto"/>
+        <w:jc w:val="both"/>
+      </w:pPr>
+      <w:r>
+        <w:rPr>
+          <w:rFonts w:ascii="Times New Roman" w:hAnsi="Times New Roman" w:eastAsia="Times New Roman"/>
+          <w:b/>
+          <w:i w:val="0"/>
+          <w:color w:val="000000"/>
+          <w:sz w:val="20"/>
+        </w:rPr>
+        <w:t>World-model decision:</w:t>
+      </w:r>
+      <w:r>
+        <w:rPr>
+          <w:rFonts w:ascii="Times New Roman" w:hAnsi="Times New Roman" w:eastAsia="Times New Roman"/>
+          <w:b w:val="0"/>
+          <w:i w:val="0"/>
+          <w:color w:val="000000"/>
+          <w:sz w:val="20"/>
+        </w:rPr>
+        <w:t xml:space="preserve"> CheXWorld (CVPR 2025) is the most plausible reference behind the meeting discussion. It predicts target latent features from transformed context features conditioned on known blur/color parameters. Its official example uses ViT-Base for 300 epochs on eight RTX 4090 GPUs. A smaller fundus latent-transition objective is a conditional Step-5 candidate; full CheXWorld or GenDeg training is not justified before Step 4 validates the acquisition-variation premise.</w:t>
+      </w:r>
+    </w:p>
+    <w:p>
+      <w:pPr>
+        <w:spacing w:before="0" w:after="80" w:line="240" w:lineRule="auto"/>
+        <w:jc w:val="both"/>
+      </w:pPr>
+      <w:r>
+        <w:rPr>
+          <w:rFonts w:ascii="Times New Roman" w:hAnsi="Times New Roman" w:eastAsia="Times New Roman"/>
+          <w:b/>
+          <w:i w:val="0"/>
+          <w:color w:val="000000"/>
+          <w:sz w:val="20"/>
+        </w:rPr>
+        <w:t>Advisor coverage:</w:t>
+      </w:r>
+      <w:r>
+        <w:rPr>
+          <w:rFonts w:ascii="Times New Roman" w:hAnsi="Times New Roman" w:eastAsia="Times New Roman"/>
+          <w:b w:val="0"/>
+          <w:i w:val="0"/>
+          <w:color w:val="000000"/>
+          <w:sz w:val="20"/>
+        </w:rPr>
+        <w:t xml:space="preserve"> same-configuration comparisons, class prevalence, sampling controls and qualitative degradation examples are addressed. Diagnostic-preservation validation, the classifier effect of fitted degradation and a fair longer-budget routing revisit remain open. The transcript also contains a user-owned request to disclose this external collaboration to the new employer; completion has not been documented.</w:t>
+      </w:r>
+    </w:p>
+    <w:p>
+      <w:pPr>
         <w:spacing w:before="160" w:after="60" w:line="240" w:lineRule="auto"/>
       </w:pPr>
       <w:r>
@@ -6159,7 +7103,7 @@
           <w:color w:val="000000"/>
           <w:sz w:val="20"/>
         </w:rPr>
-        <w:t>•  Compare ordinary B1 augmentation, a faithful published fundus augmentation component and FIT-only fitted degradation on validation.</w:t>
+        <w:t>•  Compare ordinary B1 augmentation, an independently implemented release-range FundusAug artifact component and FIT-only fitted degradation on validation.</w:t>
       </w:r>
     </w:p>
     <w:p>
@@ -6192,6 +7136,22 @@
           <w:sz w:val="20"/>
         </w:rPr>
         <w:t>•  Replicate only a promising Step-4 arm and complete the closest-method novelty comparison before writing a contribution claim.</w:t>
+      </w:r>
+    </w:p>
+    <w:p>
+      <w:pPr>
+        <w:spacing w:before="0" w:after="40" w:line="240" w:lineRule="auto"/>
+        <w:ind w:left="288" w:hanging="216"/>
+      </w:pPr>
+      <w:r>
+        <w:rPr>
+          <w:rFonts w:ascii="Times New Roman" w:hAnsi="Times New Roman" w:eastAsia="Times New Roman"/>
+          <w:b w:val="0"/>
+          <w:i w:val="0"/>
+          <w:color w:val="000000"/>
+          <w:sz w:val="20"/>
+        </w:rPr>
+        <w:t>•  Ask Dong to confirm the exact world-model paper title and venue when he responds; this does not block the controlled Step-4 experiment.</w:t>
       </w:r>
     </w:p>
     <w:p>
@@ -6801,6 +7761,80 @@
           </w:p>
         </w:tc>
       </w:tr>
+      <w:tr>
+        <w:tc>
+          <w:tcPr>
+            <w:tcW w:type="dxa" w:w="3360"/>
+            <w:vAlign w:val="center"/>
+            <w:shd w:fill="F3F5F7"/>
+          </w:tcPr>
+          <w:p>
+            <w:pPr>
+              <w:spacing w:before="0" w:after="0" w:line="240" w:lineRule="auto"/>
+              <w:jc w:val="left"/>
+            </w:pPr>
+            <w:r/>
+            <w:r>
+              <w:rPr>
+                <w:rFonts w:ascii="Times New Roman" w:hAnsi="Times New Roman" w:eastAsia="Times New Roman"/>
+                <w:b w:val="0"/>
+                <w:i w:val="0"/>
+                <w:color w:val="000000"/>
+                <w:sz w:val="17"/>
+              </w:rPr>
+              <w:t>14 Sep 2026</w:t>
+            </w:r>
+          </w:p>
+        </w:tc>
+        <w:tc>
+          <w:tcPr>
+            <w:tcW w:type="dxa" w:w="3360"/>
+            <w:vAlign w:val="center"/>
+            <w:shd w:fill="F3F5F7"/>
+          </w:tcPr>
+          <w:p>
+            <w:pPr>
+              <w:spacing w:before="0" w:after="0" w:line="240" w:lineRule="auto"/>
+              <w:jc w:val="center"/>
+            </w:pPr>
+            <w:r/>
+            <w:r>
+              <w:rPr>
+                <w:rFonts w:ascii="Times New Roman" w:hAnsi="Times New Roman" w:eastAsia="Times New Roman"/>
+                <w:b w:val="0"/>
+                <w:i w:val="0"/>
+                <w:color w:val="000000"/>
+                <w:sz w:val="17"/>
+              </w:rPr>
+              <w:t>Meeting/world-model direction audited</w:t>
+            </w:r>
+          </w:p>
+        </w:tc>
+        <w:tc>
+          <w:tcPr>
+            <w:tcW w:type="dxa" w:w="3360"/>
+            <w:vAlign w:val="center"/>
+            <w:shd w:fill="F3F5F7"/>
+          </w:tcPr>
+          <w:p>
+            <w:pPr>
+              <w:spacing w:before="0" w:after="0" w:line="240" w:lineRule="auto"/>
+              <w:jc w:val="center"/>
+            </w:pPr>
+            <w:r/>
+            <w:r>
+              <w:rPr>
+                <w:rFonts w:ascii="Times New Roman" w:hAnsi="Times New Roman" w:eastAsia="Times New Roman"/>
+                <w:b w:val="0"/>
+                <w:i w:val="0"/>
+                <w:color w:val="000000"/>
+                <w:sz w:val="17"/>
+              </w:rPr>
+              <w:t>DONG_TRANSCRIPT_AUDIT_2026-09.md; STEP4_WORLD_MODEL_DIRECTION_REVIEW.md</w:t>
+            </w:r>
+          </w:p>
+        </w:tc>
+      </w:tr>
     </w:tbl>
     <w:p>
       <w:pPr>

</xml_diff>

<commit_message>
Record Step 4 seed zero augmentation results
</commit_message>
<xml_diff>
--- a/research/codex/reports/BRSET_mBRSET_Research_Record.docx
+++ b/research/codex/reports/BRSET_mBRSET_Research_Record.docx
@@ -47,7 +47,7 @@
           <w:color w:val="000000"/>
           <w:sz w:val="18"/>
         </w:rPr>
-        <w:t>Updated 14 September 2026 | Current state: Step 4 transform refit and preflight complete</w:t>
+        <w:t>Updated 15 September 2026 | Current state: Step 4 seed-0 validation screen complete</w:t>
       </w:r>
     </w:p>
     <w:p>
@@ -73,7 +73,7 @@
           <w:color w:val="000000"/>
           <w:sz w:val="20"/>
         </w:rPr>
-        <w:t>This record tracks a supervised cross-device study for image-level diabetic retinopathy (DR) and macular edema (ME) classification. The evidence establishes a strong joint BRSET–mBRSET baseline and closes the balance/exposure investigation. Step 4 tests target-calibrated source-image transformations after a training-only label-composition audit. A novel method has not yet been established. Numerical claims are linked to audited aggregate artifacts, and known limitations are retained rather than removed from later updates.</w:t>
+        <w:t>This record tracks a supervised cross-device study for image-level diabetic retinopathy (DR) and macular edema (ME) classification. The evidence establishes a strong joint BRSET–mBRSET baseline and closes the balance/exposure investigation. The Step-4 seed-0 screen found that target-calibrated source transformations did not pass the frozen replication gate. A novel method has not yet been established. Numerical claims are linked to audited aggregate artifacts, and known limitations are retained rather than removed from later updates.</w:t>
       </w:r>
     </w:p>
     <w:p>
@@ -6944,6 +6944,1009 @@
         <w:t xml:space="preserve"> passed. The target-domain training transform is bitwise identical to B1, fitted parameters are valid, and a private four-row qualitative gallery was generated. The gallery is excluded from this report under the privacy policy.</w:t>
       </w:r>
     </w:p>
+    <w:tbl>
+      <w:tblPr>
+        <w:tblStyle w:val="TableGrid"/>
+        <w:tblW w:type="auto" w:w="0"/>
+        <w:jc w:val="center"/>
+        <w:tblLook w:firstColumn="1" w:firstRow="1" w:lastColumn="0" w:lastRow="0" w:noHBand="0" w:noVBand="1" w:val="04A0"/>
+      </w:tblPr>
+      <w:tblGrid>
+        <w:gridCol w:w="1260"/>
+        <w:gridCol w:w="1260"/>
+        <w:gridCol w:w="1260"/>
+        <w:gridCol w:w="1260"/>
+        <w:gridCol w:w="1260"/>
+        <w:gridCol w:w="1260"/>
+        <w:gridCol w:w="1260"/>
+        <w:gridCol w:w="1260"/>
+      </w:tblGrid>
+      <w:tr>
+        <w:tc>
+          <w:tcPr>
+            <w:tcW w:type="dxa" w:w="1260"/>
+            <w:vAlign w:val="center"/>
+            <w:shd w:fill="D9E2F3"/>
+          </w:tcPr>
+          <w:p>
+            <w:pPr>
+              <w:spacing w:before="0" w:after="0" w:line="240" w:lineRule="auto"/>
+              <w:jc w:val="left"/>
+            </w:pPr>
+            <w:r/>
+            <w:r>
+              <w:rPr>
+                <w:rFonts w:ascii="Times New Roman" w:hAnsi="Times New Roman" w:eastAsia="Times New Roman"/>
+                <w:b/>
+                <w:i w:val="0"/>
+                <w:color w:val="000000"/>
+                <w:sz w:val="17"/>
+              </w:rPr>
+              <w:t>Arm</w:t>
+            </w:r>
+          </w:p>
+        </w:tc>
+        <w:tc>
+          <w:tcPr>
+            <w:tcW w:type="dxa" w:w="1260"/>
+            <w:vAlign w:val="center"/>
+            <w:shd w:fill="D9E2F3"/>
+          </w:tcPr>
+          <w:p>
+            <w:pPr>
+              <w:spacing w:before="0" w:after="0" w:line="240" w:lineRule="auto"/>
+              <w:jc w:val="center"/>
+            </w:pPr>
+            <w:r/>
+            <w:r>
+              <w:rPr>
+                <w:rFonts w:ascii="Times New Roman" w:hAnsi="Times New Roman" w:eastAsia="Times New Roman"/>
+                <w:b/>
+                <w:i w:val="0"/>
+                <w:color w:val="000000"/>
+                <w:sz w:val="17"/>
+              </w:rPr>
+              <w:t>DR F1</w:t>
+            </w:r>
+          </w:p>
+        </w:tc>
+        <w:tc>
+          <w:tcPr>
+            <w:tcW w:type="dxa" w:w="1260"/>
+            <w:vAlign w:val="center"/>
+            <w:shd w:fill="D9E2F3"/>
+          </w:tcPr>
+          <w:p>
+            <w:pPr>
+              <w:spacing w:before="0" w:after="0" w:line="240" w:lineRule="auto"/>
+              <w:jc w:val="center"/>
+            </w:pPr>
+            <w:r/>
+            <w:r>
+              <w:rPr>
+                <w:rFonts w:ascii="Times New Roman" w:hAnsi="Times New Roman" w:eastAsia="Times New Roman"/>
+                <w:b/>
+                <w:i w:val="0"/>
+                <w:color w:val="000000"/>
+                <w:sz w:val="17"/>
+              </w:rPr>
+              <w:t>Δ from B1</w:t>
+            </w:r>
+          </w:p>
+        </w:tc>
+        <w:tc>
+          <w:tcPr>
+            <w:tcW w:type="dxa" w:w="1260"/>
+            <w:vAlign w:val="center"/>
+            <w:shd w:fill="D9E2F3"/>
+          </w:tcPr>
+          <w:p>
+            <w:pPr>
+              <w:spacing w:before="0" w:after="0" w:line="240" w:lineRule="auto"/>
+              <w:jc w:val="center"/>
+            </w:pPr>
+            <w:r/>
+            <w:r>
+              <w:rPr>
+                <w:rFonts w:ascii="Times New Roman" w:hAnsi="Times New Roman" w:eastAsia="Times New Roman"/>
+                <w:b/>
+                <w:i w:val="0"/>
+                <w:color w:val="000000"/>
+                <w:sz w:val="17"/>
+              </w:rPr>
+              <w:t>DR AUROC</w:t>
+            </w:r>
+          </w:p>
+        </w:tc>
+        <w:tc>
+          <w:tcPr>
+            <w:tcW w:type="dxa" w:w="1260"/>
+            <w:vAlign w:val="center"/>
+            <w:shd w:fill="D9E2F3"/>
+          </w:tcPr>
+          <w:p>
+            <w:pPr>
+              <w:spacing w:before="0" w:after="0" w:line="240" w:lineRule="auto"/>
+              <w:jc w:val="center"/>
+            </w:pPr>
+            <w:r/>
+            <w:r>
+              <w:rPr>
+                <w:rFonts w:ascii="Times New Roman" w:hAnsi="Times New Roman" w:eastAsia="Times New Roman"/>
+                <w:b/>
+                <w:i w:val="0"/>
+                <w:color w:val="000000"/>
+                <w:sz w:val="17"/>
+              </w:rPr>
+              <w:t>ME F1</w:t>
+            </w:r>
+          </w:p>
+        </w:tc>
+        <w:tc>
+          <w:tcPr>
+            <w:tcW w:type="dxa" w:w="1260"/>
+            <w:vAlign w:val="center"/>
+            <w:shd w:fill="D9E2F3"/>
+          </w:tcPr>
+          <w:p>
+            <w:pPr>
+              <w:spacing w:before="0" w:after="0" w:line="240" w:lineRule="auto"/>
+              <w:jc w:val="center"/>
+            </w:pPr>
+            <w:r/>
+            <w:r>
+              <w:rPr>
+                <w:rFonts w:ascii="Times New Roman" w:hAnsi="Times New Roman" w:eastAsia="Times New Roman"/>
+                <w:b/>
+                <w:i w:val="0"/>
+                <w:color w:val="000000"/>
+                <w:sz w:val="17"/>
+              </w:rPr>
+              <w:t>Δ from B1</w:t>
+            </w:r>
+          </w:p>
+        </w:tc>
+        <w:tc>
+          <w:tcPr>
+            <w:tcW w:type="dxa" w:w="1260"/>
+            <w:vAlign w:val="center"/>
+            <w:shd w:fill="D9E2F3"/>
+          </w:tcPr>
+          <w:p>
+            <w:pPr>
+              <w:spacing w:before="0" w:after="0" w:line="240" w:lineRule="auto"/>
+              <w:jc w:val="center"/>
+            </w:pPr>
+            <w:r/>
+            <w:r>
+              <w:rPr>
+                <w:rFonts w:ascii="Times New Roman" w:hAnsi="Times New Roman" w:eastAsia="Times New Roman"/>
+                <w:b/>
+                <w:i w:val="0"/>
+                <w:color w:val="000000"/>
+                <w:sz w:val="17"/>
+              </w:rPr>
+              <w:t>ME AUROC</w:t>
+            </w:r>
+          </w:p>
+        </w:tc>
+        <w:tc>
+          <w:tcPr>
+            <w:tcW w:type="dxa" w:w="1260"/>
+            <w:vAlign w:val="center"/>
+            <w:shd w:fill="D9E2F3"/>
+          </w:tcPr>
+          <w:p>
+            <w:pPr>
+              <w:spacing w:before="0" w:after="0" w:line="240" w:lineRule="auto"/>
+              <w:jc w:val="center"/>
+            </w:pPr>
+            <w:r/>
+            <w:r>
+              <w:rPr>
+                <w:rFonts w:ascii="Times New Roman" w:hAnsi="Times New Roman" w:eastAsia="Times New Roman"/>
+                <w:b/>
+                <w:i w:val="0"/>
+                <w:color w:val="000000"/>
+                <w:sz w:val="17"/>
+              </w:rPr>
+              <w:t>Replicate?</w:t>
+            </w:r>
+          </w:p>
+        </w:tc>
+      </w:tr>
+      <w:tr>
+        <w:tc>
+          <w:tcPr>
+            <w:tcW w:type="dxa" w:w="1260"/>
+            <w:vAlign w:val="center"/>
+          </w:tcPr>
+          <w:p>
+            <w:pPr>
+              <w:spacing w:before="0" w:after="0" w:line="240" w:lineRule="auto"/>
+              <w:jc w:val="left"/>
+            </w:pPr>
+            <w:r/>
+            <w:r>
+              <w:rPr>
+                <w:rFonts w:ascii="Times New Roman" w:hAnsi="Times New Roman" w:eastAsia="Times New Roman"/>
+                <w:b w:val="0"/>
+                <w:i w:val="0"/>
+                <w:color w:val="000000"/>
+                <w:sz w:val="17"/>
+              </w:rPr>
+              <w:t>B1</w:t>
+            </w:r>
+          </w:p>
+        </w:tc>
+        <w:tc>
+          <w:tcPr>
+            <w:tcW w:type="dxa" w:w="1260"/>
+            <w:vAlign w:val="center"/>
+          </w:tcPr>
+          <w:p>
+            <w:pPr>
+              <w:spacing w:before="0" w:after="0" w:line="240" w:lineRule="auto"/>
+              <w:jc w:val="center"/>
+            </w:pPr>
+            <w:r/>
+            <w:r>
+              <w:rPr>
+                <w:rFonts w:ascii="Times New Roman" w:hAnsi="Times New Roman" w:eastAsia="Times New Roman"/>
+                <w:b w:val="0"/>
+                <w:i w:val="0"/>
+                <w:color w:val="000000"/>
+                <w:sz w:val="17"/>
+              </w:rPr>
+              <w:t>0.8703</w:t>
+            </w:r>
+          </w:p>
+        </w:tc>
+        <w:tc>
+          <w:tcPr>
+            <w:tcW w:type="dxa" w:w="1260"/>
+            <w:vAlign w:val="center"/>
+          </w:tcPr>
+          <w:p>
+            <w:pPr>
+              <w:spacing w:before="0" w:after="0" w:line="240" w:lineRule="auto"/>
+              <w:jc w:val="center"/>
+            </w:pPr>
+            <w:r/>
+            <w:r>
+              <w:rPr>
+                <w:rFonts w:ascii="Times New Roman" w:hAnsi="Times New Roman" w:eastAsia="Times New Roman"/>
+                <w:b w:val="0"/>
+                <w:i w:val="0"/>
+                <w:color w:val="000000"/>
+                <w:sz w:val="17"/>
+              </w:rPr>
+              <w:t>—</w:t>
+            </w:r>
+          </w:p>
+        </w:tc>
+        <w:tc>
+          <w:tcPr>
+            <w:tcW w:type="dxa" w:w="1260"/>
+            <w:vAlign w:val="center"/>
+          </w:tcPr>
+          <w:p>
+            <w:pPr>
+              <w:spacing w:before="0" w:after="0" w:line="240" w:lineRule="auto"/>
+              <w:jc w:val="center"/>
+            </w:pPr>
+            <w:r/>
+            <w:r>
+              <w:rPr>
+                <w:rFonts w:ascii="Times New Roman" w:hAnsi="Times New Roman" w:eastAsia="Times New Roman"/>
+                <w:b w:val="0"/>
+                <w:i w:val="0"/>
+                <w:color w:val="000000"/>
+                <w:sz w:val="17"/>
+              </w:rPr>
+              <w:t>0.9563</w:t>
+            </w:r>
+          </w:p>
+        </w:tc>
+        <w:tc>
+          <w:tcPr>
+            <w:tcW w:type="dxa" w:w="1260"/>
+            <w:vAlign w:val="center"/>
+          </w:tcPr>
+          <w:p>
+            <w:pPr>
+              <w:spacing w:before="0" w:after="0" w:line="240" w:lineRule="auto"/>
+              <w:jc w:val="center"/>
+            </w:pPr>
+            <w:r/>
+            <w:r>
+              <w:rPr>
+                <w:rFonts w:ascii="Times New Roman" w:hAnsi="Times New Roman" w:eastAsia="Times New Roman"/>
+                <w:b w:val="0"/>
+                <w:i w:val="0"/>
+                <w:color w:val="000000"/>
+                <w:sz w:val="17"/>
+              </w:rPr>
+              <w:t>0.8489</w:t>
+            </w:r>
+          </w:p>
+        </w:tc>
+        <w:tc>
+          <w:tcPr>
+            <w:tcW w:type="dxa" w:w="1260"/>
+            <w:vAlign w:val="center"/>
+          </w:tcPr>
+          <w:p>
+            <w:pPr>
+              <w:spacing w:before="0" w:after="0" w:line="240" w:lineRule="auto"/>
+              <w:jc w:val="center"/>
+            </w:pPr>
+            <w:r/>
+            <w:r>
+              <w:rPr>
+                <w:rFonts w:ascii="Times New Roman" w:hAnsi="Times New Roman" w:eastAsia="Times New Roman"/>
+                <w:b w:val="0"/>
+                <w:i w:val="0"/>
+                <w:color w:val="000000"/>
+                <w:sz w:val="17"/>
+              </w:rPr>
+              <w:t>—</w:t>
+            </w:r>
+          </w:p>
+        </w:tc>
+        <w:tc>
+          <w:tcPr>
+            <w:tcW w:type="dxa" w:w="1260"/>
+            <w:vAlign w:val="center"/>
+          </w:tcPr>
+          <w:p>
+            <w:pPr>
+              <w:spacing w:before="0" w:after="0" w:line="240" w:lineRule="auto"/>
+              <w:jc w:val="center"/>
+            </w:pPr>
+            <w:r/>
+            <w:r>
+              <w:rPr>
+                <w:rFonts w:ascii="Times New Roman" w:hAnsi="Times New Roman" w:eastAsia="Times New Roman"/>
+                <w:b w:val="0"/>
+                <w:i w:val="0"/>
+                <w:color w:val="000000"/>
+                <w:sz w:val="17"/>
+              </w:rPr>
+              <w:t>0.9904</w:t>
+            </w:r>
+          </w:p>
+        </w:tc>
+        <w:tc>
+          <w:tcPr>
+            <w:tcW w:type="dxa" w:w="1260"/>
+            <w:vAlign w:val="center"/>
+          </w:tcPr>
+          <w:p>
+            <w:pPr>
+              <w:spacing w:before="0" w:after="0" w:line="240" w:lineRule="auto"/>
+              <w:jc w:val="center"/>
+            </w:pPr>
+            <w:r/>
+            <w:r>
+              <w:rPr>
+                <w:rFonts w:ascii="Times New Roman" w:hAnsi="Times New Roman" w:eastAsia="Times New Roman"/>
+                <w:b w:val="0"/>
+                <w:i w:val="0"/>
+                <w:color w:val="000000"/>
+                <w:sz w:val="17"/>
+              </w:rPr>
+              <w:t>Reference</w:t>
+            </w:r>
+          </w:p>
+        </w:tc>
+      </w:tr>
+      <w:tr>
+        <w:tc>
+          <w:tcPr>
+            <w:tcW w:type="dxa" w:w="1260"/>
+            <w:vAlign w:val="center"/>
+            <w:shd w:fill="F3F5F7"/>
+          </w:tcPr>
+          <w:p>
+            <w:pPr>
+              <w:spacing w:before="0" w:after="0" w:line="240" w:lineRule="auto"/>
+              <w:jc w:val="left"/>
+            </w:pPr>
+            <w:r/>
+            <w:r>
+              <w:rPr>
+                <w:rFonts w:ascii="Times New Roman" w:hAnsi="Times New Roman" w:eastAsia="Times New Roman"/>
+                <w:b w:val="0"/>
+                <w:i w:val="0"/>
+                <w:color w:val="000000"/>
+                <w:sz w:val="17"/>
+              </w:rPr>
+              <w:t>A1</w:t>
+            </w:r>
+          </w:p>
+        </w:tc>
+        <w:tc>
+          <w:tcPr>
+            <w:tcW w:type="dxa" w:w="1260"/>
+            <w:vAlign w:val="center"/>
+            <w:shd w:fill="F3F5F7"/>
+          </w:tcPr>
+          <w:p>
+            <w:pPr>
+              <w:spacing w:before="0" w:after="0" w:line="240" w:lineRule="auto"/>
+              <w:jc w:val="center"/>
+            </w:pPr>
+            <w:r/>
+            <w:r>
+              <w:rPr>
+                <w:rFonts w:ascii="Times New Roman" w:hAnsi="Times New Roman" w:eastAsia="Times New Roman"/>
+                <w:b w:val="0"/>
+                <w:i w:val="0"/>
+                <w:color w:val="000000"/>
+                <w:sz w:val="17"/>
+              </w:rPr>
+              <w:t>0.8772</w:t>
+            </w:r>
+          </w:p>
+        </w:tc>
+        <w:tc>
+          <w:tcPr>
+            <w:tcW w:type="dxa" w:w="1260"/>
+            <w:vAlign w:val="center"/>
+            <w:shd w:fill="F3F5F7"/>
+          </w:tcPr>
+          <w:p>
+            <w:pPr>
+              <w:spacing w:before="0" w:after="0" w:line="240" w:lineRule="auto"/>
+              <w:jc w:val="center"/>
+            </w:pPr>
+            <w:r/>
+            <w:r>
+              <w:rPr>
+                <w:rFonts w:ascii="Times New Roman" w:hAnsi="Times New Roman" w:eastAsia="Times New Roman"/>
+                <w:b w:val="0"/>
+                <w:i w:val="0"/>
+                <w:color w:val="000000"/>
+                <w:sz w:val="17"/>
+              </w:rPr>
+              <w:t>+0.0069</w:t>
+            </w:r>
+          </w:p>
+        </w:tc>
+        <w:tc>
+          <w:tcPr>
+            <w:tcW w:type="dxa" w:w="1260"/>
+            <w:vAlign w:val="center"/>
+            <w:shd w:fill="F3F5F7"/>
+          </w:tcPr>
+          <w:p>
+            <w:pPr>
+              <w:spacing w:before="0" w:after="0" w:line="240" w:lineRule="auto"/>
+              <w:jc w:val="center"/>
+            </w:pPr>
+            <w:r/>
+            <w:r>
+              <w:rPr>
+                <w:rFonts w:ascii="Times New Roman" w:hAnsi="Times New Roman" w:eastAsia="Times New Roman"/>
+                <w:b w:val="0"/>
+                <w:i w:val="0"/>
+                <w:color w:val="000000"/>
+                <w:sz w:val="17"/>
+              </w:rPr>
+              <w:t>0.9530</w:t>
+            </w:r>
+          </w:p>
+        </w:tc>
+        <w:tc>
+          <w:tcPr>
+            <w:tcW w:type="dxa" w:w="1260"/>
+            <w:vAlign w:val="center"/>
+            <w:shd w:fill="F3F5F7"/>
+          </w:tcPr>
+          <w:p>
+            <w:pPr>
+              <w:spacing w:before="0" w:after="0" w:line="240" w:lineRule="auto"/>
+              <w:jc w:val="center"/>
+            </w:pPr>
+            <w:r/>
+            <w:r>
+              <w:rPr>
+                <w:rFonts w:ascii="Times New Roman" w:hAnsi="Times New Roman" w:eastAsia="Times New Roman"/>
+                <w:b w:val="0"/>
+                <w:i w:val="0"/>
+                <w:color w:val="000000"/>
+                <w:sz w:val="17"/>
+              </w:rPr>
+              <w:t>0.8462</w:t>
+            </w:r>
+          </w:p>
+        </w:tc>
+        <w:tc>
+          <w:tcPr>
+            <w:tcW w:type="dxa" w:w="1260"/>
+            <w:vAlign w:val="center"/>
+            <w:shd w:fill="F3F5F7"/>
+          </w:tcPr>
+          <w:p>
+            <w:pPr>
+              <w:spacing w:before="0" w:after="0" w:line="240" w:lineRule="auto"/>
+              <w:jc w:val="center"/>
+            </w:pPr>
+            <w:r/>
+            <w:r>
+              <w:rPr>
+                <w:rFonts w:ascii="Times New Roman" w:hAnsi="Times New Roman" w:eastAsia="Times New Roman"/>
+                <w:b w:val="0"/>
+                <w:i w:val="0"/>
+                <w:color w:val="000000"/>
+                <w:sz w:val="17"/>
+              </w:rPr>
+              <w:t>-0.0028</w:t>
+            </w:r>
+          </w:p>
+        </w:tc>
+        <w:tc>
+          <w:tcPr>
+            <w:tcW w:type="dxa" w:w="1260"/>
+            <w:vAlign w:val="center"/>
+            <w:shd w:fill="F3F5F7"/>
+          </w:tcPr>
+          <w:p>
+            <w:pPr>
+              <w:spacing w:before="0" w:after="0" w:line="240" w:lineRule="auto"/>
+              <w:jc w:val="center"/>
+            </w:pPr>
+            <w:r/>
+            <w:r>
+              <w:rPr>
+                <w:rFonts w:ascii="Times New Roman" w:hAnsi="Times New Roman" w:eastAsia="Times New Roman"/>
+                <w:b w:val="0"/>
+                <w:i w:val="0"/>
+                <w:color w:val="000000"/>
+                <w:sz w:val="17"/>
+              </w:rPr>
+              <w:t>0.9904</w:t>
+            </w:r>
+          </w:p>
+        </w:tc>
+        <w:tc>
+          <w:tcPr>
+            <w:tcW w:type="dxa" w:w="1260"/>
+            <w:vAlign w:val="center"/>
+            <w:shd w:fill="F3F5F7"/>
+          </w:tcPr>
+          <w:p>
+            <w:pPr>
+              <w:spacing w:before="0" w:after="0" w:line="240" w:lineRule="auto"/>
+              <w:jc w:val="center"/>
+            </w:pPr>
+            <w:r/>
+            <w:r>
+              <w:rPr>
+                <w:rFonts w:ascii="Times New Roman" w:hAnsi="Times New Roman" w:eastAsia="Times New Roman"/>
+                <w:b w:val="0"/>
+                <w:i w:val="0"/>
+                <w:color w:val="000000"/>
+                <w:sz w:val="17"/>
+              </w:rPr>
+              <w:t>No</w:t>
+            </w:r>
+          </w:p>
+        </w:tc>
+      </w:tr>
+      <w:tr>
+        <w:tc>
+          <w:tcPr>
+            <w:tcW w:type="dxa" w:w="1260"/>
+            <w:vAlign w:val="center"/>
+          </w:tcPr>
+          <w:p>
+            <w:pPr>
+              <w:spacing w:before="0" w:after="0" w:line="240" w:lineRule="auto"/>
+              <w:jc w:val="left"/>
+            </w:pPr>
+            <w:r/>
+            <w:r>
+              <w:rPr>
+                <w:rFonts w:ascii="Times New Roman" w:hAnsi="Times New Roman" w:eastAsia="Times New Roman"/>
+                <w:b w:val="0"/>
+                <w:i w:val="0"/>
+                <w:color w:val="000000"/>
+                <w:sz w:val="17"/>
+              </w:rPr>
+              <w:t>A2</w:t>
+            </w:r>
+          </w:p>
+        </w:tc>
+        <w:tc>
+          <w:tcPr>
+            <w:tcW w:type="dxa" w:w="1260"/>
+            <w:vAlign w:val="center"/>
+          </w:tcPr>
+          <w:p>
+            <w:pPr>
+              <w:spacing w:before="0" w:after="0" w:line="240" w:lineRule="auto"/>
+              <w:jc w:val="center"/>
+            </w:pPr>
+            <w:r/>
+            <w:r>
+              <w:rPr>
+                <w:rFonts w:ascii="Times New Roman" w:hAnsi="Times New Roman" w:eastAsia="Times New Roman"/>
+                <w:b w:val="0"/>
+                <w:i w:val="0"/>
+                <w:color w:val="000000"/>
+                <w:sz w:val="17"/>
+              </w:rPr>
+              <w:t>0.8739</w:t>
+            </w:r>
+          </w:p>
+        </w:tc>
+        <w:tc>
+          <w:tcPr>
+            <w:tcW w:type="dxa" w:w="1260"/>
+            <w:vAlign w:val="center"/>
+          </w:tcPr>
+          <w:p>
+            <w:pPr>
+              <w:spacing w:before="0" w:after="0" w:line="240" w:lineRule="auto"/>
+              <w:jc w:val="center"/>
+            </w:pPr>
+            <w:r/>
+            <w:r>
+              <w:rPr>
+                <w:rFonts w:ascii="Times New Roman" w:hAnsi="Times New Roman" w:eastAsia="Times New Roman"/>
+                <w:b w:val="0"/>
+                <w:i w:val="0"/>
+                <w:color w:val="000000"/>
+                <w:sz w:val="17"/>
+              </w:rPr>
+              <w:t>+0.0036</w:t>
+            </w:r>
+          </w:p>
+        </w:tc>
+        <w:tc>
+          <w:tcPr>
+            <w:tcW w:type="dxa" w:w="1260"/>
+            <w:vAlign w:val="center"/>
+          </w:tcPr>
+          <w:p>
+            <w:pPr>
+              <w:spacing w:before="0" w:after="0" w:line="240" w:lineRule="auto"/>
+              <w:jc w:val="center"/>
+            </w:pPr>
+            <w:r/>
+            <w:r>
+              <w:rPr>
+                <w:rFonts w:ascii="Times New Roman" w:hAnsi="Times New Roman" w:eastAsia="Times New Roman"/>
+                <w:b w:val="0"/>
+                <w:i w:val="0"/>
+                <w:color w:val="000000"/>
+                <w:sz w:val="17"/>
+              </w:rPr>
+              <w:t>0.9558</w:t>
+            </w:r>
+          </w:p>
+        </w:tc>
+        <w:tc>
+          <w:tcPr>
+            <w:tcW w:type="dxa" w:w="1260"/>
+            <w:vAlign w:val="center"/>
+          </w:tcPr>
+          <w:p>
+            <w:pPr>
+              <w:spacing w:before="0" w:after="0" w:line="240" w:lineRule="auto"/>
+              <w:jc w:val="center"/>
+            </w:pPr>
+            <w:r/>
+            <w:r>
+              <w:rPr>
+                <w:rFonts w:ascii="Times New Roman" w:hAnsi="Times New Roman" w:eastAsia="Times New Roman"/>
+                <w:b w:val="0"/>
+                <w:i w:val="0"/>
+                <w:color w:val="000000"/>
+                <w:sz w:val="17"/>
+              </w:rPr>
+              <w:t>0.8485</w:t>
+            </w:r>
+          </w:p>
+        </w:tc>
+        <w:tc>
+          <w:tcPr>
+            <w:tcW w:type="dxa" w:w="1260"/>
+            <w:vAlign w:val="center"/>
+          </w:tcPr>
+          <w:p>
+            <w:pPr>
+              <w:spacing w:before="0" w:after="0" w:line="240" w:lineRule="auto"/>
+              <w:jc w:val="center"/>
+            </w:pPr>
+            <w:r/>
+            <w:r>
+              <w:rPr>
+                <w:rFonts w:ascii="Times New Roman" w:hAnsi="Times New Roman" w:eastAsia="Times New Roman"/>
+                <w:b w:val="0"/>
+                <w:i w:val="0"/>
+                <w:color w:val="000000"/>
+                <w:sz w:val="17"/>
+              </w:rPr>
+              <w:t>-0.0004</w:t>
+            </w:r>
+          </w:p>
+        </w:tc>
+        <w:tc>
+          <w:tcPr>
+            <w:tcW w:type="dxa" w:w="1260"/>
+            <w:vAlign w:val="center"/>
+          </w:tcPr>
+          <w:p>
+            <w:pPr>
+              <w:spacing w:before="0" w:after="0" w:line="240" w:lineRule="auto"/>
+              <w:jc w:val="center"/>
+            </w:pPr>
+            <w:r/>
+            <w:r>
+              <w:rPr>
+                <w:rFonts w:ascii="Times New Roman" w:hAnsi="Times New Roman" w:eastAsia="Times New Roman"/>
+                <w:b w:val="0"/>
+                <w:i w:val="0"/>
+                <w:color w:val="000000"/>
+                <w:sz w:val="17"/>
+              </w:rPr>
+              <w:t>0.9906</w:t>
+            </w:r>
+          </w:p>
+        </w:tc>
+        <w:tc>
+          <w:tcPr>
+            <w:tcW w:type="dxa" w:w="1260"/>
+            <w:vAlign w:val="center"/>
+          </w:tcPr>
+          <w:p>
+            <w:pPr>
+              <w:spacing w:before="0" w:after="0" w:line="240" w:lineRule="auto"/>
+              <w:jc w:val="center"/>
+            </w:pPr>
+            <w:r/>
+            <w:r>
+              <w:rPr>
+                <w:rFonts w:ascii="Times New Roman" w:hAnsi="Times New Roman" w:eastAsia="Times New Roman"/>
+                <w:b w:val="0"/>
+                <w:i w:val="0"/>
+                <w:color w:val="000000"/>
+                <w:sz w:val="17"/>
+              </w:rPr>
+              <w:t>No</w:t>
+            </w:r>
+          </w:p>
+        </w:tc>
+      </w:tr>
+      <w:tr>
+        <w:tc>
+          <w:tcPr>
+            <w:tcW w:type="dxa" w:w="1260"/>
+            <w:vAlign w:val="center"/>
+            <w:shd w:fill="F3F5F7"/>
+          </w:tcPr>
+          <w:p>
+            <w:pPr>
+              <w:spacing w:before="0" w:after="0" w:line="240" w:lineRule="auto"/>
+              <w:jc w:val="left"/>
+            </w:pPr>
+            <w:r/>
+            <w:r>
+              <w:rPr>
+                <w:rFonts w:ascii="Times New Roman" w:hAnsi="Times New Roman" w:eastAsia="Times New Roman"/>
+                <w:b w:val="0"/>
+                <w:i w:val="0"/>
+                <w:color w:val="000000"/>
+                <w:sz w:val="17"/>
+              </w:rPr>
+              <w:t>A3</w:t>
+            </w:r>
+          </w:p>
+        </w:tc>
+        <w:tc>
+          <w:tcPr>
+            <w:tcW w:type="dxa" w:w="1260"/>
+            <w:vAlign w:val="center"/>
+            <w:shd w:fill="F3F5F7"/>
+          </w:tcPr>
+          <w:p>
+            <w:pPr>
+              <w:spacing w:before="0" w:after="0" w:line="240" w:lineRule="auto"/>
+              <w:jc w:val="center"/>
+            </w:pPr>
+            <w:r/>
+            <w:r>
+              <w:rPr>
+                <w:rFonts w:ascii="Times New Roman" w:hAnsi="Times New Roman" w:eastAsia="Times New Roman"/>
+                <w:b w:val="0"/>
+                <w:i w:val="0"/>
+                <w:color w:val="000000"/>
+                <w:sz w:val="17"/>
+              </w:rPr>
+              <w:t>0.8765</w:t>
+            </w:r>
+          </w:p>
+        </w:tc>
+        <w:tc>
+          <w:tcPr>
+            <w:tcW w:type="dxa" w:w="1260"/>
+            <w:vAlign w:val="center"/>
+            <w:shd w:fill="F3F5F7"/>
+          </w:tcPr>
+          <w:p>
+            <w:pPr>
+              <w:spacing w:before="0" w:after="0" w:line="240" w:lineRule="auto"/>
+              <w:jc w:val="center"/>
+            </w:pPr>
+            <w:r/>
+            <w:r>
+              <w:rPr>
+                <w:rFonts w:ascii="Times New Roman" w:hAnsi="Times New Roman" w:eastAsia="Times New Roman"/>
+                <w:b w:val="0"/>
+                <w:i w:val="0"/>
+                <w:color w:val="000000"/>
+                <w:sz w:val="17"/>
+              </w:rPr>
+              <w:t>+0.0062</w:t>
+            </w:r>
+          </w:p>
+        </w:tc>
+        <w:tc>
+          <w:tcPr>
+            <w:tcW w:type="dxa" w:w="1260"/>
+            <w:vAlign w:val="center"/>
+            <w:shd w:fill="F3F5F7"/>
+          </w:tcPr>
+          <w:p>
+            <w:pPr>
+              <w:spacing w:before="0" w:after="0" w:line="240" w:lineRule="auto"/>
+              <w:jc w:val="center"/>
+            </w:pPr>
+            <w:r/>
+            <w:r>
+              <w:rPr>
+                <w:rFonts w:ascii="Times New Roman" w:hAnsi="Times New Roman" w:eastAsia="Times New Roman"/>
+                <w:b w:val="0"/>
+                <w:i w:val="0"/>
+                <w:color w:val="000000"/>
+                <w:sz w:val="17"/>
+              </w:rPr>
+              <w:t>0.9601</w:t>
+            </w:r>
+          </w:p>
+        </w:tc>
+        <w:tc>
+          <w:tcPr>
+            <w:tcW w:type="dxa" w:w="1260"/>
+            <w:vAlign w:val="center"/>
+            <w:shd w:fill="F3F5F7"/>
+          </w:tcPr>
+          <w:p>
+            <w:pPr>
+              <w:spacing w:before="0" w:after="0" w:line="240" w:lineRule="auto"/>
+              <w:jc w:val="center"/>
+            </w:pPr>
+            <w:r/>
+            <w:r>
+              <w:rPr>
+                <w:rFonts w:ascii="Times New Roman" w:hAnsi="Times New Roman" w:eastAsia="Times New Roman"/>
+                <w:b w:val="0"/>
+                <w:i w:val="0"/>
+                <w:color w:val="000000"/>
+                <w:sz w:val="17"/>
+              </w:rPr>
+              <w:t>0.8485</w:t>
+            </w:r>
+          </w:p>
+        </w:tc>
+        <w:tc>
+          <w:tcPr>
+            <w:tcW w:type="dxa" w:w="1260"/>
+            <w:vAlign w:val="center"/>
+            <w:shd w:fill="F3F5F7"/>
+          </w:tcPr>
+          <w:p>
+            <w:pPr>
+              <w:spacing w:before="0" w:after="0" w:line="240" w:lineRule="auto"/>
+              <w:jc w:val="center"/>
+            </w:pPr>
+            <w:r/>
+            <w:r>
+              <w:rPr>
+                <w:rFonts w:ascii="Times New Roman" w:hAnsi="Times New Roman" w:eastAsia="Times New Roman"/>
+                <w:b w:val="0"/>
+                <w:i w:val="0"/>
+                <w:color w:val="000000"/>
+                <w:sz w:val="17"/>
+              </w:rPr>
+              <w:t>-0.0004</w:t>
+            </w:r>
+          </w:p>
+        </w:tc>
+        <w:tc>
+          <w:tcPr>
+            <w:tcW w:type="dxa" w:w="1260"/>
+            <w:vAlign w:val="center"/>
+            <w:shd w:fill="F3F5F7"/>
+          </w:tcPr>
+          <w:p>
+            <w:pPr>
+              <w:spacing w:before="0" w:after="0" w:line="240" w:lineRule="auto"/>
+              <w:jc w:val="center"/>
+            </w:pPr>
+            <w:r/>
+            <w:r>
+              <w:rPr>
+                <w:rFonts w:ascii="Times New Roman" w:hAnsi="Times New Roman" w:eastAsia="Times New Roman"/>
+                <w:b w:val="0"/>
+                <w:i w:val="0"/>
+                <w:color w:val="000000"/>
+                <w:sz w:val="17"/>
+              </w:rPr>
+              <w:t>0.9903</w:t>
+            </w:r>
+          </w:p>
+        </w:tc>
+        <w:tc>
+          <w:tcPr>
+            <w:tcW w:type="dxa" w:w="1260"/>
+            <w:vAlign w:val="center"/>
+            <w:shd w:fill="F3F5F7"/>
+          </w:tcPr>
+          <w:p>
+            <w:pPr>
+              <w:spacing w:before="0" w:after="0" w:line="240" w:lineRule="auto"/>
+              <w:jc w:val="center"/>
+            </w:pPr>
+            <w:r/>
+            <w:r>
+              <w:rPr>
+                <w:rFonts w:ascii="Times New Roman" w:hAnsi="Times New Roman" w:eastAsia="Times New Roman"/>
+                <w:b w:val="0"/>
+                <w:i w:val="0"/>
+                <w:color w:val="000000"/>
+                <w:sz w:val="17"/>
+              </w:rPr>
+              <w:t>No</w:t>
+            </w:r>
+          </w:p>
+        </w:tc>
+      </w:tr>
+    </w:tbl>
+    <w:p>
+      <w:pPr>
+        <w:spacing w:after="20"/>
+      </w:pPr>
+    </w:p>
+    <w:p>
+      <w:pPr>
+        <w:spacing w:before="0" w:after="80" w:line="240" w:lineRule="auto"/>
+        <w:jc w:val="both"/>
+      </w:pPr>
+      <w:r>
+        <w:rPr>
+          <w:rFonts w:ascii="Times New Roman" w:hAnsi="Times New Roman" w:eastAsia="Times New Roman"/>
+          <w:b/>
+          <w:i w:val="0"/>
+          <w:color w:val="000000"/>
+          <w:sz w:val="20"/>
+        </w:rPr>
+        <w:t>Step-4 seed-0 decision:</w:t>
+      </w:r>
+      <w:r>
+        <w:rPr>
+          <w:rFonts w:ascii="Times New Roman" w:hAnsi="Times New Roman" w:eastAsia="Times New Roman"/>
+          <w:b w:val="0"/>
+          <w:i w:val="0"/>
+          <w:color w:val="000000"/>
+          <w:sz w:val="20"/>
+        </w:rPr>
+        <w:t xml:space="preserve"> no arm passed the frozen replication gate. Each DR F1 change was positive but below +0.01, while ME was essentially flat or slightly lower. A3 improved DR AUROC by +0.0038, but this single-seed signal is insufficient for a gain claim. No Step-4 test assessment is included.</w:t>
+      </w:r>
+    </w:p>
     <w:p>
       <w:pPr>
         <w:spacing w:before="160" w:after="60" w:line="240" w:lineRule="auto"/>
@@ -7056,7 +8059,7 @@
           <w:color w:val="000000"/>
           <w:sz w:val="20"/>
         </w:rPr>
-        <w:t xml:space="preserve"> same-configuration comparisons, class prevalence, sampling controls and qualitative degradation examples are addressed. Diagnostic-preservation validation, the classifier effect of fitted degradation and a fair longer-budget routing revisit remain open. The transcript also contains a user-owned request to disclose this external collaboration to the new employer; completion has not been documented.</w:t>
+        <w:t xml:space="preserve"> same-configuration comparisons, class prevalence, sampling controls, qualitative degradation examples and the seed-0 classifier screen are addressed. The fitted transform did not pass the replication gate. Diagnostic-preservation validation and a fair longer-budget routing or latent-transition study remain open. The transcript also contains a user-owned request to disclose this external collaboration to the new employer; completion has not been documented.</w:t>
       </w:r>
     </w:p>
     <w:p>
@@ -7087,7 +8090,7 @@
           <w:color w:val="000000"/>
           <w:sz w:val="20"/>
         </w:rPr>
-        <w:t>•  Freeze Step-4 operators, probabilities, parameter ranges, FIT-only estimation data, compute budget and falsification rule.</w:t>
+        <w:t>•  Preserve A1/A2/A3 as a completed negative validation screen; do not assess them on test or replicate them automatically.</w:t>
       </w:r>
     </w:p>
     <w:p>
@@ -7103,7 +8106,7 @@
           <w:color w:val="000000"/>
           <w:sz w:val="20"/>
         </w:rPr>
-        <w:t>•  Compare ordinary B1 augmentation, an independently implemented release-range FundusAug artifact component and FIT-only fitted degradation on validation.</w:t>
+        <w:t>•  Freeze one new content-preserving mechanism and a matched control before further GPU work.</w:t>
       </w:r>
     </w:p>
     <w:p>
@@ -7119,7 +8122,7 @@
           <w:color w:val="000000"/>
           <w:sz w:val="20"/>
         </w:rPr>
-        <w:t>•  Measure diagnostic preservation; add the preservation constraint only if the fitted transform first shows a promising classifier effect.</w:t>
+        <w:t>•  Choose between a bounded CheXWorld-style latent-transition objective and an explicitly lesion-aware preservation constraint using feasibility and closest-work evidence.</w:t>
       </w:r>
     </w:p>
     <w:p>
@@ -7135,7 +8138,7 @@
           <w:color w:val="000000"/>
           <w:sz w:val="20"/>
         </w:rPr>
-        <w:t>•  Replicate only a promising Step-4 arm and complete the closest-method novelty comparison before writing a contribution claim.</w:t>
+        <w:t>•  Require repeated diagnostic benefit and an isolating ablation before writing a contribution claim.</w:t>
       </w:r>
     </w:p>
     <w:p>
@@ -7151,7 +8154,7 @@
           <w:color w:val="000000"/>
           <w:sz w:val="20"/>
         </w:rPr>
-        <w:t>•  Ask Dong to confirm the exact world-model paper title and venue when he responds; this does not block the controlled Step-4 experiment.</w:t>
+        <w:t>•  Ask Dong to confirm the exact world-model paper title and venue when he responds.</w:t>
       </w:r>
     </w:p>
     <w:p>
@@ -7831,6 +8834,77 @@
                 <w:sz w:val="17"/>
               </w:rPr>
               <w:t>DONG_TRANSCRIPT_AUDIT_2026-09.md; STEP4_WORLD_MODEL_DIRECTION_REVIEW.md</w:t>
+            </w:r>
+          </w:p>
+        </w:tc>
+      </w:tr>
+      <w:tr>
+        <w:tc>
+          <w:tcPr>
+            <w:tcW w:type="dxa" w:w="3360"/>
+            <w:vAlign w:val="center"/>
+          </w:tcPr>
+          <w:p>
+            <w:pPr>
+              <w:spacing w:before="0" w:after="0" w:line="240" w:lineRule="auto"/>
+              <w:jc w:val="left"/>
+            </w:pPr>
+            <w:r/>
+            <w:r>
+              <w:rPr>
+                <w:rFonts w:ascii="Times New Roman" w:hAnsi="Times New Roman" w:eastAsia="Times New Roman"/>
+                <w:b w:val="0"/>
+                <w:i w:val="0"/>
+                <w:color w:val="000000"/>
+                <w:sz w:val="17"/>
+              </w:rPr>
+              <w:t>15 Sep 2026</w:t>
+            </w:r>
+          </w:p>
+        </w:tc>
+        <w:tc>
+          <w:tcPr>
+            <w:tcW w:type="dxa" w:w="3360"/>
+            <w:vAlign w:val="center"/>
+          </w:tcPr>
+          <w:p>
+            <w:pPr>
+              <w:spacing w:before="0" w:after="0" w:line="240" w:lineRule="auto"/>
+              <w:jc w:val="center"/>
+            </w:pPr>
+            <w:r/>
+            <w:r>
+              <w:rPr>
+                <w:rFonts w:ascii="Times New Roman" w:hAnsi="Times New Roman" w:eastAsia="Times New Roman"/>
+                <w:b w:val="0"/>
+                <w:i w:val="0"/>
+                <w:color w:val="000000"/>
+                <w:sz w:val="17"/>
+              </w:rPr>
+              <w:t>Step-4 seed-0 augmentation screen complete; no arm passed replication gate</w:t>
+            </w:r>
+          </w:p>
+        </w:tc>
+        <w:tc>
+          <w:tcPr>
+            <w:tcW w:type="dxa" w:w="3360"/>
+            <w:vAlign w:val="center"/>
+          </w:tcPr>
+          <w:p>
+            <w:pPr>
+              <w:spacing w:before="0" w:after="0" w:line="240" w:lineRule="auto"/>
+              <w:jc w:val="center"/>
+            </w:pPr>
+            <w:r/>
+            <w:r>
+              <w:rPr>
+                <w:rFonts w:ascii="Times New Roman" w:hAnsi="Times New Roman" w:eastAsia="Times New Roman"/>
+                <w:b w:val="0"/>
+                <w:i w:val="0"/>
+                <w:color w:val="000000"/>
+                <w:sz w:val="17"/>
+              </w:rPr>
+              <w:t>seed0_validation_summary.json; SEED0_RESULTS_REVIEW.md</w:t>
             </w:r>
           </w:p>
         </w:tc>

</xml_diff>

<commit_message>
Freeze evidence-led Step 5 mechanism direction
</commit_message>
<xml_diff>
--- a/research/codex/reports/BRSET_mBRSET_Research_Record.docx
+++ b/research/codex/reports/BRSET_mBRSET_Research_Record.docx
@@ -47,7 +47,7 @@
           <w:color w:val="000000"/>
           <w:sz w:val="18"/>
         </w:rPr>
-        <w:t>Updated 15 September 2026 | Current state: Step 4 seed-0 validation screen complete</w:t>
+        <w:t>Updated 15 September 2026 | Current state: Step 5 mechanism direction selected; implementation gates pending</w:t>
       </w:r>
     </w:p>
     <w:p>
@@ -73,7 +73,7 @@
           <w:color w:val="000000"/>
           <w:sz w:val="20"/>
         </w:rPr>
-        <w:t>This record tracks a supervised cross-device study for image-level diabetic retinopathy (DR) and macular edema (ME) classification. The evidence establishes a strong joint BRSET–mBRSET baseline and closes the balance/exposure investigation. The Step-4 seed-0 screen found that target-calibrated source transformations did not pass the frozen replication gate. A novel method has not yet been established. Numerical claims are linked to audited aggregate artifacts, and known limitations are retained rather than removed from later updates.</w:t>
+        <w:t>This record tracks a supervised cross-device study for image-level diabetic retinopathy (DR) and macular edema (ME) classification. The evidence establishes a strong joint BRSET–mBRSET baseline, closes the balance/exposure investigation, and rejects direct target-calibrated appearance augmentation under the frozen Step-4 screen. Step 5 will repair the missing strict source-only baseline, reproduce a published feature-pruning diagnostic, and test an action-conditioned latent-transition hypothesis. A novel method has not yet been established.</w:t>
       </w:r>
     </w:p>
     <w:p>
@@ -130,7 +130,7 @@
           <w:color w:val="000000"/>
           <w:sz w:val="20"/>
         </w:rPr>
-        <w:t xml:space="preserve"> The study has a verified experimental foundation, a repeated joint-training advantage, and a closed balance/exposure analysis. A paper-level novelty claim remains conditional on the preservation-constrained appearance experiments and closest-method evidence.</w:t>
+        <w:t xml:space="preserve"> The study has a verified experimental foundation, a repeated joint-training advantage, and two informative negative mechanism analyses. A paper-level contribution remains conditional on Step-5 controlled validation, replication, and closest-method evidence.</w:t>
       </w:r>
     </w:p>
     <w:p>
@@ -7970,12 +7970,22 @@
       <w:r>
         <w:rPr>
           <w:rFonts w:ascii="Times New Roman" w:hAnsi="Times New Roman" w:eastAsia="Times New Roman"/>
+          <w:b/>
+          <w:i w:val="0"/>
+          <w:color w:val="000000"/>
+          <w:sz w:val="20"/>
+        </w:rPr>
+        <w:t>Selected hypothesis:</w:t>
+      </w:r>
+      <w:r>
+        <w:rPr>
+          <w:rFonts w:ascii="Times New Roman" w:hAnsi="Times New Roman" w:eastAsia="Times New Roman"/>
           <w:b w:val="0"/>
           <w:i w:val="0"/>
           <w:color w:val="000000"/>
           <w:sz w:val="20"/>
         </w:rPr>
-        <w:t>Candidate method: a lightweight target-appearance augmentation fitted on training data, combined with an explicit diagnostic-damage or lesion-preservation constraint. Appearance matching alone is insufficient because transformations can improve global statistics while obscuring lesions.</w:t>
+        <w:t xml:space="preserve"> use the Step-4 overlay-free transform as a measured action rather than as an extra labeled image. Given an original BRSET view, a transformed view, and the sampled blur/color/noise strengths, a small predictor learns to recover the original ConvNeXt feature. A separate loss keeps DR and ME predictions stable. The predictor is discarded at inference.</w:t>
       </w:r>
     </w:p>
     <w:p>
@@ -7986,19 +7996,13 @@
       <w:r>
         <w:rPr>
           <w:rFonts w:ascii="Times New Roman" w:hAnsi="Times New Roman" w:eastAsia="Times New Roman"/>
-          <w:b w:val="0"/>
+          <w:b/>
           <w:i w:val="0"/>
           <w:color w:val="000000"/>
           <w:sz w:val="20"/>
         </w:rPr>
-        <w:t>The novelty claim becomes supportable only if the method is distinct from the closest augmentation, consistency, synthesis and structural-preservation methods; improves over the strongest fair baseline across seeds; survives an ablation that isolates the preservation constraint; and passes a qualified preservation review or a validated lesion-sensitive proxy.</w:t>
+        <w:t>Controls:</w:t>
       </w:r>
-    </w:p>
-    <w:p>
-      <w:pPr>
-        <w:spacing w:before="0" w:after="80" w:line="240" w:lineRule="auto"/>
-        <w:jc w:val="both"/>
-      </w:pPr>
       <w:r>
         <w:rPr>
           <w:rFonts w:ascii="Times New Roman" w:hAnsi="Times New Roman" w:eastAsia="Times New Roman"/>
@@ -8007,7 +8011,7 @@
           <w:color w:val="000000"/>
           <w:sz w:val="20"/>
         </w:rPr>
-        <w:t>Falsification rule: if balance controls explain the apparent gain, or fitted degradation fails to improve validation performance consistently, the mechanism will not be presented as an effective method. The paper direction must then shift to the strongest supported diagnostic finding rather than inventing a positive result.</w:t>
+        <w:t xml:space="preserve"> W1 uses paired feature consistency without the action; W2 adds the action-conditioned transition; W3 adds separate DR/ME prediction preservation. W3 must beat both the natural joint B1 reference and W1, pass the fixed validation gate, and then repeat at seeds 1 and 2 before any test assessment or contribution claim.</w:t>
       </w:r>
     </w:p>
     <w:p>
@@ -8033,7 +8037,7 @@
           <w:color w:val="000000"/>
           <w:sz w:val="20"/>
         </w:rPr>
-        <w:t xml:space="preserve"> CheXWorld (CVPR 2025) is the most plausible reference behind the meeting discussion. It predicts target latent features from transformed context features conditioned on known blur/color parameters. Its official example uses ViT-Base for 300 epochs on eight RTX 4090 GPUs. A smaller fundus latent-transition objective is a conditional Step-5 candidate; full CheXWorld or GenDeg training is not justified before Step 4 validates the acquisition-variation premise.</w:t>
+        <w:t xml:space="preserve"> CheXWorld (CVPR 2025) supports parameter-conditioned latent prediction, while I-JEPA (CVPR 2023) establishes non-generative feature prediction. A full diffusion/pixel generator is deferred because Step 4 shows that target-like appearance does not imply better diagnosis and generated lesions would require substantially stronger preservation evidence.</w:t>
       </w:r>
     </w:p>
     <w:p>
@@ -8049,7 +8053,7 @@
           <w:color w:val="000000"/>
           <w:sz w:val="20"/>
         </w:rPr>
-        <w:t>Advisor coverage:</w:t>
+        <w:t>Closest-work audit:</w:t>
       </w:r>
       <w:r>
         <w:rPr>
@@ -8059,7 +8063,33 @@
           <w:color w:val="000000"/>
           <w:sz w:val="20"/>
         </w:rPr>
-        <w:t xml:space="preserve"> same-configuration comparisons, class prevalence, sampling controls, qualitative degradation examples and the seed-0 classifier screen are addressed. The fitted transform did not pass the replication gate. Diagnostic-preservation validation and a fair longer-budget routing or latent-transition study remain open. The transcript also contains a user-owned request to disclose this external collaboration to the new employer; completion has not been documented.</w:t>
+        <w:t xml:space="preserve"> generic consistency, grade-conditioned augmentation, retinal semantic/domain disentanglement, standardized-color masked modeling and feature pruning are already occupied. CVPR 2026 GFP will be reproduced as a low-cost comparator, not claimed as ours. CheXWorld code has no root license; the method will be independently implemented. The current Samba-linked repository contains an account-takeover warning and will not be executed.</w:t>
+      </w:r>
+    </w:p>
+    <w:p>
+      <w:pPr>
+        <w:spacing w:before="0" w:after="80" w:line="240" w:lineRule="auto"/>
+        <w:jc w:val="both"/>
+      </w:pPr>
+      <w:r>
+        <w:rPr>
+          <w:rFonts w:ascii="Times New Roman" w:hAnsi="Times New Roman" w:eastAsia="Times New Roman"/>
+          <w:b/>
+          <w:i w:val="0"/>
+          <w:color w:val="000000"/>
+          <w:sz w:val="20"/>
+        </w:rPr>
+        <w:t>Terminology boundary:</w:t>
+      </w:r>
+      <w:r>
+        <w:rPr>
+          <w:rFonts w:ascii="Times New Roman" w:hAnsi="Times New Roman" w:eastAsia="Times New Roman"/>
+          <w:b w:val="0"/>
+          <w:i w:val="0"/>
+          <w:color w:val="000000"/>
+          <w:sz w:val="20"/>
+        </w:rPr>
+        <w:t xml:space="preserve"> B1 trains on BRSET and labeled mBRSET training images, so it is supervised joint transfer. A new strict source-only run must train and select on BRSET before assessing mBRSET; only that run quantifies the pure BRSET-to-mBRSET gap.</w:t>
       </w:r>
     </w:p>
     <w:p>
@@ -8106,7 +8136,7 @@
           <w:color w:val="000000"/>
           <w:sz w:val="20"/>
         </w:rPr>
-        <w:t>•  Freeze one new content-preserving mechanism and a matched control before further GPU work.</w:t>
+        <w:t>•  Freeze and run the strict BRSET-only baseline using BRSET validation for checkpoint and threshold selection.</w:t>
       </w:r>
     </w:p>
     <w:p>
@@ -8122,7 +8152,7 @@
           <w:color w:val="000000"/>
           <w:sz w:val="20"/>
         </w:rPr>
-        <w:t>•  Choose between a bounded CheXWorld-style latent-transition objective and an explicitly lesion-aware preservation constraint using feasibility and closest-work evidence.</w:t>
+        <w:t>•  Extract frozen B1 features and reproduce CVPR 2026 GFP on fitting/validation data as a published comparator and diagnostic.</w:t>
       </w:r>
     </w:p>
     <w:p>
@@ -8138,7 +8168,23 @@
           <w:color w:val="000000"/>
           <w:sz w:val="20"/>
         </w:rPr>
-        <w:t>•  Require repeated diagnostic benefit and an isolating ablation before writing a contribution claim.</w:t>
+        <w:t>•  Freeze W1/W2/W3 action, feature, loss, exposure, resume and no-test contracts; then pass an allocated A40 smoke test.</w:t>
+      </w:r>
+    </w:p>
+    <w:p>
+      <w:pPr>
+        <w:spacing w:before="0" w:after="40" w:line="240" w:lineRule="auto"/>
+        <w:ind w:left="288" w:hanging="216"/>
+      </w:pPr>
+      <w:r>
+        <w:rPr>
+          <w:rFonts w:ascii="Times New Roman" w:hAnsi="Times New Roman" w:eastAsia="Times New Roman"/>
+          <w:b w:val="0"/>
+          <w:i w:val="0"/>
+          <w:color w:val="000000"/>
+          <w:sz w:val="20"/>
+        </w:rPr>
+        <w:t>•  Run the three seed-0 arms concurrently on at most three nonexclusive single-GPU nodes; replicate only a qualifying arm.</w:t>
       </w:r>
     </w:p>
     <w:p>
@@ -8905,6 +8951,80 @@
                 <w:sz w:val="17"/>
               </w:rPr>
               <w:t>seed0_validation_summary.json; SEED0_RESULTS_REVIEW.md</w:t>
+            </w:r>
+          </w:p>
+        </w:tc>
+      </w:tr>
+      <w:tr>
+        <w:tc>
+          <w:tcPr>
+            <w:tcW w:type="dxa" w:w="3360"/>
+            <w:vAlign w:val="center"/>
+            <w:shd w:fill="F3F5F7"/>
+          </w:tcPr>
+          <w:p>
+            <w:pPr>
+              <w:spacing w:before="0" w:after="0" w:line="240" w:lineRule="auto"/>
+              <w:jc w:val="left"/>
+            </w:pPr>
+            <w:r/>
+            <w:r>
+              <w:rPr>
+                <w:rFonts w:ascii="Times New Roman" w:hAnsi="Times New Roman" w:eastAsia="Times New Roman"/>
+                <w:b w:val="0"/>
+                <w:i w:val="0"/>
+                <w:color w:val="000000"/>
+                <w:sz w:val="17"/>
+              </w:rPr>
+              <w:t>15 Sep 2026</w:t>
+            </w:r>
+          </w:p>
+        </w:tc>
+        <w:tc>
+          <w:tcPr>
+            <w:tcW w:type="dxa" w:w="3360"/>
+            <w:vAlign w:val="center"/>
+            <w:shd w:fill="F3F5F7"/>
+          </w:tcPr>
+          <w:p>
+            <w:pPr>
+              <w:spacing w:before="0" w:after="0" w:line="240" w:lineRule="auto"/>
+              <w:jc w:val="center"/>
+            </w:pPr>
+            <w:r/>
+            <w:r>
+              <w:rPr>
+                <w:rFonts w:ascii="Times New Roman" w:hAnsi="Times New Roman" w:eastAsia="Times New Roman"/>
+                <w:b w:val="0"/>
+                <w:i w:val="0"/>
+                <w:color w:val="000000"/>
+                <w:sz w:val="17"/>
+              </w:rPr>
+              <w:t>Step-5 deep review and controlled mechanism direction selected</w:t>
+            </w:r>
+          </w:p>
+        </w:tc>
+        <w:tc>
+          <w:tcPr>
+            <w:tcW w:type="dxa" w:w="3360"/>
+            <w:vAlign w:val="center"/>
+            <w:shd w:fill="F3F5F7"/>
+          </w:tcPr>
+          <w:p>
+            <w:pPr>
+              <w:spacing w:before="0" w:after="0" w:line="240" w:lineRule="auto"/>
+              <w:jc w:val="center"/>
+            </w:pPr>
+            <w:r/>
+            <w:r>
+              <w:rPr>
+                <w:rFonts w:ascii="Times New Roman" w:hAnsi="Times New Roman" w:eastAsia="Times New Roman"/>
+                <w:b w:val="0"/>
+                <w:i w:val="0"/>
+                <w:color w:val="000000"/>
+                <w:sz w:val="17"/>
+              </w:rPr>
+              <w:t>STEP5_MECHANISM_DEEP_RESEARCH.md; STEP_5_PLAN_DRAFT.md</w:t>
             </w:r>
           </w:p>
         </w:tc>

</xml_diff>

<commit_message>
Gate Step 5 on observed error evidence
</commit_message>
<xml_diff>
--- a/research/codex/reports/BRSET_mBRSET_Research_Record.docx
+++ b/research/codex/reports/BRSET_mBRSET_Research_Record.docx
@@ -47,7 +47,7 @@
           <w:color w:val="000000"/>
           <w:sz w:val="18"/>
         </w:rPr>
-        <w:t>Updated 15 September 2026 | Current state: Step 5 mechanism direction selected; implementation gates pending</w:t>
+        <w:t>Updated 15 September 2026 | Current state: Step 5 appearance premise rejected; spatial diagnostics next</w:t>
       </w:r>
     </w:p>
     <w:p>
@@ -73,7 +73,7 @@
           <w:color w:val="000000"/>
           <w:sz w:val="20"/>
         </w:rPr>
-        <w:t>This record tracks a supervised cross-device study for image-level diabetic retinopathy (DR) and macular edema (ME) classification. The evidence establishes a strong joint BRSET–mBRSET baseline, closes the balance/exposure investigation, and rejects direct target-calibrated appearance augmentation under the frozen Step-4 screen. Step 5 will repair the missing strict source-only baseline, reproduce a published feature-pruning diagnostic, and test an action-conditioned latent-transition hypothesis. A novel method has not yet been established.</w:t>
+        <w:t>This record tracks a supervised cross-device study for image-level diabetic retinopathy (DR) and macular edema (ME) classification. The evidence establishes a strong joint BRSET–mBRSET baseline and rejects direct appearance augmentation. A Step-5 error audit also found insufficient evidence that five global appearance variables explain B1 errors, so degradation-conditioned training is suspended. Strict source-only, feature-pruning and spatial-evidence diagnostics are next. A novel method has not yet been established.</w:t>
       </w:r>
     </w:p>
     <w:p>
@@ -7962,6 +7962,387 @@
         <w:t>VIII.  NOVELTY GATE, WORLD MODEL AND PAPER DIRECTION</w:t>
       </w:r>
     </w:p>
+    <w:tbl>
+      <w:tblPr>
+        <w:tblStyle w:val="TableGrid"/>
+        <w:tblW w:type="auto" w:w="0"/>
+        <w:jc w:val="center"/>
+        <w:tblLook w:firstColumn="1" w:firstRow="1" w:lastColumn="0" w:lastRow="0" w:noHBand="0" w:noVBand="1" w:val="04A0"/>
+      </w:tblPr>
+      <w:tblGrid>
+        <w:gridCol w:w="2016"/>
+        <w:gridCol w:w="2016"/>
+        <w:gridCol w:w="2016"/>
+        <w:gridCol w:w="2016"/>
+        <w:gridCol w:w="2016"/>
+      </w:tblGrid>
+      <w:tr>
+        <w:tc>
+          <w:tcPr>
+            <w:tcW w:type="dxa" w:w="2016"/>
+            <w:vAlign w:val="center"/>
+            <w:shd w:fill="D9E2F3"/>
+          </w:tcPr>
+          <w:p>
+            <w:pPr>
+              <w:spacing w:before="0" w:after="0" w:line="240" w:lineRule="auto"/>
+              <w:jc w:val="left"/>
+            </w:pPr>
+            <w:r/>
+            <w:r>
+              <w:rPr>
+                <w:rFonts w:ascii="Times New Roman" w:hAnsi="Times New Roman" w:eastAsia="Times New Roman"/>
+                <w:b/>
+                <w:i w:val="0"/>
+                <w:color w:val="000000"/>
+                <w:sz w:val="17"/>
+              </w:rPr>
+              <w:t>Label</w:t>
+            </w:r>
+          </w:p>
+        </w:tc>
+        <w:tc>
+          <w:tcPr>
+            <w:tcW w:type="dxa" w:w="2016"/>
+            <w:vAlign w:val="center"/>
+            <w:shd w:fill="D9E2F3"/>
+          </w:tcPr>
+          <w:p>
+            <w:pPr>
+              <w:spacing w:before="0" w:after="0" w:line="240" w:lineRule="auto"/>
+              <w:jc w:val="center"/>
+            </w:pPr>
+            <w:r/>
+            <w:r>
+              <w:rPr>
+                <w:rFonts w:ascii="Times New Roman" w:hAnsi="Times New Roman" w:eastAsia="Times New Roman"/>
+                <w:b/>
+                <w:i w:val="0"/>
+                <w:color w:val="000000"/>
+                <w:sz w:val="17"/>
+              </w:rPr>
+              <w:t>B1 error rate</w:t>
+            </w:r>
+          </w:p>
+        </w:tc>
+        <w:tc>
+          <w:tcPr>
+            <w:tcW w:type="dxa" w:w="2016"/>
+            <w:vAlign w:val="center"/>
+            <w:shd w:fill="D9E2F3"/>
+          </w:tcPr>
+          <w:p>
+            <w:pPr>
+              <w:spacing w:before="0" w:after="0" w:line="240" w:lineRule="auto"/>
+              <w:jc w:val="center"/>
+            </w:pPr>
+            <w:r/>
+            <w:r>
+              <w:rPr>
+                <w:rFonts w:ascii="Times New Roman" w:hAnsi="Times New Roman" w:eastAsia="Times New Roman"/>
+                <w:b/>
+                <w:i w:val="0"/>
+                <w:color w:val="000000"/>
+                <w:sz w:val="17"/>
+              </w:rPr>
+              <w:t>Appearance error-AUROC Δ</w:t>
+            </w:r>
+          </w:p>
+        </w:tc>
+        <w:tc>
+          <w:tcPr>
+            <w:tcW w:type="dxa" w:w="2016"/>
+            <w:vAlign w:val="center"/>
+            <w:shd w:fill="D9E2F3"/>
+          </w:tcPr>
+          <w:p>
+            <w:pPr>
+              <w:spacing w:before="0" w:after="0" w:line="240" w:lineRule="auto"/>
+              <w:jc w:val="center"/>
+            </w:pPr>
+            <w:r/>
+            <w:r>
+              <w:rPr>
+                <w:rFonts w:ascii="Times New Roman" w:hAnsi="Times New Roman" w:eastAsia="Times New Roman"/>
+                <w:b/>
+                <w:i w:val="0"/>
+                <w:color w:val="000000"/>
+                <w:sz w:val="17"/>
+              </w:rPr>
+              <w:t>Patient 95% interval</w:t>
+            </w:r>
+          </w:p>
+        </w:tc>
+        <w:tc>
+          <w:tcPr>
+            <w:tcW w:type="dxa" w:w="2016"/>
+            <w:vAlign w:val="center"/>
+            <w:shd w:fill="D9E2F3"/>
+          </w:tcPr>
+          <w:p>
+            <w:pPr>
+              <w:spacing w:before="0" w:after="0" w:line="240" w:lineRule="auto"/>
+              <w:jc w:val="center"/>
+            </w:pPr>
+            <w:r/>
+            <w:r>
+              <w:rPr>
+                <w:rFonts w:ascii="Times New Roman" w:hAnsi="Times New Roman" w:eastAsia="Times New Roman"/>
+                <w:b/>
+                <w:i w:val="0"/>
+                <w:color w:val="000000"/>
+                <w:sz w:val="17"/>
+              </w:rPr>
+              <w:t>Positive-FN appearance AUROC</w:t>
+            </w:r>
+          </w:p>
+        </w:tc>
+      </w:tr>
+      <w:tr>
+        <w:tc>
+          <w:tcPr>
+            <w:tcW w:type="dxa" w:w="2016"/>
+            <w:vAlign w:val="center"/>
+          </w:tcPr>
+          <w:p>
+            <w:pPr>
+              <w:spacing w:before="0" w:after="0" w:line="240" w:lineRule="auto"/>
+              <w:jc w:val="left"/>
+            </w:pPr>
+            <w:r/>
+            <w:r>
+              <w:rPr>
+                <w:rFonts w:ascii="Times New Roman" w:hAnsi="Times New Roman" w:eastAsia="Times New Roman"/>
+                <w:b w:val="0"/>
+                <w:i w:val="0"/>
+                <w:color w:val="000000"/>
+                <w:sz w:val="17"/>
+              </w:rPr>
+              <w:t>DR</w:t>
+            </w:r>
+          </w:p>
+        </w:tc>
+        <w:tc>
+          <w:tcPr>
+            <w:tcW w:type="dxa" w:w="2016"/>
+            <w:vAlign w:val="center"/>
+          </w:tcPr>
+          <w:p>
+            <w:pPr>
+              <w:spacing w:before="0" w:after="0" w:line="240" w:lineRule="auto"/>
+              <w:jc w:val="center"/>
+            </w:pPr>
+            <w:r/>
+            <w:r>
+              <w:rPr>
+                <w:rFonts w:ascii="Times New Roman" w:hAnsi="Times New Roman" w:eastAsia="Times New Roman"/>
+                <w:b w:val="0"/>
+                <w:i w:val="0"/>
+                <w:color w:val="000000"/>
+                <w:sz w:val="17"/>
+              </w:rPr>
+              <w:t>0.0611</w:t>
+            </w:r>
+          </w:p>
+        </w:tc>
+        <w:tc>
+          <w:tcPr>
+            <w:tcW w:type="dxa" w:w="2016"/>
+            <w:vAlign w:val="center"/>
+          </w:tcPr>
+          <w:p>
+            <w:pPr>
+              <w:spacing w:before="0" w:after="0" w:line="240" w:lineRule="auto"/>
+              <w:jc w:val="center"/>
+            </w:pPr>
+            <w:r/>
+            <w:r>
+              <w:rPr>
+                <w:rFonts w:ascii="Times New Roman" w:hAnsi="Times New Roman" w:eastAsia="Times New Roman"/>
+                <w:b w:val="0"/>
+                <w:i w:val="0"/>
+                <w:color w:val="000000"/>
+                <w:sz w:val="17"/>
+              </w:rPr>
+              <w:t>+0.0108</w:t>
+            </w:r>
+          </w:p>
+        </w:tc>
+        <w:tc>
+          <w:tcPr>
+            <w:tcW w:type="dxa" w:w="2016"/>
+            <w:vAlign w:val="center"/>
+          </w:tcPr>
+          <w:p>
+            <w:pPr>
+              <w:spacing w:before="0" w:after="0" w:line="240" w:lineRule="auto"/>
+              <w:jc w:val="center"/>
+            </w:pPr>
+            <w:r/>
+            <w:r>
+              <w:rPr>
+                <w:rFonts w:ascii="Times New Roman" w:hAnsi="Times New Roman" w:eastAsia="Times New Roman"/>
+                <w:b w:val="0"/>
+                <w:i w:val="0"/>
+                <w:color w:val="000000"/>
+                <w:sz w:val="17"/>
+              </w:rPr>
+              <w:t>-0.0387 to +0.0605</w:t>
+            </w:r>
+          </w:p>
+        </w:tc>
+        <w:tc>
+          <w:tcPr>
+            <w:tcW w:type="dxa" w:w="2016"/>
+            <w:vAlign w:val="center"/>
+          </w:tcPr>
+          <w:p>
+            <w:pPr>
+              <w:spacing w:before="0" w:after="0" w:line="240" w:lineRule="auto"/>
+              <w:jc w:val="center"/>
+            </w:pPr>
+            <w:r/>
+            <w:r>
+              <w:rPr>
+                <w:rFonts w:ascii="Times New Roman" w:hAnsi="Times New Roman" w:eastAsia="Times New Roman"/>
+                <w:b w:val="0"/>
+                <w:i w:val="0"/>
+                <w:color w:val="000000"/>
+                <w:sz w:val="17"/>
+              </w:rPr>
+              <w:t>0.5547</w:t>
+            </w:r>
+          </w:p>
+        </w:tc>
+      </w:tr>
+      <w:tr>
+        <w:tc>
+          <w:tcPr>
+            <w:tcW w:type="dxa" w:w="2016"/>
+            <w:vAlign w:val="center"/>
+            <w:shd w:fill="F3F5F7"/>
+          </w:tcPr>
+          <w:p>
+            <w:pPr>
+              <w:spacing w:before="0" w:after="0" w:line="240" w:lineRule="auto"/>
+              <w:jc w:val="left"/>
+            </w:pPr>
+            <w:r/>
+            <w:r>
+              <w:rPr>
+                <w:rFonts w:ascii="Times New Roman" w:hAnsi="Times New Roman" w:eastAsia="Times New Roman"/>
+                <w:b w:val="0"/>
+                <w:i w:val="0"/>
+                <w:color w:val="000000"/>
+                <w:sz w:val="17"/>
+              </w:rPr>
+              <w:t>ME</w:t>
+            </w:r>
+          </w:p>
+        </w:tc>
+        <w:tc>
+          <w:tcPr>
+            <w:tcW w:type="dxa" w:w="2016"/>
+            <w:vAlign w:val="center"/>
+            <w:shd w:fill="F3F5F7"/>
+          </w:tcPr>
+          <w:p>
+            <w:pPr>
+              <w:spacing w:before="0" w:after="0" w:line="240" w:lineRule="auto"/>
+              <w:jc w:val="center"/>
+            </w:pPr>
+            <w:r/>
+            <w:r>
+              <w:rPr>
+                <w:rFonts w:ascii="Times New Roman" w:hAnsi="Times New Roman" w:eastAsia="Times New Roman"/>
+                <w:b w:val="0"/>
+                <w:i w:val="0"/>
+                <w:color w:val="000000"/>
+                <w:sz w:val="17"/>
+              </w:rPr>
+              <w:t>0.0285</w:t>
+            </w:r>
+          </w:p>
+        </w:tc>
+        <w:tc>
+          <w:tcPr>
+            <w:tcW w:type="dxa" w:w="2016"/>
+            <w:vAlign w:val="center"/>
+            <w:shd w:fill="F3F5F7"/>
+          </w:tcPr>
+          <w:p>
+            <w:pPr>
+              <w:spacing w:before="0" w:after="0" w:line="240" w:lineRule="auto"/>
+              <w:jc w:val="center"/>
+            </w:pPr>
+            <w:r/>
+            <w:r>
+              <w:rPr>
+                <w:rFonts w:ascii="Times New Roman" w:hAnsi="Times New Roman" w:eastAsia="Times New Roman"/>
+                <w:b w:val="0"/>
+                <w:i w:val="0"/>
+                <w:color w:val="000000"/>
+                <w:sz w:val="17"/>
+              </w:rPr>
+              <w:t>+0.0472</w:t>
+            </w:r>
+          </w:p>
+        </w:tc>
+        <w:tc>
+          <w:tcPr>
+            <w:tcW w:type="dxa" w:w="2016"/>
+            <w:vAlign w:val="center"/>
+            <w:shd w:fill="F3F5F7"/>
+          </w:tcPr>
+          <w:p>
+            <w:pPr>
+              <w:spacing w:before="0" w:after="0" w:line="240" w:lineRule="auto"/>
+              <w:jc w:val="center"/>
+            </w:pPr>
+            <w:r/>
+            <w:r>
+              <w:rPr>
+                <w:rFonts w:ascii="Times New Roman" w:hAnsi="Times New Roman" w:eastAsia="Times New Roman"/>
+                <w:b w:val="0"/>
+                <w:i w:val="0"/>
+                <w:color w:val="000000"/>
+                <w:sz w:val="17"/>
+              </w:rPr>
+              <w:t>-0.0287 to +0.1284</w:t>
+            </w:r>
+          </w:p>
+        </w:tc>
+        <w:tc>
+          <w:tcPr>
+            <w:tcW w:type="dxa" w:w="2016"/>
+            <w:vAlign w:val="center"/>
+            <w:shd w:fill="F3F5F7"/>
+          </w:tcPr>
+          <w:p>
+            <w:pPr>
+              <w:spacing w:before="0" w:after="0" w:line="240" w:lineRule="auto"/>
+              <w:jc w:val="center"/>
+            </w:pPr>
+            <w:r/>
+            <w:r>
+              <w:rPr>
+                <w:rFonts w:ascii="Times New Roman" w:hAnsi="Times New Roman" w:eastAsia="Times New Roman"/>
+                <w:b w:val="0"/>
+                <w:i w:val="0"/>
+                <w:color w:val="000000"/>
+                <w:sz w:val="17"/>
+              </w:rPr>
+              <w:t>0.4055</w:t>
+            </w:r>
+          </w:p>
+        </w:tc>
+      </w:tr>
+    </w:tbl>
+    <w:p>
+      <w:pPr>
+        <w:spacing w:after="20"/>
+      </w:pPr>
+    </w:p>
     <w:p>
       <w:pPr>
         <w:spacing w:before="0" w:after="80" w:line="240" w:lineRule="auto"/>
@@ -7975,7 +8356,7 @@
           <w:color w:val="000000"/>
           <w:sz w:val="20"/>
         </w:rPr>
-        <w:t>Selected hypothesis:</w:t>
+        <w:t>Appearance-error gate:</w:t>
       </w:r>
       <w:r>
         <w:rPr>
@@ -7985,7 +8366,7 @@
           <w:color w:val="000000"/>
           <w:sz w:val="20"/>
         </w:rPr>
-        <w:t xml:space="preserve"> use the Step-4 overlay-free transform as a measured action rather than as an extra labeled image. Given an original BRSET view, a transformed view, and the sampled blur/color/noise strengths, a small predictor learns to recover the original ConvNeXt feature. A separate loss keeps DR and ME predictions stable. The predictor is discarded at inference.</w:t>
+        <w:t xml:space="preserve"> neither AUROC-difference interval excludes zero, and positive-case false-negative appearance AUROCs of 0.5547 DR and 0.4055 ME are below the frozen 0.60 screen. Suspend action-conditioned W1/W2/W3. This is evidence about five global variables on development data, not proof that acquisition appearance never matters.</w:t>
       </w:r>
     </w:p>
     <w:p>
@@ -8001,7 +8382,7 @@
           <w:color w:val="000000"/>
           <w:sz w:val="20"/>
         </w:rPr>
-        <w:t>Controls:</w:t>
+        <w:t>Revised direction:</w:t>
       </w:r>
       <w:r>
         <w:rPr>
@@ -8011,7 +8392,33 @@
           <w:color w:val="000000"/>
           <w:sz w:val="20"/>
         </w:rPr>
-        <w:t xml:space="preserve"> W1 uses paired feature consistency without the action; W2 adds the action-conditioned transition; W3 adds separate DR/ME prediction preservation. W3 must beat both the natural joint B1 reference and W1, pass the fixed validation gate, and then repeat at seeds 1 and 2 before any test assessment or contribution claim.</w:t>
+        <w:t xml:space="preserve"> first measure strict BRSET-only transfer, reproduce GFP on frozen B1 features, and test whether label-specific spatial patch evidence improves over global-average pooled features without retraining the backbone. Patch/adaptor training is conditional on that diagnostic.</w:t>
+      </w:r>
+    </w:p>
+    <w:p>
+      <w:pPr>
+        <w:spacing w:before="0" w:after="80" w:line="240" w:lineRule="auto"/>
+        <w:jc w:val="both"/>
+      </w:pPr>
+      <w:r>
+        <w:rPr>
+          <w:rFonts w:ascii="Times New Roman" w:hAnsi="Times New Roman" w:eastAsia="Times New Roman"/>
+          <w:b/>
+          <w:i w:val="0"/>
+          <w:color w:val="000000"/>
+          <w:sz w:val="20"/>
+        </w:rPr>
+        <w:t>Conditional controls:</w:t>
+      </w:r>
+      <w:r>
+        <w:rPr>
+          <w:rFonts w:ascii="Times New Roman" w:hAnsi="Times New Roman" w:eastAsia="Times New Roman"/>
+          <w:b w:val="0"/>
+          <w:i w:val="0"/>
+          <w:color w:val="000000"/>
+          <w:sz w:val="20"/>
+        </w:rPr>
+        <w:t xml:space="preserve"> P1 is a label-specific patch-evidence head, P2 uses known-device residual adapters with ordinary pooling, and P3 combines them. P3 must beat B1, P1 and P2 before an interaction claim. Generic patch attention, private encoders and adapters are established prior art, so even a gain would require a further novelty audit.</w:t>
       </w:r>
     </w:p>
     <w:p>
@@ -8037,7 +8444,7 @@
           <w:color w:val="000000"/>
           <w:sz w:val="20"/>
         </w:rPr>
-        <w:t xml:space="preserve"> CheXWorld (CVPR 2025) supports parameter-conditioned latent prediction, while I-JEPA (CVPR 2023) establishes non-generative feature prediction. A full diffusion/pixel generator is deferred because Step 4 shows that target-like appearance does not imply better diagnosis and generated lesions would require substantially stronger preservation evidence.</w:t>
+        <w:t xml:space="preserve"> CheXWorld (CVPR 2025) supports parameter-conditioned latent prediction, but our evidence gate does not support spending the first Step-5 GPU batch on the measured degradation action. Full diffusion/pixel generation remains deferred because target-like appearance did not imply better diagnosis and generated lesions require stronger preservation evidence.</w:t>
       </w:r>
     </w:p>
     <w:p>
@@ -8152,7 +8559,7 @@
           <w:color w:val="000000"/>
           <w:sz w:val="20"/>
         </w:rPr>
-        <w:t>•  Extract frozen B1 features and reproduce CVPR 2026 GFP on fitting/validation data as a published comparator and diagnostic.</w:t>
+        <w:t>•  Extract frozen B1 pooled/spatial features; reproduce CVPR 2026 GFP and compare global with label-specific spatial evidence without test access.</w:t>
       </w:r>
     </w:p>
     <w:p>
@@ -8168,7 +8575,7 @@
           <w:color w:val="000000"/>
           <w:sz w:val="20"/>
         </w:rPr>
-        <w:t>•  Freeze W1/W2/W3 action, feature, loss, exposure, resume and no-test contracts; then pass an allocated A40 smoke test.</w:t>
+        <w:t>•  Launch P1/P2/P3 only if the frozen spatial diagnostic passes; otherwise move to a stronger published retinal backbone/comparator.</w:t>
       </w:r>
     </w:p>
     <w:p>
@@ -8184,7 +8591,7 @@
           <w:color w:val="000000"/>
           <w:sz w:val="20"/>
         </w:rPr>
-        <w:t>•  Run the three seed-0 arms concurrently on at most three nonexclusive single-GPU nodes; replicate only a qualifying arm.</w:t>
+        <w:t>•  Require P3 to beat B1, P1 and P2, then replicate a qualifying arm before any test assessment.</w:t>
       </w:r>
     </w:p>
     <w:p>
@@ -9025,6 +9432,77 @@
                 <w:sz w:val="17"/>
               </w:rPr>
               <w:t>STEP5_MECHANISM_DEEP_RESEARCH.md; STEP_5_PLAN_DRAFT.md</w:t>
+            </w:r>
+          </w:p>
+        </w:tc>
+      </w:tr>
+      <w:tr>
+        <w:tc>
+          <w:tcPr>
+            <w:tcW w:type="dxa" w:w="3360"/>
+            <w:vAlign w:val="center"/>
+          </w:tcPr>
+          <w:p>
+            <w:pPr>
+              <w:spacing w:before="0" w:after="0" w:line="240" w:lineRule="auto"/>
+              <w:jc w:val="left"/>
+            </w:pPr>
+            <w:r/>
+            <w:r>
+              <w:rPr>
+                <w:rFonts w:ascii="Times New Roman" w:hAnsi="Times New Roman" w:eastAsia="Times New Roman"/>
+                <w:b w:val="0"/>
+                <w:i w:val="0"/>
+                <w:color w:val="000000"/>
+                <w:sz w:val="17"/>
+              </w:rPr>
+              <w:t>15 Sep 2026</w:t>
+            </w:r>
+          </w:p>
+        </w:tc>
+        <w:tc>
+          <w:tcPr>
+            <w:tcW w:type="dxa" w:w="3360"/>
+            <w:vAlign w:val="center"/>
+          </w:tcPr>
+          <w:p>
+            <w:pPr>
+              <w:spacing w:before="0" w:after="0" w:line="240" w:lineRule="auto"/>
+              <w:jc w:val="center"/>
+            </w:pPr>
+            <w:r/>
+            <w:r>
+              <w:rPr>
+                <w:rFonts w:ascii="Times New Roman" w:hAnsi="Times New Roman" w:eastAsia="Times New Roman"/>
+                <w:b w:val="0"/>
+                <w:i w:val="0"/>
+                <w:color w:val="000000"/>
+                <w:sz w:val="17"/>
+              </w:rPr>
+              <w:t>Appearance-error premise failed; degradation-conditioned Step 5 suspended</w:t>
+            </w:r>
+          </w:p>
+        </w:tc>
+        <w:tc>
+          <w:tcPr>
+            <w:tcW w:type="dxa" w:w="3360"/>
+            <w:vAlign w:val="center"/>
+          </w:tcPr>
+          <w:p>
+            <w:pPr>
+              <w:spacing w:before="0" w:after="0" w:line="240" w:lineRule="auto"/>
+              <w:jc w:val="center"/>
+            </w:pPr>
+            <w:r/>
+            <w:r>
+              <w:rPr>
+                <w:rFonts w:ascii="Times New Roman" w:hAnsi="Times New Roman" w:eastAsia="Times New Roman"/>
+                <w:b w:val="0"/>
+                <w:i w:val="0"/>
+                <w:color w:val="000000"/>
+                <w:sz w:val="17"/>
+              </w:rPr>
+              <w:t>appearance_error_gate.json; APPEARANCE_ERROR_GATE_REVIEW.md</w:t>
             </w:r>
           </w:p>
         </w:tc>

</xml_diff>

<commit_message>
Launch strict source-only Step 5 baseline
</commit_message>
<xml_diff>
--- a/research/codex/reports/BRSET_mBRSET_Research_Record.docx
+++ b/research/codex/reports/BRSET_mBRSET_Research_Record.docx
@@ -8501,6 +8501,58 @@
     </w:p>
     <w:p>
       <w:pPr>
+        <w:spacing w:before="0" w:after="80" w:line="240" w:lineRule="auto"/>
+        <w:jc w:val="both"/>
+      </w:pPr>
+      <w:r>
+        <w:rPr>
+          <w:rFonts w:ascii="Times New Roman" w:hAnsi="Times New Roman" w:eastAsia="Times New Roman"/>
+          <w:b/>
+          <w:i w:val="0"/>
+          <w:color w:val="000000"/>
+          <w:sz w:val="20"/>
+        </w:rPr>
+        <w:t>Strict source-only gates:</w:t>
+      </w:r>
+      <w:r>
+        <w:rPr>
+          <w:rFonts w:ascii="Times New Roman" w:hAnsi="Times New Roman" w:eastAsia="Times New Roman"/>
+          <w:b w:val="0"/>
+          <w:i w:val="0"/>
+          <w:color w:val="000000"/>
+          <w:sz w:val="20"/>
+        </w:rPr>
+        <w:t xml:space="preserve"> fitting uses 11,372 BRSET images from 5,966 patients; selection uses 2,451 BRSET images; assessment is locked to 732 mBRSET images. All 14,555 images decoded, no exact duplicate group was found, and the A40 interruption/resume smoke had 0 state mismatches. These are protocol checks, not performance results.</w:t>
+      </w:r>
+    </w:p>
+    <w:p>
+      <w:pPr>
+        <w:spacing w:before="0" w:after="80" w:line="240" w:lineRule="auto"/>
+        <w:jc w:val="both"/>
+      </w:pPr>
+      <w:r>
+        <w:rPr>
+          <w:rFonts w:ascii="Times New Roman" w:hAnsi="Times New Roman" w:eastAsia="Times New Roman"/>
+          <w:b/>
+          <w:i w:val="0"/>
+          <w:color w:val="000000"/>
+          <w:sz w:val="20"/>
+        </w:rPr>
+        <w:t>Execution status:</w:t>
+      </w:r>
+      <w:r>
+        <w:rPr>
+          <w:rFonts w:ascii="Times New Roman" w:hAnsi="Times New Roman" w:eastAsia="Times New Roman"/>
+          <w:b w:val="0"/>
+          <w:i w:val="0"/>
+          <w:color w:val="000000"/>
+          <w:sz w:val="20"/>
+        </w:rPr>
+        <w:t xml:space="preserve"> source-only seed-0 training job 4402198 is recorded as running on one nonexclusive A40; assessment job 4402199 is dependency-locked after successful training. Measured training estimate: 8.25 hours. No source-only performance result existed when this record was generated.</w:t>
+      </w:r>
+    </w:p>
+    <w:p>
+      <w:pPr>
         <w:spacing w:before="160" w:after="60" w:line="240" w:lineRule="auto"/>
       </w:pPr>
       <w:r>
@@ -8543,7 +8595,7 @@
           <w:color w:val="000000"/>
           <w:sz w:val="20"/>
         </w:rPr>
-        <w:t>•  Freeze and run the strict BRSET-only baseline using BRSET validation for checkpoint and threshold selection.</w:t>
+        <w:t>•  Complete and independently verify the active strict BRSET-only baseline; use BRSET validation for checkpoint and threshold selection.</w:t>
       </w:r>
     </w:p>
     <w:p>
@@ -9503,6 +9555,80 @@
                 <w:sz w:val="17"/>
               </w:rPr>
               <w:t>appearance_error_gate.json; APPEARANCE_ERROR_GATE_REVIEW.md</w:t>
+            </w:r>
+          </w:p>
+        </w:tc>
+      </w:tr>
+      <w:tr>
+        <w:tc>
+          <w:tcPr>
+            <w:tcW w:type="dxa" w:w="3360"/>
+            <w:vAlign w:val="center"/>
+            <w:shd w:fill="F3F5F7"/>
+          </w:tcPr>
+          <w:p>
+            <w:pPr>
+              <w:spacing w:before="0" w:after="0" w:line="240" w:lineRule="auto"/>
+              <w:jc w:val="left"/>
+            </w:pPr>
+            <w:r/>
+            <w:r>
+              <w:rPr>
+                <w:rFonts w:ascii="Times New Roman" w:hAnsi="Times New Roman" w:eastAsia="Times New Roman"/>
+                <w:b w:val="0"/>
+                <w:i w:val="0"/>
+                <w:color w:val="000000"/>
+                <w:sz w:val="17"/>
+              </w:rPr>
+              <w:t>15 Sep 2026</w:t>
+            </w:r>
+          </w:p>
+        </w:tc>
+        <w:tc>
+          <w:tcPr>
+            <w:tcW w:type="dxa" w:w="3360"/>
+            <w:vAlign w:val="center"/>
+            <w:shd w:fill="F3F5F7"/>
+          </w:tcPr>
+          <w:p>
+            <w:pPr>
+              <w:spacing w:before="0" w:after="0" w:line="240" w:lineRule="auto"/>
+              <w:jc w:val="center"/>
+            </w:pPr>
+            <w:r/>
+            <w:r>
+              <w:rPr>
+                <w:rFonts w:ascii="Times New Roman" w:hAnsi="Times New Roman" w:eastAsia="Times New Roman"/>
+                <w:b w:val="0"/>
+                <w:i w:val="0"/>
+                <w:color w:val="000000"/>
+                <w:sz w:val="17"/>
+              </w:rPr>
+              <w:t>Strict source-only design, integrity, provenance and resume gates passed; seed 0 launched</w:t>
+            </w:r>
+          </w:p>
+        </w:tc>
+        <w:tc>
+          <w:tcPr>
+            <w:tcW w:type="dxa" w:w="3360"/>
+            <w:vAlign w:val="center"/>
+            <w:shd w:fill="F3F5F7"/>
+          </w:tcPr>
+          <w:p>
+            <w:pPr>
+              <w:spacing w:before="0" w:after="0" w:line="240" w:lineRule="auto"/>
+              <w:jc w:val="center"/>
+            </w:pPr>
+            <w:r/>
+            <w:r>
+              <w:rPr>
+                <w:rFonts w:ascii="Times New Roman" w:hAnsi="Times New Roman" w:eastAsia="Times New Roman"/>
+                <w:b w:val="0"/>
+                <w:i w:val="0"/>
+                <w:color w:val="000000"/>
+                <w:sz w:val="17"/>
+              </w:rPr>
+              <w:t>design_preflight.json; source_integrity_summary.json; source_smoke_checks.json</w:t>
             </w:r>
           </w:p>
         </w:tc>

</xml_diff>

<commit_message>
Record verified source-only seed 0 result
</commit_message>
<xml_diff>
--- a/research/codex/reports/BRSET_mBRSET_Research_Record.docx
+++ b/research/codex/reports/BRSET_mBRSET_Research_Record.docx
@@ -8525,6 +8525,387 @@
         <w:t xml:space="preserve"> fitting uses 11,372 BRSET images from 5,966 patients; selection uses 2,451 BRSET images; assessment is locked to 732 mBRSET images. All 14,555 images decoded, no exact duplicate group was found, and the A40 interruption/resume smoke had 0 state mismatches. These are protocol checks, not performance results.</w:t>
       </w:r>
     </w:p>
+    <w:tbl>
+      <w:tblPr>
+        <w:tblStyle w:val="TableGrid"/>
+        <w:tblW w:type="auto" w:w="0"/>
+        <w:jc w:val="center"/>
+        <w:tblLook w:firstColumn="1" w:firstRow="1" w:lastColumn="0" w:lastRow="0" w:noHBand="0" w:noVBand="1" w:val="04A0"/>
+      </w:tblPr>
+      <w:tblGrid>
+        <w:gridCol w:w="2016"/>
+        <w:gridCol w:w="2016"/>
+        <w:gridCol w:w="2016"/>
+        <w:gridCol w:w="2016"/>
+        <w:gridCol w:w="2016"/>
+      </w:tblGrid>
+      <w:tr>
+        <w:tc>
+          <w:tcPr>
+            <w:tcW w:type="dxa" w:w="2016"/>
+            <w:vAlign w:val="center"/>
+            <w:shd w:fill="D9E2F3"/>
+          </w:tcPr>
+          <w:p>
+            <w:pPr>
+              <w:spacing w:before="0" w:after="0" w:line="240" w:lineRule="auto"/>
+              <w:jc w:val="left"/>
+            </w:pPr>
+            <w:r/>
+            <w:r>
+              <w:rPr>
+                <w:rFonts w:ascii="Times New Roman" w:hAnsi="Times New Roman" w:eastAsia="Times New Roman"/>
+                <w:b/>
+                <w:i w:val="0"/>
+                <w:color w:val="000000"/>
+                <w:sz w:val="17"/>
+              </w:rPr>
+              <w:t>Strict source-only seed 0</w:t>
+            </w:r>
+          </w:p>
+        </w:tc>
+        <w:tc>
+          <w:tcPr>
+            <w:tcW w:type="dxa" w:w="2016"/>
+            <w:vAlign w:val="center"/>
+            <w:shd w:fill="D9E2F3"/>
+          </w:tcPr>
+          <w:p>
+            <w:pPr>
+              <w:spacing w:before="0" w:after="0" w:line="240" w:lineRule="auto"/>
+              <w:jc w:val="center"/>
+            </w:pPr>
+            <w:r/>
+            <w:r>
+              <w:rPr>
+                <w:rFonts w:ascii="Times New Roman" w:hAnsi="Times New Roman" w:eastAsia="Times New Roman"/>
+                <w:b/>
+                <w:i w:val="0"/>
+                <w:color w:val="000000"/>
+                <w:sz w:val="17"/>
+              </w:rPr>
+              <w:t>F1</w:t>
+            </w:r>
+          </w:p>
+        </w:tc>
+        <w:tc>
+          <w:tcPr>
+            <w:tcW w:type="dxa" w:w="2016"/>
+            <w:vAlign w:val="center"/>
+            <w:shd w:fill="D9E2F3"/>
+          </w:tcPr>
+          <w:p>
+            <w:pPr>
+              <w:spacing w:before="0" w:after="0" w:line="240" w:lineRule="auto"/>
+              <w:jc w:val="center"/>
+            </w:pPr>
+            <w:r/>
+            <w:r>
+              <w:rPr>
+                <w:rFonts w:ascii="Times New Roman" w:hAnsi="Times New Roman" w:eastAsia="Times New Roman"/>
+                <w:b/>
+                <w:i w:val="0"/>
+                <w:color w:val="000000"/>
+                <w:sz w:val="17"/>
+              </w:rPr>
+              <w:t>AUROC</w:t>
+            </w:r>
+          </w:p>
+        </w:tc>
+        <w:tc>
+          <w:tcPr>
+            <w:tcW w:type="dxa" w:w="2016"/>
+            <w:vAlign w:val="center"/>
+            <w:shd w:fill="D9E2F3"/>
+          </w:tcPr>
+          <w:p>
+            <w:pPr>
+              <w:spacing w:before="0" w:after="0" w:line="240" w:lineRule="auto"/>
+              <w:jc w:val="center"/>
+            </w:pPr>
+            <w:r/>
+            <w:r>
+              <w:rPr>
+                <w:rFonts w:ascii="Times New Roman" w:hAnsi="Times New Roman" w:eastAsia="Times New Roman"/>
+                <w:b/>
+                <w:i w:val="0"/>
+                <w:color w:val="000000"/>
+                <w:sz w:val="17"/>
+              </w:rPr>
+              <w:t>Average precision</w:t>
+            </w:r>
+          </w:p>
+        </w:tc>
+        <w:tc>
+          <w:tcPr>
+            <w:tcW w:type="dxa" w:w="2016"/>
+            <w:vAlign w:val="center"/>
+            <w:shd w:fill="D9E2F3"/>
+          </w:tcPr>
+          <w:p>
+            <w:pPr>
+              <w:spacing w:before="0" w:after="0" w:line="240" w:lineRule="auto"/>
+              <w:jc w:val="center"/>
+            </w:pPr>
+            <w:r/>
+            <w:r>
+              <w:rPr>
+                <w:rFonts w:ascii="Times New Roman" w:hAnsi="Times New Roman" w:eastAsia="Times New Roman"/>
+                <w:b/>
+                <w:i w:val="0"/>
+                <w:color w:val="000000"/>
+                <w:sz w:val="17"/>
+              </w:rPr>
+              <w:t>Sensitivity</w:t>
+            </w:r>
+          </w:p>
+        </w:tc>
+      </w:tr>
+      <w:tr>
+        <w:tc>
+          <w:tcPr>
+            <w:tcW w:type="dxa" w:w="2016"/>
+            <w:vAlign w:val="center"/>
+          </w:tcPr>
+          <w:p>
+            <w:pPr>
+              <w:spacing w:before="0" w:after="0" w:line="240" w:lineRule="auto"/>
+              <w:jc w:val="left"/>
+            </w:pPr>
+            <w:r/>
+            <w:r>
+              <w:rPr>
+                <w:rFonts w:ascii="Times New Roman" w:hAnsi="Times New Roman" w:eastAsia="Times New Roman"/>
+                <w:b w:val="0"/>
+                <w:i w:val="0"/>
+                <w:color w:val="000000"/>
+                <w:sz w:val="17"/>
+              </w:rPr>
+              <w:t>DR</w:t>
+            </w:r>
+          </w:p>
+        </w:tc>
+        <w:tc>
+          <w:tcPr>
+            <w:tcW w:type="dxa" w:w="2016"/>
+            <w:vAlign w:val="center"/>
+          </w:tcPr>
+          <w:p>
+            <w:pPr>
+              <w:spacing w:before="0" w:after="0" w:line="240" w:lineRule="auto"/>
+              <w:jc w:val="center"/>
+            </w:pPr>
+            <w:r/>
+            <w:r>
+              <w:rPr>
+                <w:rFonts w:ascii="Times New Roman" w:hAnsi="Times New Roman" w:eastAsia="Times New Roman"/>
+                <w:b w:val="0"/>
+                <w:i w:val="0"/>
+                <w:color w:val="000000"/>
+                <w:sz w:val="17"/>
+              </w:rPr>
+              <w:t>0.7218</w:t>
+            </w:r>
+          </w:p>
+        </w:tc>
+        <w:tc>
+          <w:tcPr>
+            <w:tcW w:type="dxa" w:w="2016"/>
+            <w:vAlign w:val="center"/>
+          </w:tcPr>
+          <w:p>
+            <w:pPr>
+              <w:spacing w:before="0" w:after="0" w:line="240" w:lineRule="auto"/>
+              <w:jc w:val="center"/>
+            </w:pPr>
+            <w:r/>
+            <w:r>
+              <w:rPr>
+                <w:rFonts w:ascii="Times New Roman" w:hAnsi="Times New Roman" w:eastAsia="Times New Roman"/>
+                <w:b w:val="0"/>
+                <w:i w:val="0"/>
+                <w:color w:val="000000"/>
+                <w:sz w:val="17"/>
+              </w:rPr>
+              <w:t>0.9100</w:t>
+            </w:r>
+          </w:p>
+        </w:tc>
+        <w:tc>
+          <w:tcPr>
+            <w:tcW w:type="dxa" w:w="2016"/>
+            <w:vAlign w:val="center"/>
+          </w:tcPr>
+          <w:p>
+            <w:pPr>
+              <w:spacing w:before="0" w:after="0" w:line="240" w:lineRule="auto"/>
+              <w:jc w:val="center"/>
+            </w:pPr>
+            <w:r/>
+            <w:r>
+              <w:rPr>
+                <w:rFonts w:ascii="Times New Roman" w:hAnsi="Times New Roman" w:eastAsia="Times New Roman"/>
+                <w:b w:val="0"/>
+                <w:i w:val="0"/>
+                <w:color w:val="000000"/>
+                <w:sz w:val="17"/>
+              </w:rPr>
+              <w:t>0.8353</w:t>
+            </w:r>
+          </w:p>
+        </w:tc>
+        <w:tc>
+          <w:tcPr>
+            <w:tcW w:type="dxa" w:w="2016"/>
+            <w:vAlign w:val="center"/>
+          </w:tcPr>
+          <w:p>
+            <w:pPr>
+              <w:spacing w:before="0" w:after="0" w:line="240" w:lineRule="auto"/>
+              <w:jc w:val="center"/>
+            </w:pPr>
+            <w:r/>
+            <w:r>
+              <w:rPr>
+                <w:rFonts w:ascii="Times New Roman" w:hAnsi="Times New Roman" w:eastAsia="Times New Roman"/>
+                <w:b w:val="0"/>
+                <w:i w:val="0"/>
+                <w:color w:val="000000"/>
+                <w:sz w:val="17"/>
+              </w:rPr>
+              <w:t>0.6038</w:t>
+            </w:r>
+          </w:p>
+        </w:tc>
+      </w:tr>
+      <w:tr>
+        <w:tc>
+          <w:tcPr>
+            <w:tcW w:type="dxa" w:w="2016"/>
+            <w:vAlign w:val="center"/>
+            <w:shd w:fill="F3F5F7"/>
+          </w:tcPr>
+          <w:p>
+            <w:pPr>
+              <w:spacing w:before="0" w:after="0" w:line="240" w:lineRule="auto"/>
+              <w:jc w:val="left"/>
+            </w:pPr>
+            <w:r/>
+            <w:r>
+              <w:rPr>
+                <w:rFonts w:ascii="Times New Roman" w:hAnsi="Times New Roman" w:eastAsia="Times New Roman"/>
+                <w:b w:val="0"/>
+                <w:i w:val="0"/>
+                <w:color w:val="000000"/>
+                <w:sz w:val="17"/>
+              </w:rPr>
+              <w:t>ME</w:t>
+            </w:r>
+          </w:p>
+        </w:tc>
+        <w:tc>
+          <w:tcPr>
+            <w:tcW w:type="dxa" w:w="2016"/>
+            <w:vAlign w:val="center"/>
+            <w:shd w:fill="F3F5F7"/>
+          </w:tcPr>
+          <w:p>
+            <w:pPr>
+              <w:spacing w:before="0" w:after="0" w:line="240" w:lineRule="auto"/>
+              <w:jc w:val="center"/>
+            </w:pPr>
+            <w:r/>
+            <w:r>
+              <w:rPr>
+                <w:rFonts w:ascii="Times New Roman" w:hAnsi="Times New Roman" w:eastAsia="Times New Roman"/>
+                <w:b w:val="0"/>
+                <w:i w:val="0"/>
+                <w:color w:val="000000"/>
+                <w:sz w:val="17"/>
+              </w:rPr>
+              <w:t>0.6972</w:t>
+            </w:r>
+          </w:p>
+        </w:tc>
+        <w:tc>
+          <w:tcPr>
+            <w:tcW w:type="dxa" w:w="2016"/>
+            <w:vAlign w:val="center"/>
+            <w:shd w:fill="F3F5F7"/>
+          </w:tcPr>
+          <w:p>
+            <w:pPr>
+              <w:spacing w:before="0" w:after="0" w:line="240" w:lineRule="auto"/>
+              <w:jc w:val="center"/>
+            </w:pPr>
+            <w:r/>
+            <w:r>
+              <w:rPr>
+                <w:rFonts w:ascii="Times New Roman" w:hAnsi="Times New Roman" w:eastAsia="Times New Roman"/>
+                <w:b w:val="0"/>
+                <w:i w:val="0"/>
+                <w:color w:val="000000"/>
+                <w:sz w:val="17"/>
+              </w:rPr>
+              <w:t>0.9734</w:t>
+            </w:r>
+          </w:p>
+        </w:tc>
+        <w:tc>
+          <w:tcPr>
+            <w:tcW w:type="dxa" w:w="2016"/>
+            <w:vAlign w:val="center"/>
+            <w:shd w:fill="F3F5F7"/>
+          </w:tcPr>
+          <w:p>
+            <w:pPr>
+              <w:spacing w:before="0" w:after="0" w:line="240" w:lineRule="auto"/>
+              <w:jc w:val="center"/>
+            </w:pPr>
+            <w:r/>
+            <w:r>
+              <w:rPr>
+                <w:rFonts w:ascii="Times New Roman" w:hAnsi="Times New Roman" w:eastAsia="Times New Roman"/>
+                <w:b w:val="0"/>
+                <w:i w:val="0"/>
+                <w:color w:val="000000"/>
+                <w:sz w:val="17"/>
+              </w:rPr>
+              <w:t>0.7988</w:t>
+            </w:r>
+          </w:p>
+        </w:tc>
+        <w:tc>
+          <w:tcPr>
+            <w:tcW w:type="dxa" w:w="2016"/>
+            <w:vAlign w:val="center"/>
+            <w:shd w:fill="F3F5F7"/>
+          </w:tcPr>
+          <w:p>
+            <w:pPr>
+              <w:spacing w:before="0" w:after="0" w:line="240" w:lineRule="auto"/>
+              <w:jc w:val="center"/>
+            </w:pPr>
+            <w:r/>
+            <w:r>
+              <w:rPr>
+                <w:rFonts w:ascii="Times New Roman" w:hAnsi="Times New Roman" w:eastAsia="Times New Roman"/>
+                <w:b w:val="0"/>
+                <w:i w:val="0"/>
+                <w:color w:val="000000"/>
+                <w:sz w:val="17"/>
+              </w:rPr>
+              <w:t>0.6032</w:t>
+            </w:r>
+          </w:p>
+        </w:tc>
+      </w:tr>
+    </w:tbl>
+    <w:p>
+      <w:pPr>
+        <w:spacing w:after="20"/>
+      </w:pPr>
+    </w:p>
     <w:p>
       <w:pPr>
         <w:spacing w:before="0" w:after="80" w:line="240" w:lineRule="auto"/>
@@ -8538,7 +8919,7 @@
           <w:color w:val="000000"/>
           <w:sz w:val="20"/>
         </w:rPr>
-        <w:t>Execution status:</w:t>
+        <w:t>Source-only result:</w:t>
       </w:r>
       <w:r>
         <w:rPr>
@@ -8548,7 +8929,7 @@
           <w:color w:val="000000"/>
           <w:sz w:val="20"/>
         </w:rPr>
-        <w:t xml:space="preserve"> source-only seed-0 training job 4402198 is recorded as running on one nonexclusive A40; assessment job 4402199 is dependency-locked after successful training. Measured training estimate: 8.25 hours. No source-only performance result existed when this record was generated.</w:t>
+        <w:t xml:space="preserve"> seed-0 BRSET fitting and selection completed, followed by the locked mBRSET assessment. Independent job 4404962 reproduced the metrics, cohort order, labels and hash chain. The result exposes a source-to-target positive-case detection gap, but one seed does not measure training variability and the historical assessment split is not pristine external validation.</w:t>
       </w:r>
     </w:p>
     <w:p>
@@ -9629,6 +10010,77 @@
                 <w:sz w:val="17"/>
               </w:rPr>
               <w:t>design_preflight.json; source_integrity_summary.json; source_smoke_checks.json</w:t>
+            </w:r>
+          </w:p>
+        </w:tc>
+      </w:tr>
+      <w:tr>
+        <w:tc>
+          <w:tcPr>
+            <w:tcW w:type="dxa" w:w="3360"/>
+            <w:vAlign w:val="center"/>
+          </w:tcPr>
+          <w:p>
+            <w:pPr>
+              <w:spacing w:before="0" w:after="0" w:line="240" w:lineRule="auto"/>
+              <w:jc w:val="left"/>
+            </w:pPr>
+            <w:r/>
+            <w:r>
+              <w:rPr>
+                <w:rFonts w:ascii="Times New Roman" w:hAnsi="Times New Roman" w:eastAsia="Times New Roman"/>
+                <w:b w:val="0"/>
+                <w:i w:val="0"/>
+                <w:color w:val="000000"/>
+                <w:sz w:val="17"/>
+              </w:rPr>
+              <w:t>15 Sep 2026</w:t>
+            </w:r>
+          </w:p>
+        </w:tc>
+        <w:tc>
+          <w:tcPr>
+            <w:tcW w:type="dxa" w:w="3360"/>
+            <w:vAlign w:val="center"/>
+          </w:tcPr>
+          <w:p>
+            <w:pPr>
+              <w:spacing w:before="0" w:after="0" w:line="240" w:lineRule="auto"/>
+              <w:jc w:val="center"/>
+            </w:pPr>
+            <w:r/>
+            <w:r>
+              <w:rPr>
+                <w:rFonts w:ascii="Times New Roman" w:hAnsi="Times New Roman" w:eastAsia="Times New Roman"/>
+                <w:b w:val="0"/>
+                <w:i w:val="0"/>
+                <w:color w:val="000000"/>
+                <w:sz w:val="17"/>
+              </w:rPr>
+              <w:t>Strict source-only seed 0 completed and independently verified</w:t>
+            </w:r>
+          </w:p>
+        </w:tc>
+        <w:tc>
+          <w:tcPr>
+            <w:tcW w:type="dxa" w:w="3360"/>
+            <w:vAlign w:val="center"/>
+          </w:tcPr>
+          <w:p>
+            <w:pPr>
+              <w:spacing w:before="0" w:after="0" w:line="240" w:lineRule="auto"/>
+              <w:jc w:val="center"/>
+            </w:pPr>
+            <w:r/>
+            <w:r>
+              <w:rPr>
+                <w:rFonts w:ascii="Times New Roman" w:hAnsi="Times New Roman" w:eastAsia="Times New Roman"/>
+                <w:b w:val="0"/>
+                <w:i w:val="0"/>
+                <w:color w:val="000000"/>
+                <w:sz w:val="17"/>
+              </w:rPr>
+              <w:t>source_only_seed0_verification.json</w:t>
             </w:r>
           </w:p>
         </w:tc>

</xml_diff>